<commit_message>
Verzija v0.2 klasa sistema
</commit_message>
<xml_diff>
--- a/docs/04 - Analiza i dizajn sistema.docx
+++ b/docs/04 - Analiza i dizajn sistema.docx
@@ -2,7 +2,7 @@
 <file path=word/document.xml><?xml version="1.0" encoding="utf-8"?>
 <w:document xmlns:o="urn:schemas-microsoft-com:office:office" xmlns:r="http://schemas.openxmlformats.org/officeDocument/2006/relationships" xmlns:v="urn:schemas-microsoft-com:vml" xmlns:w="http://schemas.openxmlformats.org/wordprocessingml/2006/main" xmlns:w10="urn:schemas-microsoft-com:office:word" xmlns:wp="http://schemas.openxmlformats.org/drawingml/2006/wordprocessingDrawing" xmlns:pic="http://schemas.openxmlformats.org/drawingml/2006/picture" xmlns:wps="http://schemas.microsoft.com/office/word/2010/wordprocessingShape" xmlns:wpg="http://schemas.microsoft.com/office/word/2010/wordprocessingGroup" xmlns:mc="http://schemas.openxmlformats.org/markup-compatibility/2006" xmlns:wp14="http://schemas.microsoft.com/office/word/2010/wordprocessingDrawing" xmlns:w14="http://schemas.microsoft.com/office/word/2010/wordml" xmlns:w15="http://schemas.microsoft.com/office/word/2012/wordml" mc:Ignorable="w14 wp14 w15">
   <w:body>
-    <w:p>
+    <w:p xmlns:wp14="http://schemas.microsoft.com/office/word/2010/wordml" wp14:textId="77777777">
       <w:pPr>
         <w:pStyle w:val="Heading1"/>
         <w:rPr/>
@@ -12,7 +12,7 @@
         <w:t>Analiza i dizajn sistema</w:t>
       </w:r>
     </w:p>
-    <w:p>
+    <w:p xmlns:wp14="http://schemas.microsoft.com/office/word/2010/wordml" wp14:textId="77777777">
       <w:pPr>
         <w:pStyle w:val="Normal"/>
         <w:rPr/>
@@ -21,7 +21,7 @@
         <w:rPr/>
       </w:r>
     </w:p>
-    <w:p>
+    <w:p xmlns:wp14="http://schemas.microsoft.com/office/word/2010/wordml" wp14:textId="77777777">
       <w:pPr>
         <w:pStyle w:val="Normal"/>
         <w:rPr>
@@ -35,7 +35,7 @@
         <w:t>U nastavku je potrebno definisati sve potencijalne klase koje će se koristiti u sistemu. Za određivanje klasa koje će biti neophodne za rad sistema potrebno je koristiti specifikaciju sistema i prethodno kreirane dijagrame.</w:t>
       </w:r>
     </w:p>
-    <w:p>
+    <w:p xmlns:wp14="http://schemas.microsoft.com/office/word/2010/wordml" wp14:textId="77777777">
       <w:pPr>
         <w:pStyle w:val="Normal"/>
         <w:rPr>
@@ -48,7 +48,7 @@
         </w:rPr>
       </w:r>
     </w:p>
-    <w:p>
+    <w:p xmlns:wp14="http://schemas.microsoft.com/office/word/2010/wordml" wp14:textId="77777777">
       <w:pPr>
         <w:pStyle w:val="Normal"/>
         <w:rPr/>
@@ -60,7 +60,7 @@
         <w:t>Template za jednu klasu potrebno je iskopirati onoliko puta koliko je neophodno da bi se definisale sve klase u sistemu.</w:t>
       </w:r>
     </w:p>
-    <w:p>
+    <w:p xmlns:wp14="http://schemas.microsoft.com/office/word/2010/wordml" wp14:textId="77777777">
       <w:pPr>
         <w:pStyle w:val="Normal"/>
         <w:rPr/>
@@ -69,7 +69,7 @@
         <w:rPr/>
       </w:r>
     </w:p>
-    <w:p>
+    <w:p xmlns:wp14="http://schemas.microsoft.com/office/word/2010/wordml" wp14:textId="77777777">
       <w:pPr>
         <w:pStyle w:val="Normal"/>
         <w:rPr>
@@ -85,7 +85,7 @@
         <w:t>Definicija klasa u sistemu</w:t>
       </w:r>
     </w:p>
-    <w:p>
+    <w:p xmlns:wp14="http://schemas.microsoft.com/office/word/2010/wordml" wp14:textId="77777777">
       <w:pPr>
         <w:pStyle w:val="Normal"/>
         <w:rPr/>
@@ -94,19 +94,49 @@
         <w:rPr/>
       </w:r>
     </w:p>
-    <w:p>
+    <w:p xmlns:wp14="http://schemas.microsoft.com/office/word/2010/wordml" wp14:textId="5A0BD201">
       <w:pPr>
         <w:pStyle w:val="Normal"/>
-        <w:rPr/>
+        <w:rPr>
+          <w:lang w:val="en-US"/>
+        </w:rPr>
       </w:pPr>
       <w:r>
         <w:rPr>
-          <w:b/>
-        </w:rPr>
-        <w:t>Naziv klase:</w:t>
-      </w:r>
-      <w:r>
-        <w:rPr/>
+          <w:b w:val="1"/>
+          <w:bCs w:val="1"/>
+          <w:lang w:val="en-US"/>
+        </w:rPr>
+        <w:t>Naziv</w:t>
+      </w:r>
+      <w:r>
+        <w:rPr>
+          <w:b w:val="1"/>
+          <w:bCs w:val="1"/>
+          <w:lang w:val="en-US"/>
+        </w:rPr>
+        <w:t xml:space="preserve"> </w:t>
+      </w:r>
+      <w:r>
+        <w:rPr>
+          <w:b w:val="1"/>
+          <w:bCs w:val="1"/>
+          <w:lang w:val="en-US"/>
+        </w:rPr>
+        <w:t>klase</w:t>
+      </w:r>
+      <w:r>
+        <w:rPr>
+          <w:b w:val="1"/>
+          <w:bCs w:val="1"/>
+          <w:lang w:val="en-US"/>
+        </w:rPr>
+        <w:t>:</w:t>
+      </w:r>
+      <w:r>
+        <w:rPr>
+          <w:lang w:val="en-US"/>
+        </w:rPr>
         <w:t xml:space="preserve"> </w:t>
       </w:r>
       <w:sdt>
@@ -115,7 +145,6 @@
           <w:placeholder>
             <w:docPart w:val="DefaultPlaceholder_-1854013440"/>
           </w:placeholder>
-          <w:showingPlcHdr/>
         </w:sdtPr>
         <w:sdtContent>
           <w:r>
@@ -123,14 +152,26 @@
           </w:r>
           <w:r>
             <w:rPr>
-              <w:rStyle w:val="PlaceholderText"/>
+              <w:lang w:val="en-US"/>
             </w:rPr>
-            <w:t>Click or tap here to enter text.</w:t>
+            <w:t>Izvršilac</w:t>
+          </w:r>
+          <w:r>
+            <w:rPr>
+              <w:lang w:val="en-US"/>
+            </w:rPr>
+            <w:t xml:space="preserve"> </w:t>
+          </w:r>
+          <w:r>
+            <w:rPr>
+              <w:lang w:val="en-US"/>
+            </w:rPr>
+            <w:t>usluge</w:t>
           </w:r>
         </w:sdtContent>
       </w:sdt>
     </w:p>
-    <w:p>
+    <w:p xmlns:wp14="http://schemas.microsoft.com/office/word/2010/wordml" wp14:textId="77777777">
       <w:pPr>
         <w:pStyle w:val="Normal"/>
         <w:rPr/>
@@ -139,7 +180,7 @@
         <w:rPr/>
       </w:r>
     </w:p>
-    <w:p>
+    <w:p xmlns:wp14="http://schemas.microsoft.com/office/word/2010/wordml" wp14:textId="77777777">
       <w:pPr>
         <w:pStyle w:val="Normal"/>
         <w:rPr>
@@ -148,55 +189,18 @@
       </w:pPr>
       <w:r>
         <w:rPr>
-          <w:b/>
+          <w:b w:val="1"/>
+          <w:bCs w:val="1"/>
         </w:rPr>
         <w:t>Funkcionalni zahtjevi u kojima klasa učestvuje:</w:t>
       </w:r>
     </w:p>
-    <w:p>
+    <w:p xmlns:wp14="http://schemas.microsoft.com/office/word/2010/wordml" wp14:textId="5F35EAF8">
       <w:pPr>
         <w:pStyle w:val="Normal"/>
-        <w:rPr/>
-      </w:pPr>
-      <w:r>
-        <w:rPr/>
-      </w:r>
-    </w:p>
-    <w:p>
-      <w:pPr>
-        <w:pStyle w:val="Normal"/>
-        <w:rPr>
-          <w:color w:themeColor="background1" w:themeShade="80" w:val="808080"/>
-        </w:rPr>
-      </w:pPr>
-      <w:sdt>
-        <w:sdtPr>
-          <w:id w:val="-222451280"/>
-          <w:placeholder>
-            <w:docPart w:val="DefaultPlaceholder_-1854013440"/>
-          </w:placeholder>
-          <w:text/>
-        </w:sdtPr>
-        <w:sdtContent>
-          <w:r>
-            <w:rPr>
-              <w:color w:themeColor="background1" w:themeShade="80" w:val="808080"/>
-            </w:rPr>
-          </w:r>
-          <w:r>
-            <w:rPr>
-              <w:color w:themeColor="background1" w:themeShade="80" w:val="808080"/>
-            </w:rPr>
-            <w:t>(FZ br. 00: ime zahtjeva)</w:t>
-          </w:r>
-        </w:sdtContent>
-      </w:sdt>
-    </w:p>
-    <w:p>
-      <w:pPr>
-        <w:pStyle w:val="Normal"/>
-        <w:rPr>
-          <w:color w:themeColor="background1" w:themeShade="80" w:val="808080"/>
+        <w:rPr>
+          <w:rStyle w:val="PlaceholderText"/>
+          <w:lang w:val="en-US"/>
         </w:rPr>
       </w:pPr>
       <w:sdt>
@@ -206,121 +210,241 @@
             <w:docPart w:val="440469B8E10A4A618A0A27CA6EF19BDA"/>
           </w:placeholder>
         </w:sdtPr>
-        <w:sdtContent>
-          <w:r>
-            <w:rPr>
-              <w:color w:themeColor="background1" w:themeShade="80" w:val="808080"/>
-            </w:rPr>
-          </w:r>
-          <w:r>
-            <w:rPr>
-              <w:color w:themeColor="background1" w:themeShade="80" w:val="808080"/>
-            </w:rPr>
-            <w:t>(FZ br. 00:</w:t>
-          </w:r>
-        </w:sdtContent>
+        <w:sdtContent/>
       </w:sdt>
       <w:r>
         <w:rPr>
-          <w:color w:themeColor="background1" w:themeShade="80" w:val="808080"/>
-        </w:rPr>
-        <w:t xml:space="preserve"> ime zahtjeva</w:t>
-      </w:r>
-      <w:r>
-        <w:rPr>
-          <w:color w:themeColor="background1" w:themeShade="80" w:val="808080"/>
-        </w:rPr>
-        <w:t>)</w:t>
+          <w:rFonts w:ascii="Times New Roman" w:hAnsi="Times New Roman" w:eastAsia="Times New Roman" w:cs="Times New Roman"/>
+          <w:noProof w:val="0"/>
+          <w:color w:val="808080" w:themeColor="background1" w:themeTint="FF" w:themeShade="80"/>
+          <w:sz w:val="24"/>
+          <w:szCs w:val="24"/>
+          <w:lang w:val="en-US"/>
+        </w:rPr>
+        <w:t>Klasa</w:t>
+      </w:r>
+      <w:r>
+        <w:rPr>
+          <w:rFonts w:ascii="Times New Roman" w:hAnsi="Times New Roman" w:eastAsia="Times New Roman" w:cs="Times New Roman"/>
+          <w:noProof w:val="0"/>
+          <w:color w:val="808080" w:themeColor="background1" w:themeTint="FF" w:themeShade="80"/>
+          <w:sz w:val="24"/>
+          <w:szCs w:val="24"/>
+          <w:lang w:val="en-US"/>
+        </w:rPr>
+        <w:t xml:space="preserve"> </w:t>
+      </w:r>
+      <w:r>
+        <w:rPr>
+          <w:rFonts w:ascii="Times New Roman" w:hAnsi="Times New Roman" w:eastAsia="Times New Roman" w:cs="Times New Roman"/>
+          <w:noProof w:val="0"/>
+          <w:color w:val="808080" w:themeColor="background1" w:themeTint="FF" w:themeShade="80"/>
+          <w:sz w:val="24"/>
+          <w:szCs w:val="24"/>
+          <w:lang w:val="en-US"/>
+        </w:rPr>
+        <w:t>predstavlja</w:t>
+      </w:r>
+      <w:r>
+        <w:rPr>
+          <w:rFonts w:ascii="Times New Roman" w:hAnsi="Times New Roman" w:eastAsia="Times New Roman" w:cs="Times New Roman"/>
+          <w:noProof w:val="0"/>
+          <w:color w:val="808080" w:themeColor="background1" w:themeTint="FF" w:themeShade="80"/>
+          <w:sz w:val="24"/>
+          <w:szCs w:val="24"/>
+          <w:lang w:val="en-US"/>
+        </w:rPr>
+        <w:t xml:space="preserve"> </w:t>
+      </w:r>
+      <w:r>
+        <w:rPr>
+          <w:rFonts w:ascii="Times New Roman" w:hAnsi="Times New Roman" w:eastAsia="Times New Roman" w:cs="Times New Roman"/>
+          <w:noProof w:val="0"/>
+          <w:color w:val="808080" w:themeColor="background1" w:themeTint="FF" w:themeShade="80"/>
+          <w:sz w:val="24"/>
+          <w:szCs w:val="24"/>
+          <w:lang w:val="en-US"/>
+        </w:rPr>
+        <w:t>osnovnu</w:t>
+      </w:r>
+      <w:r>
+        <w:rPr>
+          <w:rFonts w:ascii="Times New Roman" w:hAnsi="Times New Roman" w:eastAsia="Times New Roman" w:cs="Times New Roman"/>
+          <w:noProof w:val="0"/>
+          <w:color w:val="808080" w:themeColor="background1" w:themeTint="FF" w:themeShade="80"/>
+          <w:sz w:val="24"/>
+          <w:szCs w:val="24"/>
+          <w:lang w:val="en-US"/>
+        </w:rPr>
+        <w:t xml:space="preserve"> </w:t>
+      </w:r>
+      <w:r>
+        <w:rPr>
+          <w:rFonts w:ascii="Times New Roman" w:hAnsi="Times New Roman" w:eastAsia="Times New Roman" w:cs="Times New Roman"/>
+          <w:noProof w:val="0"/>
+          <w:color w:val="808080" w:themeColor="background1" w:themeTint="FF" w:themeShade="80"/>
+          <w:sz w:val="24"/>
+          <w:szCs w:val="24"/>
+          <w:lang w:val="en-US"/>
+        </w:rPr>
+        <w:t>apstraktnu</w:t>
+      </w:r>
+      <w:r>
+        <w:rPr>
+          <w:rFonts w:ascii="Times New Roman" w:hAnsi="Times New Roman" w:eastAsia="Times New Roman" w:cs="Times New Roman"/>
+          <w:noProof w:val="0"/>
+          <w:color w:val="808080" w:themeColor="background1" w:themeTint="FF" w:themeShade="80"/>
+          <w:sz w:val="24"/>
+          <w:szCs w:val="24"/>
+          <w:lang w:val="en-US"/>
+        </w:rPr>
+        <w:t xml:space="preserve"> </w:t>
+      </w:r>
+      <w:r>
+        <w:rPr>
+          <w:rFonts w:ascii="Times New Roman" w:hAnsi="Times New Roman" w:eastAsia="Times New Roman" w:cs="Times New Roman"/>
+          <w:noProof w:val="0"/>
+          <w:color w:val="808080" w:themeColor="background1" w:themeTint="FF" w:themeShade="80"/>
+          <w:sz w:val="24"/>
+          <w:szCs w:val="24"/>
+          <w:lang w:val="en-US"/>
+        </w:rPr>
+        <w:t>strukturu</w:t>
+      </w:r>
+      <w:r>
+        <w:rPr>
+          <w:rFonts w:ascii="Times New Roman" w:hAnsi="Times New Roman" w:eastAsia="Times New Roman" w:cs="Times New Roman"/>
+          <w:noProof w:val="0"/>
+          <w:color w:val="808080" w:themeColor="background1" w:themeTint="FF" w:themeShade="80"/>
+          <w:sz w:val="24"/>
+          <w:szCs w:val="24"/>
+          <w:lang w:val="en-US"/>
+        </w:rPr>
+        <w:t xml:space="preserve"> </w:t>
+      </w:r>
+      <w:r>
+        <w:rPr>
+          <w:rFonts w:ascii="Times New Roman" w:hAnsi="Times New Roman" w:eastAsia="Times New Roman" w:cs="Times New Roman"/>
+          <w:noProof w:val="0"/>
+          <w:color w:val="808080" w:themeColor="background1" w:themeTint="FF" w:themeShade="80"/>
+          <w:sz w:val="24"/>
+          <w:szCs w:val="24"/>
+          <w:lang w:val="en-US"/>
+        </w:rPr>
+        <w:t>iz</w:t>
+      </w:r>
+      <w:r>
+        <w:rPr>
+          <w:rFonts w:ascii="Times New Roman" w:hAnsi="Times New Roman" w:eastAsia="Times New Roman" w:cs="Times New Roman"/>
+          <w:noProof w:val="0"/>
+          <w:color w:val="808080" w:themeColor="background1" w:themeTint="FF" w:themeShade="80"/>
+          <w:sz w:val="24"/>
+          <w:szCs w:val="24"/>
+          <w:lang w:val="en-US"/>
+        </w:rPr>
+        <w:t xml:space="preserve"> </w:t>
+      </w:r>
+      <w:r>
+        <w:rPr>
+          <w:rFonts w:ascii="Times New Roman" w:hAnsi="Times New Roman" w:eastAsia="Times New Roman" w:cs="Times New Roman"/>
+          <w:noProof w:val="0"/>
+          <w:color w:val="808080" w:themeColor="background1" w:themeTint="FF" w:themeShade="80"/>
+          <w:sz w:val="24"/>
+          <w:szCs w:val="24"/>
+          <w:lang w:val="en-US"/>
+        </w:rPr>
+        <w:t>koje</w:t>
+      </w:r>
+      <w:r>
+        <w:rPr>
+          <w:rFonts w:ascii="Times New Roman" w:hAnsi="Times New Roman" w:eastAsia="Times New Roman" w:cs="Times New Roman"/>
+          <w:noProof w:val="0"/>
+          <w:color w:val="808080" w:themeColor="background1" w:themeTint="FF" w:themeShade="80"/>
+          <w:sz w:val="24"/>
+          <w:szCs w:val="24"/>
+          <w:lang w:val="en-US"/>
+        </w:rPr>
+        <w:t xml:space="preserve"> se </w:t>
+      </w:r>
+      <w:r>
+        <w:rPr>
+          <w:rFonts w:ascii="Times New Roman" w:hAnsi="Times New Roman" w:eastAsia="Times New Roman" w:cs="Times New Roman"/>
+          <w:noProof w:val="0"/>
+          <w:color w:val="808080" w:themeColor="background1" w:themeTint="FF" w:themeShade="80"/>
+          <w:sz w:val="24"/>
+          <w:szCs w:val="24"/>
+          <w:lang w:val="en-US"/>
+        </w:rPr>
+        <w:t>naslje</w:t>
+      </w:r>
+      <w:r>
+        <w:rPr>
+          <w:rFonts w:ascii="Times New Roman" w:hAnsi="Times New Roman" w:eastAsia="Times New Roman" w:cs="Times New Roman"/>
+          <w:noProof w:val="0"/>
+          <w:color w:val="808080" w:themeColor="background1" w:themeTint="FF" w:themeShade="80"/>
+          <w:sz w:val="24"/>
+          <w:szCs w:val="24"/>
+          <w:lang w:val="hr-HR"/>
+        </w:rPr>
+        <w:t>đuju</w:t>
+      </w:r>
+      <w:r>
+        <w:rPr>
+          <w:rFonts w:ascii="Times New Roman" w:hAnsi="Times New Roman" w:eastAsia="Times New Roman" w:cs="Times New Roman"/>
+          <w:noProof w:val="0"/>
+          <w:color w:val="808080" w:themeColor="background1" w:themeTint="FF" w:themeShade="80"/>
+          <w:sz w:val="24"/>
+          <w:szCs w:val="24"/>
+          <w:lang w:val="hr-HR"/>
+        </w:rPr>
+        <w:t xml:space="preserve"> korisnici koji predstavljaju izvršioce usluga. </w:t>
+      </w:r>
+      <w:r>
+        <w:rPr>
+          <w:rFonts w:ascii="Times New Roman" w:hAnsi="Times New Roman" w:eastAsia="Times New Roman" w:cs="Times New Roman"/>
+          <w:noProof w:val="0"/>
+          <w:color w:val="808080" w:themeColor="background1" w:themeTint="FF" w:themeShade="80"/>
+          <w:sz w:val="24"/>
+          <w:szCs w:val="24"/>
+          <w:lang w:val="hr-HR"/>
+        </w:rPr>
+        <w:t xml:space="preserve">Ne posjeduje direktno funkcionalne zahtjeve. </w:t>
+      </w:r>
+      <w:r>
+        <w:rPr>
+          <w:color w:val="808080" w:themeColor="background1" w:themeShade="80"/>
+        </w:rPr>
+      </w:r>
+      <w:r>
+        <w:rPr>
+          <w:color w:val="808080" w:themeColor="background1" w:themeShade="80"/>
+        </w:rPr>
       </w:r>
     </w:p>
-    <w:p>
-      <w:pPr>
-        <w:pStyle w:val="Normal"/>
-        <w:rPr>
-          <w:color w:themeColor="background1" w:themeShade="80" w:val="808080"/>
-        </w:rPr>
-      </w:pPr>
-      <w:sdt>
-        <w:sdtPr>
-          <w:id w:val="2020580349"/>
-          <w:placeholder>
-            <w:docPart w:val="A96875FC97F74B8FAD11C312455D2F67"/>
-          </w:placeholder>
-          <w:text/>
-        </w:sdtPr>
-        <w:sdtContent>
-          <w:r>
-            <w:rPr>
-              <w:color w:themeColor="background1" w:themeShade="80" w:val="808080"/>
-            </w:rPr>
-          </w:r>
-          <w:r>
-            <w:rPr>
-              <w:color w:themeColor="background1" w:themeShade="80" w:val="808080"/>
-            </w:rPr>
-            <w:t>(</w:t>
-          </w:r>
-          <w:r>
-            <w:rPr>
-              <w:color w:themeColor="background1" w:themeShade="80" w:val="808080"/>
-            </w:rPr>
-            <w:t>FZ br. 00: ime zahtjeva)</w:t>
-          </w:r>
-        </w:sdtContent>
-      </w:sdt>
-    </w:p>
-    <w:p>
+    <w:p xmlns:wp14="http://schemas.microsoft.com/office/word/2010/wordml" wp14:textId="77777777">
       <w:pPr>
         <w:pStyle w:val="Normal"/>
         <w:rPr/>
       </w:pPr>
-      <w:sdt>
-        <w:sdtPr>
-          <w:id w:val="-1327516218"/>
-          <w:placeholder>
-            <w:docPart w:val="17BB0B458448487BAF86FF4D71D77155"/>
-          </w:placeholder>
-          <w:text/>
-        </w:sdtPr>
-        <w:sdtContent>
-          <w:r>
-            <w:rPr>
-              <w:color w:themeColor="background1" w:themeShade="80" w:val="808080"/>
-            </w:rPr>
-          </w:r>
-          <w:r>
-            <w:rPr>
-              <w:color w:themeColor="background1" w:themeShade="80" w:val="808080"/>
-            </w:rPr>
-            <w:t>(FZ br. 00: ime zahtjeva)</w:t>
-          </w:r>
-        </w:sdtContent>
-      </w:sdt>
+      <w:r>
+        <w:rPr/>
+      </w:r>
     </w:p>
-    <w:p>
+    <w:p xmlns:wp14="http://schemas.microsoft.com/office/word/2010/wordml" wp14:textId="77777777">
       <w:pPr>
         <w:pStyle w:val="Normal"/>
-        <w:rPr/>
+        <w:rPr>
+          <w:b/>
+        </w:rPr>
       </w:pPr>
       <w:r>
-        <w:rPr/>
+        <w:rPr>
+          <w:b/>
+        </w:rPr>
+        <w:t>Atributi koje klasa posjeduje:</w:t>
       </w:r>
     </w:p>
-    <w:p>
-      <w:pPr>
-        <w:pStyle w:val="Normal"/>
-        <w:rPr>
-          <w:b/>
-        </w:rPr>
-      </w:pPr>
-      <w:r>
-        <w:rPr>
-          <w:b/>
-        </w:rPr>
-        <w:t>Atributi koje klasa posjeduje:</w:t>
-      </w:r>
-    </w:p>
-    <w:p>
+    <w:p xmlns:wp14="http://schemas.microsoft.com/office/word/2010/wordml" wp14:textId="77777777">
       <w:pPr>
         <w:pStyle w:val="Normal"/>
         <w:rPr/>
@@ -342,14 +466,14 @@
           <w:bottom w:w="0" w:type="dxa"/>
           <w:end w:w="108" w:type="dxa"/>
         </w:tblCellMar>
-        <w:tblLook w:firstRow="1" w:noVBand="1" w:lastRow="0" w:firstColumn="1" w:lastColumn="0" w:noHBand="0" w:val="04a0"/>
+        <w:tblLook w:val="04A0" w:firstRow="1" w:lastRow="0" w:firstColumn="1" w:lastColumn="0" w:noHBand="0" w:noVBand="1"/>
       </w:tblPr>
       <w:tblGrid>
         <w:gridCol w:w="2784"/>
         <w:gridCol w:w="2881"/>
         <w:gridCol w:w="3690"/>
       </w:tblGrid>
-      <w:tr>
+      <w:tr xmlns:wp14="http://schemas.microsoft.com/office/word/2010/wordml" wp14:textId="77777777">
         <w:trPr>
           <w:trHeight w:val="485" w:hRule="atLeast"/>
         </w:trPr>
@@ -357,10 +481,11 @@
           <w:tcPr>
             <w:tcW w:w="2784" w:type="dxa"/>
             <w:tcBorders/>
-            <w:shd w:color="auto" w:fill="B4C6E7" w:themeFill="accent1" w:themeFillTint="66" w:val="clear"/>
+            <w:shd w:val="clear" w:color="auto" w:fill="B4C6E7" w:themeFill="accent1" w:themeFillTint="66"/>
+            <w:tcMar/>
             <w:vAlign w:val="center"/>
           </w:tcPr>
-          <w:p>
+          <w:p wp14:textId="77777777">
             <w:pPr>
               <w:pStyle w:val="Normal"/>
               <w:widowControl/>
@@ -386,10 +511,11 @@
           <w:tcPr>
             <w:tcW w:w="2881" w:type="dxa"/>
             <w:tcBorders/>
-            <w:shd w:color="auto" w:fill="B4C6E7" w:themeFill="accent1" w:themeFillTint="66" w:val="clear"/>
+            <w:shd w:val="clear" w:color="auto" w:fill="B4C6E7" w:themeFill="accent1" w:themeFillTint="66"/>
+            <w:tcMar/>
             <w:vAlign w:val="center"/>
           </w:tcPr>
-          <w:p>
+          <w:p wp14:textId="77777777">
             <w:pPr>
               <w:pStyle w:val="Normal"/>
               <w:widowControl/>
@@ -415,10 +541,11 @@
           <w:tcPr>
             <w:tcW w:w="3690" w:type="dxa"/>
             <w:tcBorders/>
-            <w:shd w:color="auto" w:fill="B4C6E7" w:themeFill="accent1" w:themeFillTint="66" w:val="clear"/>
+            <w:shd w:val="clear" w:color="auto" w:fill="B4C6E7" w:themeFill="accent1" w:themeFillTint="66"/>
+            <w:tcMar/>
             <w:vAlign w:val="center"/>
           </w:tcPr>
-          <w:p>
+          <w:p wp14:textId="77777777">
             <w:pPr>
               <w:pStyle w:val="Normal"/>
               <w:widowControl/>
@@ -441,7 +568,7 @@
           </w:p>
         </w:tc>
       </w:tr>
-      <w:tr>
+      <w:tr xmlns:wp14="http://schemas.microsoft.com/office/word/2010/wordml" wp14:textId="77777777">
         <w:trPr>
           <w:trHeight w:val="656" w:hRule="atLeast"/>
         </w:trPr>
@@ -449,16 +576,17 @@
           <w:tcPr>
             <w:tcW w:w="2784" w:type="dxa"/>
             <w:tcBorders/>
+            <w:tcMar/>
             <w:vAlign w:val="center"/>
           </w:tcPr>
-          <w:p>
+          <w:p wp14:textId="77777777">
             <w:pPr>
               <w:pStyle w:val="Normal"/>
-              <w:widowControl/>
+              <w:widowControl w:val="1"/>
               <w:spacing w:before="0" w:after="0"/>
-              <w:jc w:val="start"/>
-              <w:rPr>
-                <w:color w:themeColor="background1" w:themeShade="80" w:val="808080"/>
+              <w:rPr>
+                <w:color w:val="808080" w:themeColor="background1" w:themeShade="80"/>
+                <w:lang w:val="en-US"/>
               </w:rPr>
             </w:pPr>
             <w:sdt>
@@ -467,7 +595,53 @@
                 <w:placeholder>
                   <w:docPart w:val="DefaultPlaceholder_-1854013440"/>
                 </w:placeholder>
-                <w:showingPlcHdr/>
+                <w:text/>
+              </w:sdtPr>
+              <w:sdtContent>
+                <w:r>
+                  <w:rPr>
+                    <w:rStyle w:val="PlaceholderText"/>
+                    <w:rFonts w:eastAsia="Calibri" w:cs=""/>
+                    <w:kern w:val="0"/>
+                    <w:szCs w:val="22"/>
+                    <w:lang w:eastAsia="en-US" w:bidi="ar-SA"/>
+                  </w:rPr>
+                </w:r>
+                <w:r>
+                  <w:rPr>
+                    <w:kern w:val="0"/>
+                    <w:lang w:val="en-US"/>
+                  </w:rPr>
+                  <w:t>Naziv</w:t>
+                </w:r>
+              </w:sdtContent>
+            </w:sdt>
+          </w:p>
+        </w:tc>
+        <w:tc>
+          <w:tcPr>
+            <w:tcW w:w="2881" w:type="dxa"/>
+            <w:tcBorders/>
+            <w:tcMar/>
+            <w:vAlign w:val="center"/>
+          </w:tcPr>
+          <w:p wp14:textId="77777777">
+            <w:pPr>
+              <w:pStyle w:val="Normal"/>
+              <w:widowControl w:val="1"/>
+              <w:spacing w:before="0" w:after="0"/>
+              <w:rPr>
+                <w:rFonts w:eastAsia="Calibri" w:cs=""/>
+                <w:kern w:val="0"/>
+                <w:lang w:eastAsia="en-US" w:bidi="ar-SA"/>
+              </w:rPr>
+            </w:pPr>
+            <w:sdt>
+              <w:sdtPr>
+                <w:id w:val="149486623"/>
+                <w:placeholder>
+                  <w:docPart w:val="DefaultPlaceholder_-1854013440"/>
+                </w:placeholder>
                 <w:text/>
               </w:sdtPr>
               <w:sdtContent>
@@ -488,7 +662,196 @@
                     <w:szCs w:val="22"/>
                     <w:lang w:eastAsia="en-US" w:bidi="ar-SA"/>
                   </w:rPr>
-                  <w:t>Click or tap here to enter text.</w:t>
+                  <w:t>string</w:t>
+                </w:r>
+              </w:sdtContent>
+            </w:sdt>
+          </w:p>
+        </w:tc>
+        <w:tc>
+          <w:tcPr>
+            <w:tcW w:w="3690" w:type="dxa"/>
+            <w:tcBorders/>
+            <w:tcMar/>
+            <w:vAlign w:val="center"/>
+          </w:tcPr>
+          <w:p wp14:textId="77777777">
+            <w:pPr>
+              <w:pStyle w:val="Normal"/>
+              <w:widowControl/>
+              <w:spacing w:before="0" w:after="0"/>
+              <w:jc w:val="start"/>
+              <w:rPr>
+                <w:rFonts w:eastAsia="Calibri" w:cs=""/>
+                <w:kern w:val="0"/>
+                <w:szCs w:val="22"/>
+                <w:lang w:eastAsia="en-US" w:bidi="ar-SA"/>
+              </w:rPr>
+            </w:pPr>
+            <w:sdt>
+              <w:sdtPr>
+                <w:id w:val="-1200541862"/>
+                <w14:checkbox>
+                  <w14:checked w14:val="0"/>
+                  <w14:checkedState w14:val="2612"/>
+                  <w14:uncheckedState w14:val="2610"/>
+                </w14:checkbox>
+              </w:sdtPr>
+              <w:sdtContent>
+                <w:r>
+                  <w:rPr>
+                    <w:rFonts w:hint="eastAsia" w:ascii="MS Gothic" w:hAnsi="MS Gothic" w:eastAsia="MS Gothic" w:cs=""/>
+                    <w:kern w:val="0"/>
+                    <w:szCs w:val="22"/>
+                    <w:lang w:eastAsia="en-US" w:bidi="ar-SA"/>
+                  </w:rPr>
+                </w:r>
+                <w:r>
+                  <w:rPr>
+                    <w:rFonts w:hint="eastAsia" w:ascii="MS Gothic" w:hAnsi="MS Gothic" w:eastAsia="MS Gothic" w:cs=""/>
+                    <w:kern w:val="0"/>
+                    <w:szCs w:val="22"/>
+                    <w:lang w:eastAsia="en-US" w:bidi="ar-SA"/>
+                  </w:rPr>
+                  <w:t>☐</w:t>
+                </w:r>
+              </w:sdtContent>
+            </w:sdt>
+            <w:r>
+              <w:rPr>
+                <w:rFonts w:eastAsia="Calibri" w:cs=""/>
+                <w:kern w:val="0"/>
+                <w:szCs w:val="22"/>
+                <w:lang w:eastAsia="en-US" w:bidi="ar-SA"/>
+              </w:rPr>
+              <w:t xml:space="preserve"> </w:t>
+            </w:r>
+            <w:r>
+              <w:rPr>
+                <w:rFonts w:eastAsia="Calibri" w:cs=""/>
+                <w:kern w:val="0"/>
+                <w:szCs w:val="22"/>
+                <w:lang w:eastAsia="en-US" w:bidi="ar-SA"/>
+              </w:rPr>
+              <w:t>Atribut je statički</w:t>
+            </w:r>
+          </w:p>
+          <w:p wp14:textId="77777777">
+            <w:pPr>
+              <w:pStyle w:val="Normal"/>
+              <w:widowControl/>
+              <w:spacing w:before="0" w:after="0"/>
+              <w:jc w:val="start"/>
+              <w:rPr>
+                <w:rFonts w:eastAsia="Calibri" w:cs=""/>
+                <w:kern w:val="0"/>
+                <w:szCs w:val="22"/>
+                <w:lang w:eastAsia="en-US" w:bidi="ar-SA"/>
+              </w:rPr>
+            </w:pPr>
+            <w:sdt>
+              <w:sdtPr>
+                <w:id w:val="-1516680328"/>
+                <w14:checkbox>
+                  <w14:checked w14:val="0"/>
+                  <w14:checkedState w14:val="2612"/>
+                  <w14:uncheckedState w14:val="2610"/>
+                </w14:checkbox>
+              </w:sdtPr>
+              <w:sdtContent>
+                <w:r>
+                  <w:rPr>
+                    <w:rFonts w:hint="eastAsia" w:ascii="MS Gothic" w:hAnsi="MS Gothic" w:eastAsia="MS Gothic" w:cs=""/>
+                    <w:kern w:val="0"/>
+                    <w:szCs w:val="22"/>
+                    <w:lang w:eastAsia="en-US" w:bidi="ar-SA"/>
+                  </w:rPr>
+                </w:r>
+                <w:r>
+                  <w:rPr>
+                    <w:rFonts w:hint="eastAsia" w:ascii="MS Gothic" w:hAnsi="MS Gothic" w:eastAsia="MS Gothic" w:cs=""/>
+                    <w:kern w:val="0"/>
+                    <w:szCs w:val="22"/>
+                    <w:lang w:eastAsia="en-US" w:bidi="ar-SA"/>
+                  </w:rPr>
+                  <w:t>☐</w:t>
+                </w:r>
+              </w:sdtContent>
+            </w:sdt>
+            <w:r>
+              <w:rPr>
+                <w:rFonts w:eastAsia="Calibri" w:cs=""/>
+                <w:kern w:val="0"/>
+                <w:szCs w:val="22"/>
+                <w:lang w:eastAsia="en-US" w:bidi="ar-SA"/>
+              </w:rPr>
+              <w:t xml:space="preserve"> </w:t>
+            </w:r>
+            <w:r>
+              <w:rPr>
+                <w:rFonts w:eastAsia="Calibri" w:cs=""/>
+                <w:kern w:val="0"/>
+                <w:szCs w:val="22"/>
+                <w:lang w:eastAsia="en-US" w:bidi="ar-SA"/>
+              </w:rPr>
+              <w:t xml:space="preserve">Atribut je </w:t>
+            </w:r>
+            <w:r>
+              <w:rPr>
+                <w:rFonts w:eastAsia="Calibri" w:cs=""/>
+                <w:i/>
+                <w:kern w:val="0"/>
+                <w:szCs w:val="22"/>
+                <w:lang w:eastAsia="en-US" w:bidi="ar-SA"/>
+              </w:rPr>
+              <w:t>enumeration</w:t>
+            </w:r>
+          </w:p>
+        </w:tc>
+      </w:tr>
+      <w:tr xmlns:wp14="http://schemas.microsoft.com/office/word/2010/wordml" wp14:textId="77777777">
+        <w:trPr>
+          <w:trHeight w:val="620" w:hRule="atLeast"/>
+        </w:trPr>
+        <w:tc>
+          <w:tcPr>
+            <w:tcW w:w="2784" w:type="dxa"/>
+            <w:tcBorders/>
+            <w:tcMar/>
+            <w:vAlign w:val="center"/>
+          </w:tcPr>
+          <w:p wp14:textId="676A6B13">
+            <w:pPr>
+              <w:pStyle w:val="Normal"/>
+              <w:widowControl w:val="1"/>
+              <w:spacing w:before="0" w:after="0"/>
+              <w:rPr>
+                <w:lang w:val="en-US"/>
+              </w:rPr>
+            </w:pPr>
+            <w:sdt>
+              <w:sdtPr>
+                <w:id w:val="-1089617575"/>
+                <w:placeholder>
+                  <w:docPart w:val="1DBD399E82384932B9FDB3EA2E42BF7D"/>
+                </w:placeholder>
+                <w:text/>
+              </w:sdtPr>
+              <w:sdtContent>
+                <w:r>
+                  <w:rPr>
+                    <w:lang w:val="en-US"/>
+                  </w:rPr>
+                  <w:t>Mjesto</w:t>
+                </w:r>
+                <w:r>
+                  <w:rPr>
+                    <w:rStyle w:val="PlaceholderText"/>
+                    <w:rFonts w:eastAsia="Calibri" w:cs=""/>
+                    <w:kern w:val="0"/>
+                    <w:szCs w:val="22"/>
+                    <w:lang w:eastAsia="en-US" w:bidi="ar-SA"/>
+                  </w:rPr>
                 </w:r>
               </w:sdtContent>
             </w:sdt>
@@ -498,28 +861,26 @@
           <w:tcPr>
             <w:tcW w:w="2881" w:type="dxa"/>
             <w:tcBorders/>
+            <w:tcMar/>
             <w:vAlign w:val="center"/>
           </w:tcPr>
-          <w:p>
+          <w:p wp14:textId="77777777">
             <w:pPr>
               <w:pStyle w:val="Normal"/>
-              <w:widowControl/>
+              <w:widowControl w:val="1"/>
               <w:spacing w:before="0" w:after="0"/>
-              <w:jc w:val="start"/>
               <w:rPr>
                 <w:rFonts w:eastAsia="Calibri" w:cs=""/>
                 <w:kern w:val="0"/>
-                <w:szCs w:val="22"/>
                 <w:lang w:eastAsia="en-US" w:bidi="ar-SA"/>
               </w:rPr>
             </w:pPr>
             <w:sdt>
               <w:sdtPr>
-                <w:id w:val="149486623"/>
+                <w:id w:val="1961600879"/>
                 <w:placeholder>
-                  <w:docPart w:val="DefaultPlaceholder_-1854013440"/>
+                  <w:docPart w:val="2EDC99A93FEE47B49DCF088F164479C6"/>
                 </w:placeholder>
-                <w:showingPlcHdr/>
                 <w:text/>
               </w:sdtPr>
               <w:sdtContent>
@@ -540,7 +901,7 @@
                     <w:szCs w:val="22"/>
                     <w:lang w:eastAsia="en-US" w:bidi="ar-SA"/>
                   </w:rPr>
-                  <w:t>Click or tap here to enter text.</w:t>
+                  <w:t>string</w:t>
                 </w:r>
               </w:sdtContent>
             </w:sdt>
@@ -550,254 +911,10 @@
           <w:tcPr>
             <w:tcW w:w="3690" w:type="dxa"/>
             <w:tcBorders/>
+            <w:tcMar/>
             <w:vAlign w:val="center"/>
           </w:tcPr>
-          <w:p>
-            <w:pPr>
-              <w:pStyle w:val="Normal"/>
-              <w:widowControl/>
-              <w:spacing w:before="0" w:after="0"/>
-              <w:jc w:val="start"/>
-              <w:rPr>
-                <w:rFonts w:eastAsia="Calibri" w:cs=""/>
-                <w:kern w:val="0"/>
-                <w:szCs w:val="22"/>
-                <w:lang w:eastAsia="en-US" w:bidi="ar-SA"/>
-              </w:rPr>
-            </w:pPr>
-            <w:sdt>
-              <w:sdtPr>
-                <w:id w:val="-1200541862"/>
-                <w14:checkbox>
-                  <w14:checked w14:val="0"/>
-                  <w14:checkedState w14:val="2612"/>
-                  <w14:uncheckedState w14:val="2610"/>
-                </w14:checkbox>
-              </w:sdtPr>
-              <w:sdtContent>
-                <w:r>
-                  <w:rPr>
-                    <w:rFonts w:eastAsia="MS Gothic" w:cs="" w:hint="eastAsia" w:ascii="MS Gothic" w:hAnsi="MS Gothic"/>
-                    <w:kern w:val="0"/>
-                    <w:szCs w:val="22"/>
-                    <w:lang w:eastAsia="en-US" w:bidi="ar-SA"/>
-                  </w:rPr>
-                </w:r>
-                <w:r>
-                  <w:rPr>
-                    <w:rFonts w:eastAsia="MS Gothic" w:cs="" w:hint="eastAsia" w:ascii="MS Gothic" w:hAnsi="MS Gothic"/>
-                    <w:kern w:val="0"/>
-                    <w:szCs w:val="22"/>
-                    <w:lang w:eastAsia="en-US" w:bidi="ar-SA"/>
-                  </w:rPr>
-                  <w:t>☐</w:t>
-                </w:r>
-              </w:sdtContent>
-            </w:sdt>
-            <w:r>
-              <w:rPr>
-                <w:rFonts w:eastAsia="Calibri" w:cs=""/>
-                <w:kern w:val="0"/>
-                <w:szCs w:val="22"/>
-                <w:lang w:eastAsia="en-US" w:bidi="ar-SA"/>
-              </w:rPr>
-              <w:t xml:space="preserve"> </w:t>
-            </w:r>
-            <w:r>
-              <w:rPr>
-                <w:rFonts w:eastAsia="Calibri" w:cs=""/>
-                <w:kern w:val="0"/>
-                <w:szCs w:val="22"/>
-                <w:lang w:eastAsia="en-US" w:bidi="ar-SA"/>
-              </w:rPr>
-              <w:t>Atribut je statički</w:t>
-            </w:r>
-          </w:p>
-          <w:p>
-            <w:pPr>
-              <w:pStyle w:val="Normal"/>
-              <w:widowControl/>
-              <w:spacing w:before="0" w:after="0"/>
-              <w:jc w:val="start"/>
-              <w:rPr>
-                <w:rFonts w:eastAsia="Calibri" w:cs=""/>
-                <w:kern w:val="0"/>
-                <w:szCs w:val="22"/>
-                <w:lang w:eastAsia="en-US" w:bidi="ar-SA"/>
-              </w:rPr>
-            </w:pPr>
-            <w:sdt>
-              <w:sdtPr>
-                <w:id w:val="-1516680328"/>
-                <w14:checkbox>
-                  <w14:checked w14:val="0"/>
-                  <w14:checkedState w14:val="2612"/>
-                  <w14:uncheckedState w14:val="2610"/>
-                </w14:checkbox>
-              </w:sdtPr>
-              <w:sdtContent>
-                <w:r>
-                  <w:rPr>
-                    <w:rFonts w:eastAsia="MS Gothic" w:cs="" w:hint="eastAsia" w:ascii="MS Gothic" w:hAnsi="MS Gothic"/>
-                    <w:kern w:val="0"/>
-                    <w:szCs w:val="22"/>
-                    <w:lang w:eastAsia="en-US" w:bidi="ar-SA"/>
-                  </w:rPr>
-                </w:r>
-                <w:r>
-                  <w:rPr>
-                    <w:rFonts w:eastAsia="MS Gothic" w:cs="" w:hint="eastAsia" w:ascii="MS Gothic" w:hAnsi="MS Gothic"/>
-                    <w:kern w:val="0"/>
-                    <w:szCs w:val="22"/>
-                    <w:lang w:eastAsia="en-US" w:bidi="ar-SA"/>
-                  </w:rPr>
-                  <w:t>☐</w:t>
-                </w:r>
-              </w:sdtContent>
-            </w:sdt>
-            <w:r>
-              <w:rPr>
-                <w:rFonts w:eastAsia="Calibri" w:cs=""/>
-                <w:kern w:val="0"/>
-                <w:szCs w:val="22"/>
-                <w:lang w:eastAsia="en-US" w:bidi="ar-SA"/>
-              </w:rPr>
-              <w:t xml:space="preserve"> </w:t>
-            </w:r>
-            <w:r>
-              <w:rPr>
-                <w:rFonts w:eastAsia="Calibri" w:cs=""/>
-                <w:kern w:val="0"/>
-                <w:szCs w:val="22"/>
-                <w:lang w:eastAsia="en-US" w:bidi="ar-SA"/>
-              </w:rPr>
-              <w:t xml:space="preserve">Atribut je </w:t>
-            </w:r>
-            <w:r>
-              <w:rPr>
-                <w:rFonts w:eastAsia="Calibri" w:cs=""/>
-                <w:i/>
-                <w:kern w:val="0"/>
-                <w:szCs w:val="22"/>
-                <w:lang w:eastAsia="en-US" w:bidi="ar-SA"/>
-              </w:rPr>
-              <w:t>enumeration</w:t>
-            </w:r>
-          </w:p>
-        </w:tc>
-      </w:tr>
-      <w:tr>
-        <w:trPr>
-          <w:trHeight w:val="620" w:hRule="atLeast"/>
-        </w:trPr>
-        <w:tc>
-          <w:tcPr>
-            <w:tcW w:w="2784" w:type="dxa"/>
-            <w:tcBorders/>
-            <w:vAlign w:val="center"/>
-          </w:tcPr>
-          <w:p>
-            <w:pPr>
-              <w:pStyle w:val="Normal"/>
-              <w:widowControl/>
-              <w:spacing w:before="0" w:after="0"/>
-              <w:jc w:val="start"/>
-              <w:rPr>
-                <w:color w:themeColor="background1" w:themeShade="80" w:val="808080"/>
-              </w:rPr>
-            </w:pPr>
-            <w:sdt>
-              <w:sdtPr>
-                <w:id w:val="-1089617575"/>
-                <w:placeholder>
-                  <w:docPart w:val="1DBD399E82384932B9FDB3EA2E42BF7D"/>
-                </w:placeholder>
-                <w:showingPlcHdr/>
-                <w:text/>
-              </w:sdtPr>
-              <w:sdtContent>
-                <w:r>
-                  <w:rPr>
-                    <w:rStyle w:val="PlaceholderText"/>
-                    <w:rFonts w:eastAsia="Calibri" w:cs=""/>
-                    <w:kern w:val="0"/>
-                    <w:szCs w:val="22"/>
-                    <w:lang w:eastAsia="en-US" w:bidi="ar-SA"/>
-                  </w:rPr>
-                </w:r>
-                <w:r>
-                  <w:rPr>
-                    <w:rStyle w:val="PlaceholderText"/>
-                    <w:rFonts w:eastAsia="Calibri" w:cs=""/>
-                    <w:kern w:val="0"/>
-                    <w:szCs w:val="22"/>
-                    <w:lang w:eastAsia="en-US" w:bidi="ar-SA"/>
-                  </w:rPr>
-                  <w:t>Click or tap here to enter text.</w:t>
-                </w:r>
-              </w:sdtContent>
-            </w:sdt>
-          </w:p>
-        </w:tc>
-        <w:tc>
-          <w:tcPr>
-            <w:tcW w:w="2881" w:type="dxa"/>
-            <w:tcBorders/>
-            <w:vAlign w:val="center"/>
-          </w:tcPr>
-          <w:p>
-            <w:pPr>
-              <w:pStyle w:val="Normal"/>
-              <w:widowControl/>
-              <w:spacing w:before="0" w:after="0"/>
-              <w:jc w:val="start"/>
-              <w:rPr>
-                <w:rFonts w:eastAsia="Calibri" w:cs=""/>
-                <w:kern w:val="0"/>
-                <w:szCs w:val="22"/>
-                <w:lang w:eastAsia="en-US" w:bidi="ar-SA"/>
-              </w:rPr>
-            </w:pPr>
-            <w:sdt>
-              <w:sdtPr>
-                <w:id w:val="1961600879"/>
-                <w:placeholder>
-                  <w:docPart w:val="2EDC99A93FEE47B49DCF088F164479C6"/>
-                </w:placeholder>
-                <w:showingPlcHdr/>
-                <w:text/>
-              </w:sdtPr>
-              <w:sdtContent>
-                <w:r>
-                  <w:rPr>
-                    <w:rStyle w:val="PlaceholderText"/>
-                    <w:rFonts w:eastAsia="Calibri" w:cs=""/>
-                    <w:kern w:val="0"/>
-                    <w:szCs w:val="22"/>
-                    <w:lang w:eastAsia="en-US" w:bidi="ar-SA"/>
-                  </w:rPr>
-                </w:r>
-                <w:r>
-                  <w:rPr>
-                    <w:rStyle w:val="PlaceholderText"/>
-                    <w:rFonts w:eastAsia="Calibri" w:cs=""/>
-                    <w:kern w:val="0"/>
-                    <w:szCs w:val="22"/>
-                    <w:lang w:eastAsia="en-US" w:bidi="ar-SA"/>
-                  </w:rPr>
-                  <w:t>Click or tap here to enter text.</w:t>
-                </w:r>
-              </w:sdtContent>
-            </w:sdt>
-          </w:p>
-        </w:tc>
-        <w:tc>
-          <w:tcPr>
-            <w:tcW w:w="3690" w:type="dxa"/>
-            <w:tcBorders/>
-            <w:vAlign w:val="center"/>
-          </w:tcPr>
-          <w:p>
+          <w:p wp14:textId="77777777">
             <w:pPr>
               <w:pStyle w:val="Normal"/>
               <w:widowControl/>
@@ -822,7 +939,7 @@
               <w:sdtContent>
                 <w:r>
                   <w:rPr>
-                    <w:rFonts w:eastAsia="MS Gothic" w:cs="" w:hint="eastAsia" w:ascii="MS Gothic" w:hAnsi="MS Gothic"/>
+                    <w:rFonts w:hint="eastAsia" w:ascii="MS Gothic" w:hAnsi="MS Gothic" w:eastAsia="MS Gothic" w:cs=""/>
                     <w:kern w:val="0"/>
                     <w:szCs w:val="22"/>
                     <w:lang w:eastAsia="en-US" w:bidi="ar-SA"/>
@@ -830,7 +947,7 @@
                 </w:r>
                 <w:r>
                   <w:rPr>
-                    <w:rFonts w:eastAsia="MS Gothic" w:cs="" w:hint="eastAsia" w:ascii="MS Gothic" w:hAnsi="MS Gothic"/>
+                    <w:rFonts w:hint="eastAsia" w:ascii="MS Gothic" w:hAnsi="MS Gothic" w:eastAsia="MS Gothic" w:cs=""/>
                     <w:kern w:val="0"/>
                     <w:szCs w:val="22"/>
                     <w:lang w:eastAsia="en-US" w:bidi="ar-SA"/>
@@ -858,7 +975,7 @@
               <w:t>Atribut je statički</w:t>
             </w:r>
           </w:p>
-          <w:p>
+          <w:p wp14:textId="77777777">
             <w:pPr>
               <w:pStyle w:val="Normal"/>
               <w:widowControl/>
@@ -883,7 +1000,7 @@
               <w:sdtContent>
                 <w:r>
                   <w:rPr>
-                    <w:rFonts w:eastAsia="MS Gothic" w:cs="" w:hint="eastAsia" w:ascii="MS Gothic" w:hAnsi="MS Gothic"/>
+                    <w:rFonts w:hint="eastAsia" w:ascii="MS Gothic" w:hAnsi="MS Gothic" w:eastAsia="MS Gothic" w:cs=""/>
                     <w:kern w:val="0"/>
                     <w:szCs w:val="22"/>
                     <w:lang w:eastAsia="en-US" w:bidi="ar-SA"/>
@@ -891,7 +1008,7 @@
                 </w:r>
                 <w:r>
                   <w:rPr>
-                    <w:rFonts w:eastAsia="MS Gothic" w:cs="" w:hint="eastAsia" w:ascii="MS Gothic" w:hAnsi="MS Gothic"/>
+                    <w:rFonts w:hint="eastAsia" w:ascii="MS Gothic" w:hAnsi="MS Gothic" w:eastAsia="MS Gothic" w:cs=""/>
                     <w:kern w:val="0"/>
                     <w:szCs w:val="22"/>
                     <w:lang w:eastAsia="en-US" w:bidi="ar-SA"/>
@@ -931,7 +1048,7 @@
           </w:p>
         </w:tc>
       </w:tr>
-      <w:tr>
+      <w:tr xmlns:wp14="http://schemas.microsoft.com/office/word/2010/wordml" wp14:textId="77777777">
         <w:trPr>
           <w:trHeight w:val="620" w:hRule="atLeast"/>
         </w:trPr>
@@ -939,17 +1056,14 @@
           <w:tcPr>
             <w:tcW w:w="2784" w:type="dxa"/>
             <w:tcBorders/>
+            <w:tcMar/>
             <w:vAlign w:val="center"/>
           </w:tcPr>
-          <w:p>
+          <w:p wp14:textId="42352051">
             <w:pPr>
               <w:pStyle w:val="Normal"/>
-              <w:widowControl/>
+              <w:widowControl w:val="1"/>
               <w:spacing w:before="0" w:after="0"/>
-              <w:jc w:val="start"/>
-              <w:rPr>
-                <w:color w:themeColor="background1" w:themeShade="80" w:val="808080"/>
-              </w:rPr>
             </w:pPr>
             <w:sdt>
               <w:sdtPr>
@@ -957,10 +1071,13 @@
                 <w:placeholder>
                   <w:docPart w:val="87EED9B8214649D4B941FF036A363880"/>
                 </w:placeholder>
-                <w:showingPlcHdr/>
                 <w:text/>
               </w:sdtPr>
               <w:sdtContent>
+                <w:r>
+                  <w:rPr/>
+                  <w:t>Adresa</w:t>
+                </w:r>
                 <w:r>
                   <w:rPr>
                     <w:rStyle w:val="PlaceholderText"/>
@@ -970,16 +1087,6 @@
                     <w:lang w:eastAsia="en-US" w:bidi="ar-SA"/>
                   </w:rPr>
                 </w:r>
-                <w:r>
-                  <w:rPr>
-                    <w:rStyle w:val="PlaceholderText"/>
-                    <w:rFonts w:eastAsia="Calibri" w:cs=""/>
-                    <w:kern w:val="0"/>
-                    <w:szCs w:val="22"/>
-                    <w:lang w:eastAsia="en-US" w:bidi="ar-SA"/>
-                  </w:rPr>
-                  <w:t>Click or tap here to enter text.</w:t>
-                </w:r>
               </w:sdtContent>
             </w:sdt>
           </w:p>
@@ -988,19 +1095,17 @@
           <w:tcPr>
             <w:tcW w:w="2881" w:type="dxa"/>
             <w:tcBorders/>
+            <w:tcMar/>
             <w:vAlign w:val="center"/>
           </w:tcPr>
-          <w:p>
+          <w:p wp14:textId="180C6014">
             <w:pPr>
               <w:pStyle w:val="Normal"/>
-              <w:widowControl/>
+              <w:widowControl w:val="1"/>
               <w:spacing w:before="0" w:after="0"/>
-              <w:jc w:val="start"/>
-              <w:rPr>
-                <w:rFonts w:eastAsia="Calibri" w:cs=""/>
+              <w:rPr>
                 <w:kern w:val="0"/>
-                <w:szCs w:val="22"/>
-                <w:lang w:eastAsia="en-US" w:bidi="ar-SA"/>
+                <w:lang w:val="en-US"/>
               </w:rPr>
             </w:pPr>
             <w:sdt>
@@ -1009,10 +1114,21 @@
                 <w:placeholder>
                   <w:docPart w:val="90DE4D15E6DF44C6848B08242714CB36"/>
                 </w:placeholder>
-                <w:showingPlcHdr/>
                 <w:text/>
               </w:sdtPr>
               <w:sdtContent>
+                <w:r>
+                  <w:rPr>
+                    <w:lang w:val="en-US"/>
+                  </w:rPr>
+                  <w:t>Mozda</w:t>
+                </w:r>
+                <w:r>
+                  <w:rPr>
+                    <w:lang w:val="en-US"/>
+                  </w:rPr>
+                  <w:t xml:space="preserve"> tuple&lt;string, int&gt;?</w:t>
+                </w:r>
                 <w:r>
                   <w:rPr>
                     <w:rStyle w:val="PlaceholderText"/>
@@ -1022,16 +1138,6 @@
                     <w:lang w:eastAsia="en-US" w:bidi="ar-SA"/>
                   </w:rPr>
                 </w:r>
-                <w:r>
-                  <w:rPr>
-                    <w:rStyle w:val="PlaceholderText"/>
-                    <w:rFonts w:eastAsia="Calibri" w:cs=""/>
-                    <w:kern w:val="0"/>
-                    <w:szCs w:val="22"/>
-                    <w:lang w:eastAsia="en-US" w:bidi="ar-SA"/>
-                  </w:rPr>
-                  <w:t>Click or tap here to enter text.</w:t>
-                </w:r>
               </w:sdtContent>
             </w:sdt>
           </w:p>
@@ -1040,9 +1146,10 @@
           <w:tcPr>
             <w:tcW w:w="3690" w:type="dxa"/>
             <w:tcBorders/>
+            <w:tcMar/>
             <w:vAlign w:val="center"/>
           </w:tcPr>
-          <w:p>
+          <w:p wp14:textId="77777777">
             <w:pPr>
               <w:pStyle w:val="Normal"/>
               <w:widowControl/>
@@ -1067,7 +1174,7 @@
               <w:sdtContent>
                 <w:r>
                   <w:rPr>
-                    <w:rFonts w:eastAsia="MS Gothic" w:cs="" w:hint="eastAsia" w:ascii="MS Gothic" w:hAnsi="MS Gothic"/>
+                    <w:rFonts w:hint="eastAsia" w:ascii="MS Gothic" w:hAnsi="MS Gothic" w:eastAsia="MS Gothic" w:cs=""/>
                     <w:kern w:val="0"/>
                     <w:szCs w:val="22"/>
                     <w:lang w:eastAsia="en-US" w:bidi="ar-SA"/>
@@ -1075,7 +1182,7 @@
                 </w:r>
                 <w:r>
                   <w:rPr>
-                    <w:rFonts w:eastAsia="MS Gothic" w:cs="" w:hint="eastAsia" w:ascii="MS Gothic" w:hAnsi="MS Gothic"/>
+                    <w:rFonts w:hint="eastAsia" w:ascii="MS Gothic" w:hAnsi="MS Gothic" w:eastAsia="MS Gothic" w:cs=""/>
                     <w:kern w:val="0"/>
                     <w:szCs w:val="22"/>
                     <w:lang w:eastAsia="en-US" w:bidi="ar-SA"/>
@@ -1103,16 +1210,14 @@
               <w:t>Atribut je statički</w:t>
             </w:r>
           </w:p>
-          <w:p>
+          <w:p wp14:textId="77777777">
             <w:pPr>
               <w:pStyle w:val="Normal"/>
-              <w:widowControl/>
+              <w:widowControl w:val="1"/>
               <w:spacing w:before="0" w:after="0"/>
-              <w:jc w:val="start"/>
               <w:rPr>
                 <w:rFonts w:eastAsia="Calibri" w:cs=""/>
                 <w:kern w:val="0"/>
-                <w:szCs w:val="22"/>
                 <w:lang w:eastAsia="en-US" w:bidi="ar-SA"/>
               </w:rPr>
             </w:pPr>
@@ -1121,14 +1226,14 @@
                 <w:id w:val="1255010894"/>
                 <w14:checkbox>
                   <w14:checked w14:val="0"/>
-                  <w14:checkedState w14:val="2612"/>
-                  <w14:uncheckedState w14:val="2610"/>
+                  <w14:checkedState w14:val="2612" w14:font="MS Gothic"/>
+                  <w14:uncheckedState w14:val="2610" w14:font="MS Gothic"/>
                 </w14:checkbox>
               </w:sdtPr>
               <w:sdtContent>
                 <w:r>
                   <w:rPr>
-                    <w:rFonts w:eastAsia="MS Gothic" w:cs="" w:hint="eastAsia" w:ascii="MS Gothic" w:hAnsi="MS Gothic"/>
+                    <w:rFonts w:hint="eastAsia" w:ascii="MS Gothic" w:hAnsi="MS Gothic" w:eastAsia="MS Gothic" w:cs=""/>
                     <w:kern w:val="0"/>
                     <w:szCs w:val="22"/>
                     <w:lang w:eastAsia="en-US" w:bidi="ar-SA"/>
@@ -1136,9 +1241,8 @@
                 </w:r>
                 <w:r>
                   <w:rPr>
-                    <w:rFonts w:eastAsia="MS Gothic" w:cs="" w:hint="eastAsia" w:ascii="MS Gothic" w:hAnsi="MS Gothic"/>
+                    <w:rFonts w:ascii="MS Gothic" w:hAnsi="MS Gothic" w:eastAsia="MS Gothic" w:cs=""/>
                     <w:kern w:val="0"/>
-                    <w:szCs w:val="22"/>
                     <w:lang w:eastAsia="en-US" w:bidi="ar-SA"/>
                   </w:rPr>
                   <w:t>☐</w:t>
@@ -1149,7 +1253,6 @@
               <w:rPr>
                 <w:rFonts w:eastAsia="Calibri" w:cs=""/>
                 <w:kern w:val="0"/>
-                <w:szCs w:val="22"/>
                 <w:lang w:eastAsia="en-US" w:bidi="ar-SA"/>
               </w:rPr>
               <w:t xml:space="preserve"> </w:t>
@@ -1158,18 +1261,2646 @@
               <w:rPr>
                 <w:rFonts w:eastAsia="Calibri" w:cs=""/>
                 <w:kern w:val="0"/>
-                <w:szCs w:val="22"/>
                 <w:lang w:eastAsia="en-US" w:bidi="ar-SA"/>
               </w:rPr>
-              <w:t xml:space="preserve">Atribut je </w:t>
-            </w:r>
-            <w:r>
-              <w:rPr>
-                <w:rFonts w:eastAsia="Calibri" w:cs=""/>
-                <w:i/>
+              <w:t xml:space="preserve">Atribut</w:t>
+            </w:r>
+            <w:r>
+              <w:rPr>
+                <w:rFonts w:eastAsia="Calibri" w:cs=""/>
                 <w:kern w:val="0"/>
-                <w:szCs w:val="22"/>
                 <w:lang w:eastAsia="en-US" w:bidi="ar-SA"/>
+              </w:rPr>
+              <w:t xml:space="preserve"> je </w:t>
+            </w:r>
+            <w:r>
+              <w:rPr>
+                <w:rFonts w:eastAsia="Calibri" w:cs=""/>
+                <w:i w:val="1"/>
+                <w:iCs w:val="1"/>
+                <w:kern w:val="0"/>
+                <w:lang w:eastAsia="en-US" w:bidi="ar-SA"/>
+              </w:rPr>
+              <w:t>enumeration</w:t>
+            </w:r>
+          </w:p>
+        </w:tc>
+      </w:tr>
+      <w:tr>
+        <w:trPr>
+          <w:trHeight w:val="620"/>
+        </w:trPr>
+        <w:tc>
+          <w:tcPr>
+            <w:tcW w:w="2784" w:type="dxa"/>
+            <w:tcBorders/>
+            <w:tcMar/>
+            <w:vAlign w:val="center"/>
+          </w:tcPr>
+          <w:p>
+            <w:pPr>
+              <w:pStyle w:val="Normal"/>
+              <w:rPr>
+                <w:lang w:val="en-US"/>
+              </w:rPr>
+            </w:pPr>
+            <w:r>
+              <w:rPr>
+                <w:lang w:val="en-US"/>
+              </w:rPr>
+              <w:t>Kategorija</w:t>
+            </w:r>
+          </w:p>
+        </w:tc>
+        <w:tc>
+          <w:tcPr>
+            <w:tcW w:w="2881" w:type="dxa"/>
+            <w:tcBorders/>
+            <w:tcMar/>
+            <w:vAlign w:val="center"/>
+          </w:tcPr>
+          <w:p>
+            <w:pPr>
+              <w:pStyle w:val="Normal"/>
+              <w:rPr>
+                <w:rStyle w:val="PlaceholderText"/>
+                <w:rFonts w:eastAsia="Calibri" w:cs=""/>
+                <w:lang w:eastAsia="en-US" w:bidi="ar-SA"/>
+              </w:rPr>
+            </w:pPr>
+            <w:r>
+              <w:rPr>
+                <w:rStyle w:val="PlaceholderText"/>
+                <w:rFonts w:eastAsia="Calibri" w:cs=""/>
+                <w:lang w:eastAsia="en-US" w:bidi="ar-SA"/>
+              </w:rPr>
+              <w:t>Enum</w:t>
+            </w:r>
+          </w:p>
+        </w:tc>
+        <w:tc>
+          <w:tcPr>
+            <w:tcW w:w="3690" w:type="dxa"/>
+            <w:tcBorders/>
+            <w:tcMar/>
+            <w:vAlign w:val="center"/>
+          </w:tcPr>
+          <w:p>
+            <w:pPr>
+              <w:pStyle w:val="Normal"/>
+              <w:widowControl w:val="1"/>
+              <w:spacing w:before="0" w:after="0"/>
+              <w:rPr>
+                <w:rFonts w:eastAsia="Calibri" w:cs=""/>
+                <w:lang w:val="en-US" w:eastAsia="en-US" w:bidi="ar-SA"/>
+              </w:rPr>
+            </w:pPr>
+            <w:sdt>
+              <w:sdtPr>
+                <w:id w:val="438443079"/>
+                <w14:checkbox>
+                  <w14:checked w14:val="0"/>
+                  <w14:checkedState w14:val="2612" w14:font="MS Gothic"/>
+                  <w14:uncheckedState w14:val="2610" w14:font="MS Gothic"/>
+                </w14:checkbox>
+              </w:sdtPr>
+              <w:sdtContent>
+                <w:r>
+                  <w:rPr>
+                    <w:rFonts w:ascii="MS Gothic" w:hAnsi="MS Gothic" w:eastAsia="MS Gothic" w:cs=""/>
+                    <w:lang w:val="en-US" w:eastAsia="en-US" w:bidi="ar-SA"/>
+                  </w:rPr>
+                  <w:t>☐</w:t>
+                </w:r>
+              </w:sdtContent>
+            </w:sdt>
+            <w:r>
+              <w:rPr>
+                <w:rFonts w:eastAsia="Calibri" w:cs=""/>
+                <w:lang w:val="en-US" w:eastAsia="en-US" w:bidi="ar-SA"/>
+              </w:rPr>
+              <w:t xml:space="preserve"> </w:t>
+            </w:r>
+            <w:r>
+              <w:rPr>
+                <w:rFonts w:eastAsia="Calibri" w:cs=""/>
+                <w:lang w:val="en-US" w:eastAsia="en-US" w:bidi="ar-SA"/>
+              </w:rPr>
+              <w:t>Atribut</w:t>
+            </w:r>
+            <w:r>
+              <w:rPr>
+                <w:rFonts w:eastAsia="Calibri" w:cs=""/>
+                <w:lang w:val="en-US" w:eastAsia="en-US" w:bidi="ar-SA"/>
+              </w:rPr>
+              <w:t xml:space="preserve"> je </w:t>
+            </w:r>
+            <w:r>
+              <w:rPr>
+                <w:rFonts w:eastAsia="Calibri" w:cs=""/>
+                <w:lang w:val="en-US" w:eastAsia="en-US" w:bidi="ar-SA"/>
+              </w:rPr>
+              <w:t>statički</w:t>
+            </w:r>
+          </w:p>
+          <w:p>
+            <w:pPr>
+              <w:pStyle w:val="Normal"/>
+              <w:widowControl w:val="1"/>
+              <w:spacing w:before="0" w:after="0"/>
+              <w:rPr>
+                <w:rFonts w:eastAsia="Calibri" w:cs=""/>
+                <w:lang w:val="en-US" w:eastAsia="en-US" w:bidi="ar-SA"/>
+              </w:rPr>
+            </w:pPr>
+            <w:sdt>
+              <w:sdtPr>
+                <w:id w:val="1474560031"/>
+                <w14:checkbox>
+                  <w14:checked w14:val="1"/>
+                  <w14:checkedState w14:val="2612" w14:font="MS Gothic"/>
+                  <w14:uncheckedState w14:val="2610" w14:font="MS Gothic"/>
+                </w14:checkbox>
+              </w:sdtPr>
+              <w:sdtContent>
+                <w:r>
+                  <w:rPr>
+                    <w:rFonts w:ascii="MS Gothic" w:hAnsi="MS Gothic" w:eastAsia="MS Gothic" w:cs="MS Gothic"/>
+                    <w:lang w:val="en-US" w:eastAsia="en-US" w:bidi="ar-SA"/>
+                  </w:rPr>
+                  <w:t>☒</w:t>
+                </w:r>
+              </w:sdtContent>
+            </w:sdt>
+            <w:r>
+              <w:rPr>
+                <w:rFonts w:eastAsia="Calibri" w:cs=""/>
+                <w:lang w:val="en-US" w:eastAsia="en-US" w:bidi="ar-SA"/>
+              </w:rPr>
+              <w:t xml:space="preserve"> </w:t>
+            </w:r>
+            <w:r>
+              <w:rPr>
+                <w:rFonts w:eastAsia="Calibri" w:cs=""/>
+                <w:lang w:val="en-US" w:eastAsia="en-US" w:bidi="ar-SA"/>
+              </w:rPr>
+              <w:t>Atribut</w:t>
+            </w:r>
+            <w:r>
+              <w:rPr>
+                <w:rFonts w:eastAsia="Calibri" w:cs=""/>
+                <w:lang w:val="en-US" w:eastAsia="en-US" w:bidi="ar-SA"/>
+              </w:rPr>
+              <w:t xml:space="preserve"> je </w:t>
+            </w:r>
+            <w:r>
+              <w:rPr>
+                <w:rFonts w:eastAsia="Calibri" w:cs=""/>
+                <w:i w:val="1"/>
+                <w:iCs w:val="1"/>
+                <w:lang w:val="en-US" w:eastAsia="en-US" w:bidi="ar-SA"/>
+              </w:rPr>
+              <w:t>enumeration</w:t>
+            </w:r>
+          </w:p>
+        </w:tc>
+      </w:tr>
+      <w:tr>
+        <w:trPr>
+          <w:trHeight w:val="620"/>
+        </w:trPr>
+        <w:tc>
+          <w:tcPr>
+            <w:tcW w:w="2784" w:type="dxa"/>
+            <w:tcBorders/>
+            <w:tcMar/>
+            <w:vAlign w:val="center"/>
+          </w:tcPr>
+          <w:p>
+            <w:pPr>
+              <w:pStyle w:val="Normal"/>
+              <w:rPr>
+                <w:lang w:val="en-US"/>
+              </w:rPr>
+            </w:pPr>
+            <w:r>
+              <w:rPr>
+                <w:lang w:val="en-US"/>
+              </w:rPr>
+              <w:t xml:space="preserve">Godina </w:t>
+            </w:r>
+            <w:r>
+              <w:rPr>
+                <w:lang w:val="en-US"/>
+              </w:rPr>
+              <w:t>osnivanja</w:t>
+            </w:r>
+            <w:r>
+              <w:rPr>
+                <w:lang w:val="en-US"/>
+              </w:rPr>
+              <w:t>/fazon iskustva</w:t>
+            </w:r>
+          </w:p>
+        </w:tc>
+        <w:tc>
+          <w:tcPr>
+            <w:tcW w:w="2881" w:type="dxa"/>
+            <w:tcBorders/>
+            <w:tcMar/>
+            <w:vAlign w:val="center"/>
+          </w:tcPr>
+          <w:p>
+            <w:pPr>
+              <w:pStyle w:val="Normal"/>
+              <w:rPr>
+                <w:rStyle w:val="PlaceholderText"/>
+                <w:rFonts w:eastAsia="Calibri" w:cs=""/>
+                <w:lang w:eastAsia="en-US" w:bidi="ar-SA"/>
+              </w:rPr>
+            </w:pPr>
+            <w:r>
+              <w:rPr>
+                <w:rStyle w:val="PlaceholderText"/>
+                <w:rFonts w:eastAsia="Calibri" w:cs=""/>
+                <w:lang w:eastAsia="en-US" w:bidi="ar-SA"/>
+              </w:rPr>
+              <w:t>int</w:t>
+            </w:r>
+          </w:p>
+        </w:tc>
+        <w:tc>
+          <w:tcPr>
+            <w:tcW w:w="3690" w:type="dxa"/>
+            <w:tcBorders/>
+            <w:tcMar/>
+            <w:vAlign w:val="center"/>
+          </w:tcPr>
+          <w:p>
+            <w:pPr>
+              <w:pStyle w:val="Normal"/>
+              <w:widowControl w:val="1"/>
+              <w:spacing w:before="0" w:after="0"/>
+              <w:rPr>
+                <w:rFonts w:eastAsia="Calibri" w:cs=""/>
+                <w:lang w:val="en-US" w:eastAsia="en-US" w:bidi="ar-SA"/>
+              </w:rPr>
+            </w:pPr>
+            <w:sdt>
+              <w:sdtPr>
+                <w:id w:val="1235061859"/>
+                <w14:checkbox>
+                  <w14:checked w14:val="0"/>
+                  <w14:checkedState w14:val="2612" w14:font="MS Gothic"/>
+                  <w14:uncheckedState w14:val="2610" w14:font="MS Gothic"/>
+                </w14:checkbox>
+              </w:sdtPr>
+              <w:sdtContent>
+                <w:r>
+                  <w:rPr>
+                    <w:rFonts w:ascii="MS Gothic" w:hAnsi="MS Gothic" w:eastAsia="MS Gothic" w:cs=""/>
+                    <w:lang w:val="en-US" w:eastAsia="en-US" w:bidi="ar-SA"/>
+                  </w:rPr>
+                  <w:t>☐</w:t>
+                </w:r>
+              </w:sdtContent>
+            </w:sdt>
+            <w:r>
+              <w:rPr>
+                <w:rFonts w:eastAsia="Calibri" w:cs=""/>
+                <w:lang w:val="en-US" w:eastAsia="en-US" w:bidi="ar-SA"/>
+              </w:rPr>
+              <w:t xml:space="preserve"> Atribut je statički</w:t>
+            </w:r>
+          </w:p>
+          <w:p>
+            <w:pPr>
+              <w:pStyle w:val="Normal"/>
+              <w:widowControl w:val="1"/>
+              <w:spacing w:before="0" w:after="0"/>
+              <w:rPr>
+                <w:rFonts w:eastAsia="Calibri" w:cs=""/>
+                <w:lang w:val="en-US" w:eastAsia="en-US" w:bidi="ar-SA"/>
+              </w:rPr>
+            </w:pPr>
+            <w:sdt>
+              <w:sdtPr>
+                <w:id w:val="1268270214"/>
+                <w14:checkbox>
+                  <w14:checked w14:val="0"/>
+                  <w14:checkedState w14:val="2612" w14:font="MS Gothic"/>
+                  <w14:uncheckedState w14:val="2610" w14:font="MS Gothic"/>
+                </w14:checkbox>
+              </w:sdtPr>
+              <w:sdtContent>
+                <w:r>
+                  <w:rPr>
+                    <w:rFonts w:ascii="MS Gothic" w:hAnsi="MS Gothic" w:eastAsia="MS Gothic" w:cs="MS Gothic"/>
+                    <w:lang w:val="en-US" w:eastAsia="en-US" w:bidi="ar-SA"/>
+                  </w:rPr>
+                  <w:t>☐</w:t>
+                </w:r>
+              </w:sdtContent>
+            </w:sdt>
+            <w:r>
+              <w:rPr>
+                <w:rFonts w:eastAsia="Calibri" w:cs=""/>
+                <w:lang w:val="en-US" w:eastAsia="en-US" w:bidi="ar-SA"/>
+              </w:rPr>
+              <w:t xml:space="preserve"> </w:t>
+            </w:r>
+            <w:r>
+              <w:rPr>
+                <w:rFonts w:eastAsia="Calibri" w:cs=""/>
+                <w:lang w:val="en-US" w:eastAsia="en-US" w:bidi="ar-SA"/>
+              </w:rPr>
+              <w:t>Atribut</w:t>
+            </w:r>
+            <w:r>
+              <w:rPr>
+                <w:rFonts w:eastAsia="Calibri" w:cs=""/>
+                <w:lang w:val="en-US" w:eastAsia="en-US" w:bidi="ar-SA"/>
+              </w:rPr>
+              <w:t xml:space="preserve"> je </w:t>
+            </w:r>
+            <w:r>
+              <w:rPr>
+                <w:rFonts w:eastAsia="Calibri" w:cs=""/>
+                <w:i w:val="1"/>
+                <w:iCs w:val="1"/>
+                <w:lang w:val="en-US" w:eastAsia="en-US" w:bidi="ar-SA"/>
+              </w:rPr>
+              <w:t>enumeration</w:t>
+            </w:r>
+          </w:p>
+        </w:tc>
+      </w:tr>
+      <w:tr>
+        <w:trPr>
+          <w:trHeight w:val="620"/>
+        </w:trPr>
+        <w:tc>
+          <w:tcPr>
+            <w:tcW w:w="2784" w:type="dxa"/>
+            <w:tcBorders/>
+            <w:tcMar/>
+            <w:vAlign w:val="center"/>
+          </w:tcPr>
+          <w:p>
+            <w:pPr>
+              <w:pStyle w:val="Normal"/>
+              <w:rPr>
+                <w:lang w:val="en-US"/>
+              </w:rPr>
+            </w:pPr>
+            <w:r>
+              <w:rPr>
+                <w:lang w:val="en-US"/>
+              </w:rPr>
+              <w:t>Telefon</w:t>
+            </w:r>
+          </w:p>
+        </w:tc>
+        <w:tc>
+          <w:tcPr>
+            <w:tcW w:w="2881" w:type="dxa"/>
+            <w:tcBorders/>
+            <w:tcMar/>
+            <w:vAlign w:val="center"/>
+          </w:tcPr>
+          <w:p>
+            <w:pPr>
+              <w:pStyle w:val="Normal"/>
+              <w:rPr>
+                <w:rStyle w:val="PlaceholderText"/>
+                <w:rFonts w:eastAsia="Calibri" w:cs=""/>
+                <w:lang w:eastAsia="en-US" w:bidi="ar-SA"/>
+              </w:rPr>
+            </w:pPr>
+            <w:r>
+              <w:rPr>
+                <w:rStyle w:val="PlaceholderText"/>
+                <w:rFonts w:eastAsia="Calibri" w:cs=""/>
+                <w:lang w:eastAsia="en-US" w:bidi="ar-SA"/>
+              </w:rPr>
+              <w:t>string</w:t>
+            </w:r>
+          </w:p>
+        </w:tc>
+        <w:tc>
+          <w:tcPr>
+            <w:tcW w:w="3690" w:type="dxa"/>
+            <w:tcBorders/>
+            <w:tcMar/>
+            <w:vAlign w:val="center"/>
+          </w:tcPr>
+          <w:p>
+            <w:pPr>
+              <w:pStyle w:val="Normal"/>
+              <w:widowControl w:val="1"/>
+              <w:spacing w:before="0" w:after="0"/>
+              <w:rPr>
+                <w:rFonts w:eastAsia="Calibri" w:cs=""/>
+                <w:lang w:val="en-US" w:eastAsia="en-US" w:bidi="ar-SA"/>
+              </w:rPr>
+            </w:pPr>
+            <w:sdt>
+              <w:sdtPr>
+                <w:id w:val="2039653587"/>
+                <w14:checkbox>
+                  <w14:checked w14:val="0"/>
+                  <w14:checkedState w14:val="2612" w14:font="MS Gothic"/>
+                  <w14:uncheckedState w14:val="2610" w14:font="MS Gothic"/>
+                </w14:checkbox>
+              </w:sdtPr>
+              <w:sdtContent>
+                <w:r>
+                  <w:rPr>
+                    <w:rFonts w:ascii="MS Gothic" w:hAnsi="MS Gothic" w:eastAsia="MS Gothic" w:cs=""/>
+                    <w:lang w:val="en-US" w:eastAsia="en-US" w:bidi="ar-SA"/>
+                  </w:rPr>
+                  <w:t>☐</w:t>
+                </w:r>
+              </w:sdtContent>
+            </w:sdt>
+            <w:r>
+              <w:rPr>
+                <w:rFonts w:eastAsia="Calibri" w:cs=""/>
+                <w:lang w:val="en-US" w:eastAsia="en-US" w:bidi="ar-SA"/>
+              </w:rPr>
+              <w:t xml:space="preserve"> Atribut je statički</w:t>
+            </w:r>
+          </w:p>
+          <w:p>
+            <w:pPr>
+              <w:pStyle w:val="Normal"/>
+              <w:widowControl w:val="1"/>
+              <w:spacing w:before="0" w:after="0"/>
+              <w:rPr>
+                <w:rFonts w:eastAsia="Calibri" w:cs=""/>
+                <w:lang w:val="en-US" w:eastAsia="en-US" w:bidi="ar-SA"/>
+              </w:rPr>
+            </w:pPr>
+            <w:sdt>
+              <w:sdtPr>
+                <w:id w:val="303369906"/>
+                <w14:checkbox>
+                  <w14:checked w14:val="0"/>
+                  <w14:checkedState w14:val="2612" w14:font="MS Gothic"/>
+                  <w14:uncheckedState w14:val="2610" w14:font="MS Gothic"/>
+                </w14:checkbox>
+              </w:sdtPr>
+              <w:sdtContent>
+                <w:r>
+                  <w:rPr>
+                    <w:rFonts w:ascii="MS Gothic" w:hAnsi="MS Gothic" w:eastAsia="MS Gothic" w:cs="MS Gothic"/>
+                    <w:lang w:val="en-US" w:eastAsia="en-US" w:bidi="ar-SA"/>
+                  </w:rPr>
+                  <w:t>☐</w:t>
+                </w:r>
+              </w:sdtContent>
+            </w:sdt>
+            <w:r>
+              <w:rPr>
+                <w:rFonts w:eastAsia="Calibri" w:cs=""/>
+                <w:lang w:val="en-US" w:eastAsia="en-US" w:bidi="ar-SA"/>
+              </w:rPr>
+              <w:t xml:space="preserve"> Atribut je </w:t>
+            </w:r>
+            <w:r>
+              <w:rPr>
+                <w:rFonts w:eastAsia="Calibri" w:cs=""/>
+                <w:i w:val="1"/>
+                <w:iCs w:val="1"/>
+                <w:lang w:val="en-US" w:eastAsia="en-US" w:bidi="ar-SA"/>
+              </w:rPr>
+              <w:t>enumeration</w:t>
+            </w:r>
+          </w:p>
+        </w:tc>
+      </w:tr>
+    </w:tbl>
+    <w:p xmlns:wp14="http://schemas.microsoft.com/office/word/2010/wordml" wp14:textId="77777777">
+      <w:pPr>
+        <w:pStyle w:val="Normal"/>
+        <w:ind w:start="360"/>
+        <w:rPr>
+          <w:color w:val="808080" w:themeColor="background1" w:themeShade="80"/>
+        </w:rPr>
+      </w:pPr>
+    </w:p>
+    <w:p>
+      <w:pPr>
+        <w:pStyle w:val="Normal"/>
+        <w:rPr>
+          <w:color w:val="808080" w:themeColor="background1" w:themeTint="FF" w:themeShade="80"/>
+        </w:rPr>
+      </w:pPr>
+    </w:p>
+    <w:p>
+      <w:pPr>
+        <w:pStyle w:val="Normal"/>
+        <w:rPr>
+          <w:color w:val="808080" w:themeColor="background1" w:themeTint="FF" w:themeShade="80"/>
+        </w:rPr>
+      </w:pPr>
+    </w:p>
+    <w:p xmlns:wp14="http://schemas.microsoft.com/office/word/2010/wordml" wp14:textId="77777777">
+      <w:pPr>
+        <w:pStyle w:val="Normal"/>
+        <w:ind w:start="360"/>
+      </w:pPr>
+    </w:p>
+    <w:p>
+      <w:pPr>
+        <w:pStyle w:val="Normal"/>
+      </w:pPr>
+      <w:r>
+        <w:rPr>
+          <w:b w:val="1"/>
+          <w:bCs w:val="1"/>
+          <w:lang w:val="en-US"/>
+        </w:rPr>
+        <w:t>Naziv</w:t>
+      </w:r>
+      <w:r>
+        <w:rPr>
+          <w:b w:val="1"/>
+          <w:bCs w:val="1"/>
+          <w:lang w:val="en-US"/>
+        </w:rPr>
+        <w:t xml:space="preserve"> </w:t>
+      </w:r>
+      <w:r>
+        <w:rPr>
+          <w:b w:val="1"/>
+          <w:bCs w:val="1"/>
+          <w:lang w:val="en-US"/>
+        </w:rPr>
+        <w:t>klase</w:t>
+      </w:r>
+      <w:r>
+        <w:rPr>
+          <w:b w:val="1"/>
+          <w:bCs w:val="1"/>
+          <w:lang w:val="en-US"/>
+        </w:rPr>
+        <w:t>:</w:t>
+      </w:r>
+      <w:r>
+        <w:rPr>
+          <w:lang w:val="en-US"/>
+        </w:rPr>
+        <w:t xml:space="preserve"> </w:t>
+      </w:r>
+      <w:sdt>
+        <w:sdtPr>
+          <w:id w:val="598451850"/>
+          <w:placeholder>
+            <w:docPart w:val="DefaultPlaceholder_-1854013440"/>
+          </w:placeholder>
+        </w:sdtPr>
+        <w:sdtContent>
+          <w:r>
+            <w:rPr/>
+            <w:t>Firma</w:t>
+          </w:r>
+        </w:sdtContent>
+      </w:sdt>
+    </w:p>
+    <w:p>
+      <w:pPr>
+        <w:pStyle w:val="Normal"/>
+      </w:pPr>
+    </w:p>
+    <w:p>
+      <w:pPr>
+        <w:pStyle w:val="Normal"/>
+        <w:rPr>
+          <w:b w:val="1"/>
+          <w:bCs w:val="1"/>
+          <w:lang w:val="en-US"/>
+        </w:rPr>
+      </w:pPr>
+      <w:r>
+        <w:rPr>
+          <w:b w:val="1"/>
+          <w:bCs w:val="1"/>
+          <w:lang w:val="en-US"/>
+        </w:rPr>
+        <w:t>Funkcionalni</w:t>
+      </w:r>
+      <w:r>
+        <w:rPr>
+          <w:b w:val="1"/>
+          <w:bCs w:val="1"/>
+          <w:lang w:val="en-US"/>
+        </w:rPr>
+        <w:t xml:space="preserve"> </w:t>
+      </w:r>
+      <w:r>
+        <w:rPr>
+          <w:b w:val="1"/>
+          <w:bCs w:val="1"/>
+          <w:lang w:val="en-US"/>
+        </w:rPr>
+        <w:t>zahtjevi</w:t>
+      </w:r>
+      <w:r>
+        <w:rPr>
+          <w:b w:val="1"/>
+          <w:bCs w:val="1"/>
+          <w:lang w:val="en-US"/>
+        </w:rPr>
+        <w:t xml:space="preserve"> u </w:t>
+      </w:r>
+      <w:r>
+        <w:rPr>
+          <w:b w:val="1"/>
+          <w:bCs w:val="1"/>
+          <w:lang w:val="en-US"/>
+        </w:rPr>
+        <w:t>kojima</w:t>
+      </w:r>
+      <w:r>
+        <w:rPr>
+          <w:b w:val="1"/>
+          <w:bCs w:val="1"/>
+          <w:lang w:val="en-US"/>
+        </w:rPr>
+        <w:t xml:space="preserve"> </w:t>
+      </w:r>
+      <w:r>
+        <w:rPr>
+          <w:b w:val="1"/>
+          <w:bCs w:val="1"/>
+          <w:lang w:val="en-US"/>
+        </w:rPr>
+        <w:t>klasa</w:t>
+      </w:r>
+      <w:r>
+        <w:rPr>
+          <w:b w:val="1"/>
+          <w:bCs w:val="1"/>
+          <w:lang w:val="en-US"/>
+        </w:rPr>
+        <w:t xml:space="preserve"> </w:t>
+      </w:r>
+      <w:r>
+        <w:rPr>
+          <w:b w:val="1"/>
+          <w:bCs w:val="1"/>
+          <w:lang w:val="en-US"/>
+        </w:rPr>
+        <w:t>učestvuje</w:t>
+      </w:r>
+      <w:r>
+        <w:rPr>
+          <w:b w:val="1"/>
+          <w:bCs w:val="1"/>
+          <w:lang w:val="en-US"/>
+        </w:rPr>
+        <w:t>:</w:t>
+      </w:r>
+    </w:p>
+    <w:p>
+      <w:pPr>
+        <w:pStyle w:val="Normal"/>
+      </w:pPr>
+    </w:p>
+    <w:p>
+      <w:pPr>
+        <w:pStyle w:val="Normal"/>
+        <w:rPr>
+          <w:color w:val="808080" w:themeColor="background1" w:themeTint="FF" w:themeShade="80"/>
+          <w:lang w:val="en-US"/>
+        </w:rPr>
+      </w:pPr>
+      <w:sdt>
+        <w:sdtPr>
+          <w:id w:val="21362756"/>
+          <w:text/>
+          <w:placeholder>
+            <w:docPart w:val="DefaultPlaceholder_-1854013440"/>
+          </w:placeholder>
+        </w:sdtPr>
+        <w:sdtContent>
+          <w:r>
+            <w:rPr>
+              <w:color w:val="808080" w:themeColor="background1" w:themeTint="FF" w:themeShade="80"/>
+              <w:lang w:val="en-US"/>
+            </w:rPr>
+            <w:t>Klasa</w:t>
+          </w:r>
+          <w:r>
+            <w:rPr>
+              <w:color w:val="808080" w:themeColor="background1" w:themeTint="FF" w:themeShade="80"/>
+              <w:lang w:val="en-US"/>
+            </w:rPr>
+            <w:t xml:space="preserve"> je </w:t>
+          </w:r>
+          <w:r>
+            <w:rPr>
+              <w:color w:val="808080" w:themeColor="background1" w:themeTint="FF" w:themeShade="80"/>
+              <w:lang w:val="en-US"/>
+            </w:rPr>
+            <w:t>jedna</w:t>
+          </w:r>
+          <w:r>
+            <w:rPr>
+              <w:color w:val="808080" w:themeColor="background1" w:themeTint="FF" w:themeShade="80"/>
+              <w:lang w:val="en-US"/>
+            </w:rPr>
+            <w:t xml:space="preserve"> od </w:t>
+          </w:r>
+          <w:r>
+            <w:rPr>
+              <w:color w:val="808080" w:themeColor="background1" w:themeTint="FF" w:themeShade="80"/>
+              <w:lang w:val="en-US"/>
+            </w:rPr>
+            <w:t>osnovnih</w:t>
+          </w:r>
+          <w:r>
+            <w:rPr>
+              <w:color w:val="808080" w:themeColor="background1" w:themeTint="FF" w:themeShade="80"/>
+              <w:lang w:val="en-US"/>
+            </w:rPr>
+            <w:t xml:space="preserve"> </w:t>
+          </w:r>
+          <w:r>
+            <w:rPr>
+              <w:color w:val="808080" w:themeColor="background1" w:themeTint="FF" w:themeShade="80"/>
+              <w:lang w:val="en-US"/>
+            </w:rPr>
+            <w:t>klasa</w:t>
+          </w:r>
+          <w:r>
+            <w:rPr>
+              <w:color w:val="808080" w:themeColor="background1" w:themeTint="FF" w:themeShade="80"/>
+              <w:lang w:val="en-US"/>
+            </w:rPr>
+            <w:t xml:space="preserve"> u </w:t>
+          </w:r>
+          <w:r>
+            <w:rPr>
+              <w:color w:val="808080" w:themeColor="background1" w:themeTint="FF" w:themeShade="80"/>
+              <w:lang w:val="en-US"/>
+            </w:rPr>
+            <w:t>sistemu</w:t>
+          </w:r>
+          <w:r>
+            <w:rPr>
+              <w:color w:val="808080" w:themeColor="background1" w:themeTint="FF" w:themeShade="80"/>
+              <w:lang w:val="en-US"/>
+            </w:rPr>
+            <w:t xml:space="preserve">, </w:t>
+          </w:r>
+          <w:r>
+            <w:rPr>
+              <w:color w:val="808080" w:themeColor="background1" w:themeTint="FF" w:themeShade="80"/>
+              <w:lang w:val="en-US"/>
+            </w:rPr>
+            <w:t>učestvuje</w:t>
+          </w:r>
+          <w:r>
+            <w:rPr>
+              <w:color w:val="808080" w:themeColor="background1" w:themeTint="FF" w:themeShade="80"/>
+              <w:lang w:val="en-US"/>
+            </w:rPr>
+            <w:t xml:space="preserve"> u </w:t>
+          </w:r>
+          <w:r>
+            <w:rPr>
+              <w:color w:val="808080" w:themeColor="background1" w:themeTint="FF" w:themeShade="80"/>
+              <w:lang w:val="en-US"/>
+            </w:rPr>
+            <w:t>svim</w:t>
+          </w:r>
+          <w:r>
+            <w:rPr>
+              <w:color w:val="808080" w:themeColor="background1" w:themeTint="FF" w:themeShade="80"/>
+              <w:lang w:val="en-US"/>
+            </w:rPr>
+            <w:t xml:space="preserve"> </w:t>
+          </w:r>
+          <w:r>
+            <w:rPr>
+              <w:color w:val="808080" w:themeColor="background1" w:themeTint="FF" w:themeShade="80"/>
+              <w:lang w:val="en-US"/>
+            </w:rPr>
+            <w:t>sinhronim</w:t>
+          </w:r>
+          <w:r>
+            <w:rPr>
+              <w:color w:val="808080" w:themeColor="background1" w:themeTint="FF" w:themeShade="80"/>
+              <w:lang w:val="en-US"/>
+            </w:rPr>
+            <w:t xml:space="preserve"> </w:t>
+          </w:r>
+          <w:r>
+            <w:rPr>
+              <w:color w:val="808080" w:themeColor="background1" w:themeTint="FF" w:themeShade="80"/>
+              <w:lang w:val="en-US"/>
+            </w:rPr>
+            <w:t>funkcionalnim</w:t>
+          </w:r>
+          <w:r>
+            <w:rPr>
+              <w:color w:val="808080" w:themeColor="background1" w:themeTint="FF" w:themeShade="80"/>
+              <w:lang w:val="en-US"/>
+            </w:rPr>
+            <w:t xml:space="preserve"> </w:t>
+          </w:r>
+          <w:r>
+            <w:rPr>
+              <w:color w:val="808080" w:themeColor="background1" w:themeTint="FF" w:themeShade="80"/>
+              <w:lang w:val="en-US"/>
+            </w:rPr>
+            <w:t>zahtjevima</w:t>
+          </w:r>
+          <w:r>
+            <w:rPr>
+              <w:color w:val="808080" w:themeColor="background1" w:themeTint="FF" w:themeShade="80"/>
+              <w:lang w:val="en-US"/>
+            </w:rPr>
+            <w:t xml:space="preserve"> u </w:t>
+          </w:r>
+          <w:r>
+            <w:rPr>
+              <w:color w:val="808080" w:themeColor="background1" w:themeTint="FF" w:themeShade="80"/>
+              <w:lang w:val="en-US"/>
+            </w:rPr>
+            <w:t>sistemu</w:t>
+          </w:r>
+        </w:sdtContent>
+      </w:sdt>
+    </w:p>
+    <w:p>
+      <w:pPr>
+        <w:pStyle w:val="Normal"/>
+      </w:pPr>
+    </w:p>
+    <w:p>
+      <w:pPr>
+        <w:pStyle w:val="Normal"/>
+        <w:rPr>
+          <w:b w:val="1"/>
+          <w:bCs w:val="1"/>
+          <w:lang w:val="en-US"/>
+        </w:rPr>
+      </w:pPr>
+      <w:r>
+        <w:rPr>
+          <w:b w:val="1"/>
+          <w:bCs w:val="1"/>
+          <w:lang w:val="en-US"/>
+        </w:rPr>
+        <w:t>Atributi</w:t>
+      </w:r>
+      <w:r>
+        <w:rPr>
+          <w:b w:val="1"/>
+          <w:bCs w:val="1"/>
+          <w:lang w:val="en-US"/>
+        </w:rPr>
+        <w:t xml:space="preserve"> </w:t>
+      </w:r>
+      <w:r>
+        <w:rPr>
+          <w:b w:val="1"/>
+          <w:bCs w:val="1"/>
+          <w:lang w:val="en-US"/>
+        </w:rPr>
+        <w:t>koje</w:t>
+      </w:r>
+      <w:r>
+        <w:rPr>
+          <w:b w:val="1"/>
+          <w:bCs w:val="1"/>
+          <w:lang w:val="en-US"/>
+        </w:rPr>
+        <w:t xml:space="preserve"> </w:t>
+      </w:r>
+      <w:r>
+        <w:rPr>
+          <w:b w:val="1"/>
+          <w:bCs w:val="1"/>
+          <w:lang w:val="en-US"/>
+        </w:rPr>
+        <w:t>klasa</w:t>
+      </w:r>
+      <w:r>
+        <w:rPr>
+          <w:b w:val="1"/>
+          <w:bCs w:val="1"/>
+          <w:lang w:val="en-US"/>
+        </w:rPr>
+        <w:t xml:space="preserve"> </w:t>
+      </w:r>
+      <w:r>
+        <w:rPr>
+          <w:b w:val="1"/>
+          <w:bCs w:val="1"/>
+          <w:lang w:val="en-US"/>
+        </w:rPr>
+        <w:t>posjeduje</w:t>
+      </w:r>
+      <w:r>
+        <w:rPr>
+          <w:b w:val="1"/>
+          <w:bCs w:val="1"/>
+          <w:lang w:val="en-US"/>
+        </w:rPr>
+        <w:t>:</w:t>
+      </w:r>
+    </w:p>
+    <w:p>
+      <w:pPr>
+        <w:pStyle w:val="Normal"/>
+      </w:pPr>
+    </w:p>
+    <w:tbl>
+      <w:tblPr>
+        <w:tblStyle w:val="TableGrid"/>
+        <w:tblW w:w="0" w:type="auto"/>
+        <w:jc w:val="start"/>
+        <w:tblInd w:w="0" w:type="dxa"/>
+        <w:tblLook w:val="04A0" w:firstRow="1" w:lastRow="0" w:firstColumn="1" w:lastColumn="0" w:noHBand="0" w:noVBand="1"/>
+      </w:tblPr>
+      <w:tblGrid>
+        <w:gridCol w:w="2784"/>
+        <w:gridCol w:w="2881"/>
+        <w:gridCol w:w="3690"/>
+      </w:tblGrid>
+      <w:tr>
+        <w:trPr>
+          <w:trHeight w:val="485"/>
+        </w:trPr>
+        <w:tc>
+          <w:tcPr>
+            <w:tcW w:w="2784" w:type="dxa"/>
+            <w:shd w:val="clear" w:color="auto" w:fill="B4C6E7" w:themeFill="accent1" w:themeFillTint="66"/>
+            <w:tcMar/>
+            <w:vAlign w:val="center"/>
+          </w:tcPr>
+          <w:p>
+            <w:pPr>
+              <w:pStyle w:val="Normal"/>
+              <w:widowControl w:val="1"/>
+              <w:spacing w:before="0" w:after="0"/>
+              <w:jc w:val="center"/>
+              <w:rPr>
+                <w:b w:val="1"/>
+                <w:bCs w:val="1"/>
+                <w:lang w:val="en-US"/>
+              </w:rPr>
+            </w:pPr>
+            <w:r>
+              <w:rPr>
+                <w:rFonts w:eastAsia="Calibri" w:cs=""/>
+                <w:b w:val="1"/>
+                <w:bCs w:val="1"/>
+                <w:lang w:val="en-US" w:eastAsia="en-US" w:bidi="ar-SA"/>
+              </w:rPr>
+              <w:t>Naziv</w:t>
+            </w:r>
+            <w:r>
+              <w:rPr>
+                <w:rFonts w:eastAsia="Calibri" w:cs=""/>
+                <w:b w:val="1"/>
+                <w:bCs w:val="1"/>
+                <w:lang w:val="en-US" w:eastAsia="en-US" w:bidi="ar-SA"/>
+              </w:rPr>
+              <w:t xml:space="preserve"> </w:t>
+            </w:r>
+            <w:r>
+              <w:rPr>
+                <w:rFonts w:eastAsia="Calibri" w:cs=""/>
+                <w:b w:val="1"/>
+                <w:bCs w:val="1"/>
+                <w:lang w:val="en-US" w:eastAsia="en-US" w:bidi="ar-SA"/>
+              </w:rPr>
+              <w:t>atributa</w:t>
+            </w:r>
+          </w:p>
+        </w:tc>
+        <w:tc>
+          <w:tcPr>
+            <w:tcW w:w="2881" w:type="dxa"/>
+            <w:shd w:val="clear" w:color="auto" w:fill="B4C6E7" w:themeFill="accent1" w:themeFillTint="66"/>
+            <w:tcMar/>
+            <w:vAlign w:val="center"/>
+          </w:tcPr>
+          <w:p>
+            <w:pPr>
+              <w:pStyle w:val="Normal"/>
+              <w:widowControl w:val="1"/>
+              <w:spacing w:before="0" w:after="0"/>
+              <w:jc w:val="center"/>
+              <w:rPr>
+                <w:b w:val="1"/>
+                <w:bCs w:val="1"/>
+                <w:lang w:val="en-US"/>
+              </w:rPr>
+            </w:pPr>
+            <w:r>
+              <w:rPr>
+                <w:rFonts w:eastAsia="Calibri" w:cs=""/>
+                <w:b w:val="1"/>
+                <w:bCs w:val="1"/>
+                <w:lang w:val="en-US" w:eastAsia="en-US" w:bidi="ar-SA"/>
+              </w:rPr>
+              <w:t xml:space="preserve">Tip </w:t>
+            </w:r>
+            <w:r>
+              <w:rPr>
+                <w:rFonts w:eastAsia="Calibri" w:cs=""/>
+                <w:b w:val="1"/>
+                <w:bCs w:val="1"/>
+                <w:lang w:val="en-US" w:eastAsia="en-US" w:bidi="ar-SA"/>
+              </w:rPr>
+              <w:t>varijable</w:t>
+            </w:r>
+          </w:p>
+        </w:tc>
+        <w:tc>
+          <w:tcPr>
+            <w:tcW w:w="3690" w:type="dxa"/>
+            <w:shd w:val="clear" w:color="auto" w:fill="B4C6E7" w:themeFill="accent1" w:themeFillTint="66"/>
+            <w:tcMar/>
+            <w:vAlign w:val="center"/>
+          </w:tcPr>
+          <w:p>
+            <w:pPr>
+              <w:pStyle w:val="Normal"/>
+              <w:widowControl w:val="1"/>
+              <w:spacing w:before="0" w:after="0"/>
+              <w:jc w:val="center"/>
+              <w:rPr>
+                <w:b w:val="1"/>
+                <w:bCs w:val="1"/>
+                <w:lang w:val="en-US"/>
+              </w:rPr>
+            </w:pPr>
+            <w:r>
+              <w:rPr>
+                <w:rFonts w:eastAsia="Calibri" w:cs=""/>
+                <w:b w:val="1"/>
+                <w:bCs w:val="1"/>
+                <w:lang w:val="en-US" w:eastAsia="en-US" w:bidi="ar-SA"/>
+              </w:rPr>
+              <w:t>Dodatne</w:t>
+            </w:r>
+            <w:r>
+              <w:rPr>
+                <w:rFonts w:eastAsia="Calibri" w:cs=""/>
+                <w:b w:val="1"/>
+                <w:bCs w:val="1"/>
+                <w:lang w:val="en-US" w:eastAsia="en-US" w:bidi="ar-SA"/>
+              </w:rPr>
+              <w:t xml:space="preserve"> </w:t>
+            </w:r>
+            <w:r>
+              <w:rPr>
+                <w:rFonts w:eastAsia="Calibri" w:cs=""/>
+                <w:b w:val="1"/>
+                <w:bCs w:val="1"/>
+                <w:lang w:val="en-US" w:eastAsia="en-US" w:bidi="ar-SA"/>
+              </w:rPr>
+              <w:t>napomene</w:t>
+            </w:r>
+          </w:p>
+        </w:tc>
+      </w:tr>
+      <w:tr>
+        <w:trPr>
+          <w:trHeight w:val="656"/>
+        </w:trPr>
+        <w:tc>
+          <w:tcPr>
+            <w:tcW w:w="2784" w:type="dxa"/>
+            <w:tcMar/>
+            <w:vAlign w:val="center"/>
+          </w:tcPr>
+          <w:p>
+            <w:pPr>
+              <w:pStyle w:val="Normal"/>
+              <w:widowControl w:val="1"/>
+              <w:spacing w:before="0" w:after="0"/>
+              <w:rPr>
+                <w:color w:val="808080" w:themeColor="background1" w:themeTint="FF" w:themeShade="80"/>
+                <w:lang w:val="en-US"/>
+              </w:rPr>
+            </w:pPr>
+            <w:sdt>
+              <w:sdtPr>
+                <w:id w:val="972601013"/>
+                <w:text/>
+                <w:placeholder>
+                  <w:docPart w:val="DefaultPlaceholder_-1854013440"/>
+                </w:placeholder>
+              </w:sdtPr>
+              <w:sdtContent>
+                <w:r>
+                  <w:rPr>
+                    <w:lang w:val="en-US"/>
+                  </w:rPr>
+                  <w:t>Broj</w:t>
+                </w:r>
+                <w:r>
+                  <w:rPr>
+                    <w:lang w:val="en-US"/>
+                  </w:rPr>
+                  <w:t xml:space="preserve"> </w:t>
+                </w:r>
+                <w:r>
+                  <w:rPr>
+                    <w:lang w:val="en-US"/>
+                  </w:rPr>
+                  <w:t>zaposlenih</w:t>
+                </w:r>
+              </w:sdtContent>
+            </w:sdt>
+          </w:p>
+        </w:tc>
+        <w:tc>
+          <w:tcPr>
+            <w:tcW w:w="2881" w:type="dxa"/>
+            <w:tcMar/>
+            <w:vAlign w:val="center"/>
+          </w:tcPr>
+          <w:p>
+            <w:pPr>
+              <w:pStyle w:val="Normal"/>
+              <w:widowControl w:val="1"/>
+              <w:spacing w:before="0" w:after="0"/>
+            </w:pPr>
+            <w:r>
+              <w:rPr>
+                <w:lang w:val="en-US"/>
+              </w:rPr>
+              <w:t xml:space="preserve">Tuple&lt;int, int&gt; (za </w:t>
+            </w:r>
+            <w:r>
+              <w:rPr>
+                <w:lang w:val="en-US"/>
+              </w:rPr>
+              <w:t>opseg</w:t>
+            </w:r>
+            <w:r>
+              <w:rPr>
+                <w:lang w:val="en-US"/>
+              </w:rPr>
+              <w:t>)</w:t>
+            </w:r>
+          </w:p>
+        </w:tc>
+        <w:tc>
+          <w:tcPr>
+            <w:tcW w:w="3690" w:type="dxa"/>
+            <w:tcMar/>
+            <w:vAlign w:val="center"/>
+          </w:tcPr>
+          <w:p>
+            <w:pPr>
+              <w:pStyle w:val="Normal"/>
+              <w:widowControl w:val="1"/>
+              <w:spacing w:before="0" w:after="0"/>
+              <w:rPr>
+                <w:rFonts w:eastAsia="Calibri" w:cs=""/>
+                <w:lang w:val="en-US" w:eastAsia="en-US" w:bidi="ar-SA"/>
+              </w:rPr>
+            </w:pPr>
+            <w:sdt>
+              <w:sdtPr>
+                <w:id w:val="1622661500"/>
+                <w14:checkbox>
+                  <w14:checked w14:val="0"/>
+                  <w14:checkedState w14:val="2612" w14:font="MS Gothic"/>
+                  <w14:uncheckedState w14:val="2610" w14:font="MS Gothic"/>
+                </w14:checkbox>
+              </w:sdtPr>
+              <w:sdtContent>
+                <w:r>
+                  <w:rPr>
+                    <w:rFonts w:ascii="MS Gothic" w:hAnsi="MS Gothic" w:eastAsia="MS Gothic" w:cs=""/>
+                    <w:lang w:val="en-US" w:eastAsia="en-US" w:bidi="ar-SA"/>
+                  </w:rPr>
+                  <w:t>☐</w:t>
+                </w:r>
+              </w:sdtContent>
+            </w:sdt>
+            <w:r>
+              <w:rPr>
+                <w:rFonts w:eastAsia="Calibri" w:cs=""/>
+                <w:lang w:val="en-US" w:eastAsia="en-US" w:bidi="ar-SA"/>
+              </w:rPr>
+              <w:t xml:space="preserve"> </w:t>
+            </w:r>
+            <w:r>
+              <w:rPr>
+                <w:rFonts w:eastAsia="Calibri" w:cs=""/>
+                <w:lang w:val="en-US" w:eastAsia="en-US" w:bidi="ar-SA"/>
+              </w:rPr>
+              <w:t>Atribut</w:t>
+            </w:r>
+            <w:r>
+              <w:rPr>
+                <w:rFonts w:eastAsia="Calibri" w:cs=""/>
+                <w:lang w:val="en-US" w:eastAsia="en-US" w:bidi="ar-SA"/>
+              </w:rPr>
+              <w:t xml:space="preserve"> je </w:t>
+            </w:r>
+            <w:r>
+              <w:rPr>
+                <w:rFonts w:eastAsia="Calibri" w:cs=""/>
+                <w:lang w:val="en-US" w:eastAsia="en-US" w:bidi="ar-SA"/>
+              </w:rPr>
+              <w:t>statički</w:t>
+            </w:r>
+          </w:p>
+          <w:p>
+            <w:pPr>
+              <w:pStyle w:val="Normal"/>
+              <w:widowControl w:val="1"/>
+              <w:spacing w:before="0" w:after="0"/>
+              <w:rPr>
+                <w:rFonts w:eastAsia="Calibri" w:cs=""/>
+                <w:lang w:val="en-US" w:eastAsia="en-US" w:bidi="ar-SA"/>
+              </w:rPr>
+            </w:pPr>
+            <w:sdt>
+              <w:sdtPr>
+                <w:id w:val="722576979"/>
+                <w14:checkbox>
+                  <w14:checked w14:val="0"/>
+                  <w14:checkedState w14:val="2612" w14:font="MS Gothic"/>
+                  <w14:uncheckedState w14:val="2610" w14:font="MS Gothic"/>
+                </w14:checkbox>
+              </w:sdtPr>
+              <w:sdtContent>
+                <w:r>
+                  <w:rPr>
+                    <w:rFonts w:ascii="MS Gothic" w:hAnsi="MS Gothic" w:eastAsia="MS Gothic" w:cs=""/>
+                    <w:lang w:val="en-US" w:eastAsia="en-US" w:bidi="ar-SA"/>
+                  </w:rPr>
+                  <w:t>☐</w:t>
+                </w:r>
+              </w:sdtContent>
+            </w:sdt>
+            <w:r>
+              <w:rPr>
+                <w:rFonts w:eastAsia="Calibri" w:cs=""/>
+                <w:lang w:val="en-US" w:eastAsia="en-US" w:bidi="ar-SA"/>
+              </w:rPr>
+              <w:t xml:space="preserve"> </w:t>
+            </w:r>
+            <w:r>
+              <w:rPr>
+                <w:rFonts w:eastAsia="Calibri" w:cs=""/>
+                <w:lang w:val="en-US" w:eastAsia="en-US" w:bidi="ar-SA"/>
+              </w:rPr>
+              <w:t>Atribut</w:t>
+            </w:r>
+            <w:r>
+              <w:rPr>
+                <w:rFonts w:eastAsia="Calibri" w:cs=""/>
+                <w:lang w:val="en-US" w:eastAsia="en-US" w:bidi="ar-SA"/>
+              </w:rPr>
+              <w:t xml:space="preserve"> je </w:t>
+            </w:r>
+            <w:r>
+              <w:rPr>
+                <w:rFonts w:eastAsia="Calibri" w:cs=""/>
+                <w:i w:val="1"/>
+                <w:iCs w:val="1"/>
+                <w:lang w:val="en-US" w:eastAsia="en-US" w:bidi="ar-SA"/>
+              </w:rPr>
+              <w:t>enumeration</w:t>
+            </w:r>
+          </w:p>
+        </w:tc>
+      </w:tr>
+    </w:tbl>
+    <w:p>
+      <w:pPr>
+        <w:rPr>
+          <w:lang w:val="en-US"/>
+        </w:rPr>
+      </w:pPr>
+      <w:r>
+        <w:rPr>
+          <w:lang w:val="en-US"/>
+        </w:rPr>
+        <w:t>Ostali</w:t>
+      </w:r>
+      <w:r>
+        <w:rPr>
+          <w:lang w:val="en-US"/>
+        </w:rPr>
+        <w:t xml:space="preserve"> </w:t>
+      </w:r>
+      <w:r>
+        <w:rPr>
+          <w:lang w:val="en-US"/>
+        </w:rPr>
+        <w:t>atributi</w:t>
+      </w:r>
+      <w:r>
+        <w:rPr>
+          <w:lang w:val="en-US"/>
+        </w:rPr>
+        <w:t xml:space="preserve"> </w:t>
+      </w:r>
+      <w:r>
+        <w:rPr>
+          <w:lang w:val="en-US"/>
+        </w:rPr>
+        <w:t>su</w:t>
+      </w:r>
+      <w:r>
+        <w:rPr>
+          <w:lang w:val="en-US"/>
+        </w:rPr>
+        <w:t xml:space="preserve"> </w:t>
+      </w:r>
+      <w:r>
+        <w:rPr>
+          <w:lang w:val="en-US"/>
+        </w:rPr>
+        <w:t>naslijeđeni</w:t>
+      </w:r>
+      <w:r>
+        <w:rPr>
+          <w:lang w:val="en-US"/>
+        </w:rPr>
+        <w:t xml:space="preserve"> </w:t>
+      </w:r>
+      <w:r>
+        <w:rPr>
+          <w:lang w:val="en-US"/>
+        </w:rPr>
+        <w:t>iz</w:t>
+      </w:r>
+      <w:r>
+        <w:rPr>
+          <w:lang w:val="en-US"/>
+        </w:rPr>
+        <w:t xml:space="preserve"> </w:t>
+      </w:r>
+      <w:r>
+        <w:rPr>
+          <w:lang w:val="en-US"/>
+        </w:rPr>
+        <w:t>klase</w:t>
+      </w:r>
+      <w:r>
+        <w:rPr>
+          <w:lang w:val="en-US"/>
+        </w:rPr>
+        <w:t xml:space="preserve"> Izvršilac usluge.</w:t>
+      </w:r>
+    </w:p>
+    <w:p/>
+    <w:p>
+      <w:pPr>
+        <w:pStyle w:val="Normal"/>
+      </w:pPr>
+    </w:p>
+    <w:p>
+      <w:pPr>
+        <w:pStyle w:val="Normal"/>
+      </w:pPr>
+    </w:p>
+    <w:p>
+      <w:pPr>
+        <w:pStyle w:val="Normal"/>
+      </w:pPr>
+      <w:r>
+        <w:rPr>
+          <w:b w:val="1"/>
+          <w:bCs w:val="1"/>
+          <w:lang w:val="en-US"/>
+        </w:rPr>
+        <w:t>Naziv</w:t>
+      </w:r>
+      <w:r>
+        <w:rPr>
+          <w:b w:val="1"/>
+          <w:bCs w:val="1"/>
+          <w:lang w:val="en-US"/>
+        </w:rPr>
+        <w:t xml:space="preserve"> </w:t>
+      </w:r>
+      <w:r>
+        <w:rPr>
+          <w:b w:val="1"/>
+          <w:bCs w:val="1"/>
+          <w:lang w:val="en-US"/>
+        </w:rPr>
+        <w:t>klase</w:t>
+      </w:r>
+      <w:r>
+        <w:rPr>
+          <w:b w:val="1"/>
+          <w:bCs w:val="1"/>
+          <w:lang w:val="en-US"/>
+        </w:rPr>
+        <w:t>:</w:t>
+      </w:r>
+      <w:r>
+        <w:rPr>
+          <w:lang w:val="en-US"/>
+        </w:rPr>
+        <w:t xml:space="preserve"> </w:t>
+      </w:r>
+      <w:sdt>
+        <w:sdtPr>
+          <w:id w:val="1085424403"/>
+          <w:showingPlcHdr/>
+          <w:placeholder>
+            <w:docPart w:val="DefaultPlaceholder_-1854013440"/>
+          </w:placeholder>
+        </w:sdtPr>
+        <w:sdtContent>
+          <w:r>
+            <w:rPr>
+              <w:rStyle w:val="PlaceholderText"/>
+              <w:lang w:val="en-US"/>
+            </w:rPr>
+            <w:t>Click or tap here to enter text.</w:t>
+          </w:r>
+        </w:sdtContent>
+      </w:sdt>
+    </w:p>
+    <w:p>
+      <w:pPr>
+        <w:pStyle w:val="Normal"/>
+      </w:pPr>
+    </w:p>
+    <w:p>
+      <w:pPr>
+        <w:pStyle w:val="Normal"/>
+        <w:rPr>
+          <w:b w:val="1"/>
+          <w:bCs w:val="1"/>
+          <w:lang w:val="en-US"/>
+        </w:rPr>
+      </w:pPr>
+      <w:r>
+        <w:rPr>
+          <w:b w:val="1"/>
+          <w:bCs w:val="1"/>
+          <w:lang w:val="en-US"/>
+        </w:rPr>
+        <w:t>Funkcionalni</w:t>
+      </w:r>
+      <w:r>
+        <w:rPr>
+          <w:b w:val="1"/>
+          <w:bCs w:val="1"/>
+          <w:lang w:val="en-US"/>
+        </w:rPr>
+        <w:t xml:space="preserve"> </w:t>
+      </w:r>
+      <w:r>
+        <w:rPr>
+          <w:b w:val="1"/>
+          <w:bCs w:val="1"/>
+          <w:lang w:val="en-US"/>
+        </w:rPr>
+        <w:t>zahtjevi</w:t>
+      </w:r>
+      <w:r>
+        <w:rPr>
+          <w:b w:val="1"/>
+          <w:bCs w:val="1"/>
+          <w:lang w:val="en-US"/>
+        </w:rPr>
+        <w:t xml:space="preserve"> u </w:t>
+      </w:r>
+      <w:r>
+        <w:rPr>
+          <w:b w:val="1"/>
+          <w:bCs w:val="1"/>
+          <w:lang w:val="en-US"/>
+        </w:rPr>
+        <w:t>kojima</w:t>
+      </w:r>
+      <w:r>
+        <w:rPr>
+          <w:b w:val="1"/>
+          <w:bCs w:val="1"/>
+          <w:lang w:val="en-US"/>
+        </w:rPr>
+        <w:t xml:space="preserve"> </w:t>
+      </w:r>
+      <w:r>
+        <w:rPr>
+          <w:b w:val="1"/>
+          <w:bCs w:val="1"/>
+          <w:lang w:val="en-US"/>
+        </w:rPr>
+        <w:t>klasa</w:t>
+      </w:r>
+      <w:r>
+        <w:rPr>
+          <w:b w:val="1"/>
+          <w:bCs w:val="1"/>
+          <w:lang w:val="en-US"/>
+        </w:rPr>
+        <w:t xml:space="preserve"> </w:t>
+      </w:r>
+      <w:r>
+        <w:rPr>
+          <w:b w:val="1"/>
+          <w:bCs w:val="1"/>
+          <w:lang w:val="en-US"/>
+        </w:rPr>
+        <w:t>učestvuje</w:t>
+      </w:r>
+      <w:r>
+        <w:rPr>
+          <w:b w:val="1"/>
+          <w:bCs w:val="1"/>
+          <w:lang w:val="en-US"/>
+        </w:rPr>
+        <w:t>:</w:t>
+      </w:r>
+    </w:p>
+    <w:p>
+      <w:pPr>
+        <w:pStyle w:val="Normal"/>
+      </w:pPr>
+    </w:p>
+    <w:p>
+      <w:pPr>
+        <w:pStyle w:val="Normal"/>
+        <w:rPr>
+          <w:color w:val="808080" w:themeColor="background1" w:themeTint="FF" w:themeShade="80"/>
+          <w:lang w:val="en-US"/>
+        </w:rPr>
+      </w:pPr>
+      <w:sdt>
+        <w:sdtPr>
+          <w:id w:val="1072511698"/>
+          <w:text/>
+          <w:placeholder>
+            <w:docPart w:val="DefaultPlaceholder_-1854013440"/>
+          </w:placeholder>
+        </w:sdtPr>
+        <w:sdtContent>
+          <w:r>
+            <w:rPr>
+              <w:color w:val="808080" w:themeColor="background1" w:themeTint="FF" w:themeShade="80"/>
+              <w:lang w:val="en-US"/>
+            </w:rPr>
+            <w:t xml:space="preserve">(FZ br. 00: </w:t>
+          </w:r>
+          <w:r>
+            <w:rPr>
+              <w:color w:val="808080" w:themeColor="background1" w:themeTint="FF" w:themeShade="80"/>
+              <w:lang w:val="en-US"/>
+            </w:rPr>
+            <w:t>ime</w:t>
+          </w:r>
+          <w:r>
+            <w:rPr>
+              <w:color w:val="808080" w:themeColor="background1" w:themeTint="FF" w:themeShade="80"/>
+              <w:lang w:val="en-US"/>
+            </w:rPr>
+            <w:t xml:space="preserve"> </w:t>
+          </w:r>
+          <w:r>
+            <w:rPr>
+              <w:color w:val="808080" w:themeColor="background1" w:themeTint="FF" w:themeShade="80"/>
+              <w:lang w:val="en-US"/>
+            </w:rPr>
+            <w:t>zahtjeva</w:t>
+          </w:r>
+          <w:r>
+            <w:rPr>
+              <w:color w:val="808080" w:themeColor="background1" w:themeTint="FF" w:themeShade="80"/>
+              <w:lang w:val="en-US"/>
+            </w:rPr>
+            <w:t>)</w:t>
+          </w:r>
+        </w:sdtContent>
+      </w:sdt>
+    </w:p>
+    <w:p>
+      <w:pPr>
+        <w:pStyle w:val="Normal"/>
+        <w:rPr>
+          <w:color w:val="808080" w:themeColor="background1" w:themeTint="FF" w:themeShade="80"/>
+          <w:lang w:val="en-US"/>
+        </w:rPr>
+      </w:pPr>
+      <w:sdt>
+        <w:sdtPr>
+          <w:id w:val="1874705876"/>
+          <w:placeholder>
+            <w:docPart w:val="D6645E316524405BBC5F921691E54EE6"/>
+          </w:placeholder>
+        </w:sdtPr>
+        <w:sdtContent>
+          <w:r>
+            <w:rPr>
+              <w:color w:val="808080" w:themeColor="background1" w:themeTint="FF" w:themeShade="80"/>
+              <w:lang w:val="en-US"/>
+            </w:rPr>
+            <w:t>(FZ br. 00:</w:t>
+          </w:r>
+        </w:sdtContent>
+      </w:sdt>
+      <w:r>
+        <w:rPr>
+          <w:color w:val="808080" w:themeColor="background1" w:themeTint="FF" w:themeShade="80"/>
+          <w:lang w:val="en-US"/>
+        </w:rPr>
+        <w:t xml:space="preserve"> </w:t>
+      </w:r>
+      <w:r>
+        <w:rPr>
+          <w:color w:val="808080" w:themeColor="background1" w:themeTint="FF" w:themeShade="80"/>
+          <w:lang w:val="en-US"/>
+        </w:rPr>
+        <w:t>ime</w:t>
+      </w:r>
+      <w:r>
+        <w:rPr>
+          <w:color w:val="808080" w:themeColor="background1" w:themeTint="FF" w:themeShade="80"/>
+          <w:lang w:val="en-US"/>
+        </w:rPr>
+        <w:t xml:space="preserve"> </w:t>
+      </w:r>
+      <w:r>
+        <w:rPr>
+          <w:color w:val="808080" w:themeColor="background1" w:themeTint="FF" w:themeShade="80"/>
+          <w:lang w:val="en-US"/>
+        </w:rPr>
+        <w:t>zahtjeva</w:t>
+      </w:r>
+      <w:r>
+        <w:rPr>
+          <w:color w:val="808080" w:themeColor="background1" w:themeTint="FF" w:themeShade="80"/>
+          <w:lang w:val="en-US"/>
+        </w:rPr>
+        <w:t>)</w:t>
+      </w:r>
+    </w:p>
+    <w:p>
+      <w:pPr>
+        <w:pStyle w:val="Normal"/>
+        <w:rPr>
+          <w:color w:val="808080" w:themeColor="background1" w:themeTint="FF" w:themeShade="80"/>
+          <w:lang w:val="en-US"/>
+        </w:rPr>
+      </w:pPr>
+      <w:sdt>
+        <w:sdtPr>
+          <w:id w:val="835176193"/>
+          <w:text/>
+          <w:placeholder>
+            <w:docPart w:val="F12481E4454B4928A625C1BF727C7FC8"/>
+          </w:placeholder>
+        </w:sdtPr>
+        <w:sdtContent>
+          <w:r>
+            <w:rPr>
+              <w:color w:val="808080" w:themeColor="background1" w:themeTint="FF" w:themeShade="80"/>
+              <w:lang w:val="en-US"/>
+            </w:rPr>
+            <w:t xml:space="preserve">(FZ br. 00: </w:t>
+          </w:r>
+          <w:r>
+            <w:rPr>
+              <w:color w:val="808080" w:themeColor="background1" w:themeTint="FF" w:themeShade="80"/>
+              <w:lang w:val="en-US"/>
+            </w:rPr>
+            <w:t>ime</w:t>
+          </w:r>
+          <w:r>
+            <w:rPr>
+              <w:color w:val="808080" w:themeColor="background1" w:themeTint="FF" w:themeShade="80"/>
+              <w:lang w:val="en-US"/>
+            </w:rPr>
+            <w:t xml:space="preserve"> </w:t>
+          </w:r>
+          <w:r>
+            <w:rPr>
+              <w:color w:val="808080" w:themeColor="background1" w:themeTint="FF" w:themeShade="80"/>
+              <w:lang w:val="en-US"/>
+            </w:rPr>
+            <w:t>zahtjeva</w:t>
+          </w:r>
+          <w:r>
+            <w:rPr>
+              <w:color w:val="808080" w:themeColor="background1" w:themeTint="FF" w:themeShade="80"/>
+              <w:lang w:val="en-US"/>
+            </w:rPr>
+            <w:t>)</w:t>
+          </w:r>
+        </w:sdtContent>
+      </w:sdt>
+    </w:p>
+    <w:p>
+      <w:pPr>
+        <w:pStyle w:val="Normal"/>
+      </w:pPr>
+      <w:sdt>
+        <w:sdtPr>
+          <w:id w:val="212442018"/>
+          <w:text/>
+          <w:placeholder>
+            <w:docPart w:val="94E3CD527B264B638F4B50B9CB974833"/>
+          </w:placeholder>
+        </w:sdtPr>
+        <w:sdtContent>
+          <w:r>
+            <w:rPr>
+              <w:color w:val="808080" w:themeColor="background1" w:themeTint="FF" w:themeShade="80"/>
+              <w:lang w:val="en-US"/>
+            </w:rPr>
+            <w:t xml:space="preserve">(FZ br. 00: </w:t>
+          </w:r>
+          <w:r>
+            <w:rPr>
+              <w:color w:val="808080" w:themeColor="background1" w:themeTint="FF" w:themeShade="80"/>
+              <w:lang w:val="en-US"/>
+            </w:rPr>
+            <w:t>ime</w:t>
+          </w:r>
+          <w:r>
+            <w:rPr>
+              <w:color w:val="808080" w:themeColor="background1" w:themeTint="FF" w:themeShade="80"/>
+              <w:lang w:val="en-US"/>
+            </w:rPr>
+            <w:t xml:space="preserve"> </w:t>
+          </w:r>
+          <w:r>
+            <w:rPr>
+              <w:color w:val="808080" w:themeColor="background1" w:themeTint="FF" w:themeShade="80"/>
+              <w:lang w:val="en-US"/>
+            </w:rPr>
+            <w:t>zahtjeva</w:t>
+          </w:r>
+          <w:r>
+            <w:rPr>
+              <w:color w:val="808080" w:themeColor="background1" w:themeTint="FF" w:themeShade="80"/>
+              <w:lang w:val="en-US"/>
+            </w:rPr>
+            <w:t>)</w:t>
+          </w:r>
+        </w:sdtContent>
+      </w:sdt>
+    </w:p>
+    <w:p>
+      <w:pPr>
+        <w:pStyle w:val="Normal"/>
+      </w:pPr>
+    </w:p>
+    <w:p>
+      <w:pPr>
+        <w:pStyle w:val="Normal"/>
+        <w:rPr>
+          <w:b w:val="1"/>
+          <w:bCs w:val="1"/>
+          <w:lang w:val="en-US"/>
+        </w:rPr>
+      </w:pPr>
+      <w:r>
+        <w:rPr>
+          <w:b w:val="1"/>
+          <w:bCs w:val="1"/>
+          <w:lang w:val="en-US"/>
+        </w:rPr>
+        <w:t>Atributi</w:t>
+      </w:r>
+      <w:r>
+        <w:rPr>
+          <w:b w:val="1"/>
+          <w:bCs w:val="1"/>
+          <w:lang w:val="en-US"/>
+        </w:rPr>
+        <w:t xml:space="preserve"> </w:t>
+      </w:r>
+      <w:r>
+        <w:rPr>
+          <w:b w:val="1"/>
+          <w:bCs w:val="1"/>
+          <w:lang w:val="en-US"/>
+        </w:rPr>
+        <w:t>koje</w:t>
+      </w:r>
+      <w:r>
+        <w:rPr>
+          <w:b w:val="1"/>
+          <w:bCs w:val="1"/>
+          <w:lang w:val="en-US"/>
+        </w:rPr>
+        <w:t xml:space="preserve"> </w:t>
+      </w:r>
+      <w:r>
+        <w:rPr>
+          <w:b w:val="1"/>
+          <w:bCs w:val="1"/>
+          <w:lang w:val="en-US"/>
+        </w:rPr>
+        <w:t>klasa</w:t>
+      </w:r>
+      <w:r>
+        <w:rPr>
+          <w:b w:val="1"/>
+          <w:bCs w:val="1"/>
+          <w:lang w:val="en-US"/>
+        </w:rPr>
+        <w:t xml:space="preserve"> </w:t>
+      </w:r>
+      <w:r>
+        <w:rPr>
+          <w:b w:val="1"/>
+          <w:bCs w:val="1"/>
+          <w:lang w:val="en-US"/>
+        </w:rPr>
+        <w:t>posjeduje</w:t>
+      </w:r>
+      <w:r>
+        <w:rPr>
+          <w:b w:val="1"/>
+          <w:bCs w:val="1"/>
+          <w:lang w:val="en-US"/>
+        </w:rPr>
+        <w:t>:</w:t>
+      </w:r>
+    </w:p>
+    <w:p>
+      <w:pPr>
+        <w:pStyle w:val="Normal"/>
+      </w:pPr>
+    </w:p>
+    <w:tbl>
+      <w:tblPr>
+        <w:tblStyle w:val="TableGrid"/>
+        <w:tblW w:w="0" w:type="auto"/>
+        <w:jc w:val="start"/>
+        <w:tblInd w:w="0" w:type="dxa"/>
+        <w:tblLook w:val="04A0" w:firstRow="1" w:lastRow="0" w:firstColumn="1" w:lastColumn="0" w:noHBand="0" w:noVBand="1"/>
+      </w:tblPr>
+      <w:tblGrid>
+        <w:gridCol w:w="2784"/>
+        <w:gridCol w:w="2881"/>
+        <w:gridCol w:w="3690"/>
+      </w:tblGrid>
+      <w:tr>
+        <w:trPr>
+          <w:trHeight w:val="485"/>
+        </w:trPr>
+        <w:tc>
+          <w:tcPr>
+            <w:tcW w:w="2784" w:type="dxa"/>
+            <w:shd w:val="clear" w:color="auto" w:fill="B4C6E7" w:themeFill="accent1" w:themeFillTint="66"/>
+            <w:tcMar/>
+            <w:vAlign w:val="center"/>
+          </w:tcPr>
+          <w:p>
+            <w:pPr>
+              <w:pStyle w:val="Normal"/>
+              <w:widowControl w:val="1"/>
+              <w:spacing w:before="0" w:after="0"/>
+              <w:jc w:val="center"/>
+              <w:rPr>
+                <w:b w:val="1"/>
+                <w:bCs w:val="1"/>
+                <w:lang w:val="en-US"/>
+              </w:rPr>
+            </w:pPr>
+            <w:r>
+              <w:rPr>
+                <w:rFonts w:eastAsia="Calibri" w:cs=""/>
+                <w:b w:val="1"/>
+                <w:bCs w:val="1"/>
+                <w:lang w:val="en-US" w:eastAsia="en-US" w:bidi="ar-SA"/>
+              </w:rPr>
+              <w:t>Naziv</w:t>
+            </w:r>
+            <w:r>
+              <w:rPr>
+                <w:rFonts w:eastAsia="Calibri" w:cs=""/>
+                <w:b w:val="1"/>
+                <w:bCs w:val="1"/>
+                <w:lang w:val="en-US" w:eastAsia="en-US" w:bidi="ar-SA"/>
+              </w:rPr>
+              <w:t xml:space="preserve"> </w:t>
+            </w:r>
+            <w:r>
+              <w:rPr>
+                <w:rFonts w:eastAsia="Calibri" w:cs=""/>
+                <w:b w:val="1"/>
+                <w:bCs w:val="1"/>
+                <w:lang w:val="en-US" w:eastAsia="en-US" w:bidi="ar-SA"/>
+              </w:rPr>
+              <w:t>atributa</w:t>
+            </w:r>
+          </w:p>
+        </w:tc>
+        <w:tc>
+          <w:tcPr>
+            <w:tcW w:w="2881" w:type="dxa"/>
+            <w:shd w:val="clear" w:color="auto" w:fill="B4C6E7" w:themeFill="accent1" w:themeFillTint="66"/>
+            <w:tcMar/>
+            <w:vAlign w:val="center"/>
+          </w:tcPr>
+          <w:p>
+            <w:pPr>
+              <w:pStyle w:val="Normal"/>
+              <w:widowControl w:val="1"/>
+              <w:spacing w:before="0" w:after="0"/>
+              <w:jc w:val="center"/>
+              <w:rPr>
+                <w:b w:val="1"/>
+                <w:bCs w:val="1"/>
+                <w:lang w:val="en-US"/>
+              </w:rPr>
+            </w:pPr>
+            <w:r>
+              <w:rPr>
+                <w:rFonts w:eastAsia="Calibri" w:cs=""/>
+                <w:b w:val="1"/>
+                <w:bCs w:val="1"/>
+                <w:lang w:val="en-US" w:eastAsia="en-US" w:bidi="ar-SA"/>
+              </w:rPr>
+              <w:t xml:space="preserve">Tip </w:t>
+            </w:r>
+            <w:r>
+              <w:rPr>
+                <w:rFonts w:eastAsia="Calibri" w:cs=""/>
+                <w:b w:val="1"/>
+                <w:bCs w:val="1"/>
+                <w:lang w:val="en-US" w:eastAsia="en-US" w:bidi="ar-SA"/>
+              </w:rPr>
+              <w:t>varijable</w:t>
+            </w:r>
+          </w:p>
+        </w:tc>
+        <w:tc>
+          <w:tcPr>
+            <w:tcW w:w="3690" w:type="dxa"/>
+            <w:shd w:val="clear" w:color="auto" w:fill="B4C6E7" w:themeFill="accent1" w:themeFillTint="66"/>
+            <w:tcMar/>
+            <w:vAlign w:val="center"/>
+          </w:tcPr>
+          <w:p>
+            <w:pPr>
+              <w:pStyle w:val="Normal"/>
+              <w:widowControl w:val="1"/>
+              <w:spacing w:before="0" w:after="0"/>
+              <w:jc w:val="center"/>
+              <w:rPr>
+                <w:b w:val="1"/>
+                <w:bCs w:val="1"/>
+                <w:lang w:val="en-US"/>
+              </w:rPr>
+            </w:pPr>
+            <w:r>
+              <w:rPr>
+                <w:rFonts w:eastAsia="Calibri" w:cs=""/>
+                <w:b w:val="1"/>
+                <w:bCs w:val="1"/>
+                <w:lang w:val="en-US" w:eastAsia="en-US" w:bidi="ar-SA"/>
+              </w:rPr>
+              <w:t>Dodatne</w:t>
+            </w:r>
+            <w:r>
+              <w:rPr>
+                <w:rFonts w:eastAsia="Calibri" w:cs=""/>
+                <w:b w:val="1"/>
+                <w:bCs w:val="1"/>
+                <w:lang w:val="en-US" w:eastAsia="en-US" w:bidi="ar-SA"/>
+              </w:rPr>
+              <w:t xml:space="preserve"> </w:t>
+            </w:r>
+            <w:r>
+              <w:rPr>
+                <w:rFonts w:eastAsia="Calibri" w:cs=""/>
+                <w:b w:val="1"/>
+                <w:bCs w:val="1"/>
+                <w:lang w:val="en-US" w:eastAsia="en-US" w:bidi="ar-SA"/>
+              </w:rPr>
+              <w:t>napomene</w:t>
+            </w:r>
+          </w:p>
+        </w:tc>
+      </w:tr>
+      <w:tr>
+        <w:trPr>
+          <w:trHeight w:val="656"/>
+        </w:trPr>
+        <w:tc>
+          <w:tcPr>
+            <w:tcW w:w="2784" w:type="dxa"/>
+            <w:tcMar/>
+            <w:vAlign w:val="center"/>
+          </w:tcPr>
+          <w:p>
+            <w:pPr>
+              <w:pStyle w:val="Normal"/>
+              <w:widowControl w:val="1"/>
+              <w:spacing w:before="0" w:after="0"/>
+              <w:rPr>
+                <w:color w:val="808080" w:themeColor="background1" w:themeTint="FF" w:themeShade="80"/>
+              </w:rPr>
+            </w:pPr>
+            <w:sdt>
+              <w:sdtPr>
+                <w:id w:val="1879576915"/>
+                <w:text/>
+                <w:showingPlcHdr/>
+                <w:placeholder>
+                  <w:docPart w:val="DefaultPlaceholder_-1854013440"/>
+                </w:placeholder>
+              </w:sdtPr>
+              <w:sdtContent>
+                <w:r>
+                  <w:rPr>
+                    <w:rStyle w:val="PlaceholderText"/>
+                    <w:rFonts w:eastAsia="Calibri" w:cs=""/>
+                    <w:lang w:eastAsia="en-US" w:bidi="ar-SA"/>
+                  </w:rPr>
+                  <w:t>Click or tap here to enter text.</w:t>
+                </w:r>
+              </w:sdtContent>
+            </w:sdt>
+          </w:p>
+        </w:tc>
+        <w:tc>
+          <w:tcPr>
+            <w:tcW w:w="2881" w:type="dxa"/>
+            <w:tcMar/>
+            <w:vAlign w:val="center"/>
+          </w:tcPr>
+          <w:p>
+            <w:pPr>
+              <w:pStyle w:val="Normal"/>
+              <w:widowControl w:val="1"/>
+              <w:spacing w:before="0" w:after="0"/>
+              <w:rPr>
+                <w:rFonts w:eastAsia="Calibri" w:cs=""/>
+                <w:lang w:eastAsia="en-US" w:bidi="ar-SA"/>
+              </w:rPr>
+            </w:pPr>
+            <w:sdt>
+              <w:sdtPr>
+                <w:id w:val="704637473"/>
+                <w:text/>
+                <w:showingPlcHdr/>
+                <w:placeholder>
+                  <w:docPart w:val="DefaultPlaceholder_-1854013440"/>
+                </w:placeholder>
+              </w:sdtPr>
+              <w:sdtContent>
+                <w:r>
+                  <w:rPr>
+                    <w:rStyle w:val="PlaceholderText"/>
+                    <w:rFonts w:eastAsia="Calibri" w:cs=""/>
+                    <w:lang w:eastAsia="en-US" w:bidi="ar-SA"/>
+                  </w:rPr>
+                  <w:t>Click or tap here to enter text.</w:t>
+                </w:r>
+              </w:sdtContent>
+            </w:sdt>
+          </w:p>
+        </w:tc>
+        <w:tc>
+          <w:tcPr>
+            <w:tcW w:w="3690" w:type="dxa"/>
+            <w:tcMar/>
+            <w:vAlign w:val="center"/>
+          </w:tcPr>
+          <w:p>
+            <w:pPr>
+              <w:pStyle w:val="Normal"/>
+              <w:widowControl w:val="1"/>
+              <w:spacing w:before="0" w:after="0"/>
+              <w:rPr>
+                <w:rFonts w:eastAsia="Calibri" w:cs=""/>
+                <w:lang w:val="en-US" w:eastAsia="en-US" w:bidi="ar-SA"/>
+              </w:rPr>
+            </w:pPr>
+            <w:sdt>
+              <w:sdtPr>
+                <w:id w:val="2130726933"/>
+                <w14:checkbox>
+                  <w14:checked w14:val="0"/>
+                  <w14:checkedState w14:val="2612" w14:font="MS Gothic"/>
+                  <w14:uncheckedState w14:val="2610" w14:font="MS Gothic"/>
+                </w14:checkbox>
+              </w:sdtPr>
+              <w:sdtContent>
+                <w:r>
+                  <w:rPr>
+                    <w:rFonts w:ascii="MS Gothic" w:hAnsi="MS Gothic" w:eastAsia="MS Gothic" w:cs=""/>
+                    <w:lang w:val="en-US" w:eastAsia="en-US" w:bidi="ar-SA"/>
+                  </w:rPr>
+                  <w:t>☐</w:t>
+                </w:r>
+              </w:sdtContent>
+            </w:sdt>
+            <w:r>
+              <w:rPr>
+                <w:rFonts w:eastAsia="Calibri" w:cs=""/>
+                <w:lang w:val="en-US" w:eastAsia="en-US" w:bidi="ar-SA"/>
+              </w:rPr>
+              <w:t xml:space="preserve"> </w:t>
+            </w:r>
+            <w:r>
+              <w:rPr>
+                <w:rFonts w:eastAsia="Calibri" w:cs=""/>
+                <w:lang w:val="en-US" w:eastAsia="en-US" w:bidi="ar-SA"/>
+              </w:rPr>
+              <w:t>Atribut</w:t>
+            </w:r>
+            <w:r>
+              <w:rPr>
+                <w:rFonts w:eastAsia="Calibri" w:cs=""/>
+                <w:lang w:val="en-US" w:eastAsia="en-US" w:bidi="ar-SA"/>
+              </w:rPr>
+              <w:t xml:space="preserve"> je </w:t>
+            </w:r>
+            <w:r>
+              <w:rPr>
+                <w:rFonts w:eastAsia="Calibri" w:cs=""/>
+                <w:lang w:val="en-US" w:eastAsia="en-US" w:bidi="ar-SA"/>
+              </w:rPr>
+              <w:t>statički</w:t>
+            </w:r>
+          </w:p>
+          <w:p>
+            <w:pPr>
+              <w:pStyle w:val="Normal"/>
+              <w:widowControl w:val="1"/>
+              <w:spacing w:before="0" w:after="0"/>
+              <w:rPr>
+                <w:rFonts w:eastAsia="Calibri" w:cs=""/>
+                <w:lang w:val="en-US" w:eastAsia="en-US" w:bidi="ar-SA"/>
+              </w:rPr>
+            </w:pPr>
+            <w:sdt>
+              <w:sdtPr>
+                <w:id w:val="1908280278"/>
+                <w14:checkbox>
+                  <w14:checked w14:val="0"/>
+                  <w14:checkedState w14:val="2612" w14:font="MS Gothic"/>
+                  <w14:uncheckedState w14:val="2610" w14:font="MS Gothic"/>
+                </w14:checkbox>
+              </w:sdtPr>
+              <w:sdtContent>
+                <w:r>
+                  <w:rPr>
+                    <w:rFonts w:ascii="MS Gothic" w:hAnsi="MS Gothic" w:eastAsia="MS Gothic" w:cs=""/>
+                    <w:lang w:val="en-US" w:eastAsia="en-US" w:bidi="ar-SA"/>
+                  </w:rPr>
+                  <w:t>☐</w:t>
+                </w:r>
+              </w:sdtContent>
+            </w:sdt>
+            <w:r>
+              <w:rPr>
+                <w:rFonts w:eastAsia="Calibri" w:cs=""/>
+                <w:lang w:val="en-US" w:eastAsia="en-US" w:bidi="ar-SA"/>
+              </w:rPr>
+              <w:t xml:space="preserve"> </w:t>
+            </w:r>
+            <w:r>
+              <w:rPr>
+                <w:rFonts w:eastAsia="Calibri" w:cs=""/>
+                <w:lang w:val="en-US" w:eastAsia="en-US" w:bidi="ar-SA"/>
+              </w:rPr>
+              <w:t>Atribut</w:t>
+            </w:r>
+            <w:r>
+              <w:rPr>
+                <w:rFonts w:eastAsia="Calibri" w:cs=""/>
+                <w:lang w:val="en-US" w:eastAsia="en-US" w:bidi="ar-SA"/>
+              </w:rPr>
+              <w:t xml:space="preserve"> je </w:t>
+            </w:r>
+            <w:r>
+              <w:rPr>
+                <w:rFonts w:eastAsia="Calibri" w:cs=""/>
+                <w:i w:val="1"/>
+                <w:iCs w:val="1"/>
+                <w:lang w:val="en-US" w:eastAsia="en-US" w:bidi="ar-SA"/>
+              </w:rPr>
+              <w:t>enumeration</w:t>
+            </w:r>
+          </w:p>
+        </w:tc>
+      </w:tr>
+      <w:tr>
+        <w:trPr>
+          <w:trHeight w:val="620"/>
+        </w:trPr>
+        <w:tc>
+          <w:tcPr>
+            <w:tcW w:w="2784" w:type="dxa"/>
+            <w:tcMar/>
+            <w:vAlign w:val="center"/>
+          </w:tcPr>
+          <w:p>
+            <w:pPr>
+              <w:pStyle w:val="Normal"/>
+              <w:widowControl w:val="1"/>
+              <w:spacing w:before="0" w:after="0"/>
+              <w:rPr>
+                <w:color w:val="808080" w:themeColor="background1" w:themeTint="FF" w:themeShade="80"/>
+              </w:rPr>
+            </w:pPr>
+            <w:sdt>
+              <w:sdtPr>
+                <w:id w:val="1536540008"/>
+                <w:text/>
+                <w:showingPlcHdr/>
+                <w:placeholder>
+                  <w:docPart w:val="F2D1D1F553E2427484AB313511E4103D"/>
+                </w:placeholder>
+              </w:sdtPr>
+              <w:sdtContent>
+                <w:r>
+                  <w:rPr>
+                    <w:rStyle w:val="PlaceholderText"/>
+                    <w:rFonts w:eastAsia="Calibri" w:cs=""/>
+                    <w:lang w:eastAsia="en-US" w:bidi="ar-SA"/>
+                  </w:rPr>
+                  <w:t>Click or tap here to enter text.</w:t>
+                </w:r>
+              </w:sdtContent>
+            </w:sdt>
+          </w:p>
+        </w:tc>
+        <w:tc>
+          <w:tcPr>
+            <w:tcW w:w="2881" w:type="dxa"/>
+            <w:tcMar/>
+            <w:vAlign w:val="center"/>
+          </w:tcPr>
+          <w:p>
+            <w:pPr>
+              <w:pStyle w:val="Normal"/>
+              <w:widowControl w:val="1"/>
+              <w:spacing w:before="0" w:after="0"/>
+              <w:rPr>
+                <w:rFonts w:eastAsia="Calibri" w:cs=""/>
+                <w:lang w:eastAsia="en-US" w:bidi="ar-SA"/>
+              </w:rPr>
+            </w:pPr>
+            <w:sdt>
+              <w:sdtPr>
+                <w:id w:val="379868523"/>
+                <w:text/>
+                <w:showingPlcHdr/>
+                <w:placeholder>
+                  <w:docPart w:val="859CA775230649159E429C021678BB95"/>
+                </w:placeholder>
+              </w:sdtPr>
+              <w:sdtContent>
+                <w:r>
+                  <w:rPr>
+                    <w:rStyle w:val="PlaceholderText"/>
+                    <w:rFonts w:eastAsia="Calibri" w:cs=""/>
+                    <w:lang w:eastAsia="en-US" w:bidi="ar-SA"/>
+                  </w:rPr>
+                  <w:t>Click or tap here to enter text.</w:t>
+                </w:r>
+              </w:sdtContent>
+            </w:sdt>
+          </w:p>
+        </w:tc>
+        <w:tc>
+          <w:tcPr>
+            <w:tcW w:w="3690" w:type="dxa"/>
+            <w:tcMar/>
+            <w:vAlign w:val="center"/>
+          </w:tcPr>
+          <w:p>
+            <w:pPr>
+              <w:pStyle w:val="Normal"/>
+              <w:widowControl w:val="1"/>
+              <w:spacing w:before="0" w:after="0"/>
+              <w:rPr>
+                <w:rFonts w:eastAsia="Calibri" w:cs=""/>
+                <w:lang w:val="en-US" w:eastAsia="en-US" w:bidi="ar-SA"/>
+              </w:rPr>
+            </w:pPr>
+            <w:sdt>
+              <w:sdtPr>
+                <w:id w:val="366112452"/>
+                <w14:checkbox>
+                  <w14:checked w14:val="0"/>
+                  <w14:checkedState w14:val="2612" w14:font="MS Gothic"/>
+                  <w14:uncheckedState w14:val="2610" w14:font="MS Gothic"/>
+                </w14:checkbox>
+              </w:sdtPr>
+              <w:sdtContent>
+                <w:r>
+                  <w:rPr>
+                    <w:rFonts w:ascii="MS Gothic" w:hAnsi="MS Gothic" w:eastAsia="MS Gothic" w:cs=""/>
+                    <w:lang w:val="en-US" w:eastAsia="en-US" w:bidi="ar-SA"/>
+                  </w:rPr>
+                  <w:t>☐</w:t>
+                </w:r>
+              </w:sdtContent>
+            </w:sdt>
+            <w:r>
+              <w:rPr>
+                <w:rFonts w:eastAsia="Calibri" w:cs=""/>
+                <w:lang w:val="en-US" w:eastAsia="en-US" w:bidi="ar-SA"/>
+              </w:rPr>
+              <w:t xml:space="preserve"> </w:t>
+            </w:r>
+            <w:r>
+              <w:rPr>
+                <w:rFonts w:eastAsia="Calibri" w:cs=""/>
+                <w:lang w:val="en-US" w:eastAsia="en-US" w:bidi="ar-SA"/>
+              </w:rPr>
+              <w:t>Atribut</w:t>
+            </w:r>
+            <w:r>
+              <w:rPr>
+                <w:rFonts w:eastAsia="Calibri" w:cs=""/>
+                <w:lang w:val="en-US" w:eastAsia="en-US" w:bidi="ar-SA"/>
+              </w:rPr>
+              <w:t xml:space="preserve"> je </w:t>
+            </w:r>
+            <w:r>
+              <w:rPr>
+                <w:rFonts w:eastAsia="Calibri" w:cs=""/>
+                <w:lang w:val="en-US" w:eastAsia="en-US" w:bidi="ar-SA"/>
+              </w:rPr>
+              <w:t>statički</w:t>
+            </w:r>
+          </w:p>
+          <w:p>
+            <w:pPr>
+              <w:pStyle w:val="Normal"/>
+              <w:widowControl w:val="1"/>
+              <w:spacing w:before="0" w:after="0"/>
+              <w:rPr>
+                <w:rFonts w:eastAsia="Calibri" w:cs=""/>
+                <w:lang w:val="en-US" w:eastAsia="en-US" w:bidi="ar-SA"/>
+              </w:rPr>
+            </w:pPr>
+            <w:sdt>
+              <w:sdtPr>
+                <w:id w:val="147874676"/>
+                <w14:checkbox>
+                  <w14:checked w14:val="0"/>
+                  <w14:checkedState w14:val="2612" w14:font="MS Gothic"/>
+                  <w14:uncheckedState w14:val="2610" w14:font="MS Gothic"/>
+                </w14:checkbox>
+              </w:sdtPr>
+              <w:sdtContent>
+                <w:r>
+                  <w:rPr>
+                    <w:rFonts w:ascii="MS Gothic" w:hAnsi="MS Gothic" w:eastAsia="MS Gothic" w:cs=""/>
+                    <w:lang w:val="en-US" w:eastAsia="en-US" w:bidi="ar-SA"/>
+                  </w:rPr>
+                  <w:t>☐</w:t>
+                </w:r>
+              </w:sdtContent>
+            </w:sdt>
+            <w:r>
+              <w:rPr>
+                <w:rFonts w:eastAsia="Calibri" w:cs=""/>
+                <w:lang w:val="en-US" w:eastAsia="en-US" w:bidi="ar-SA"/>
+              </w:rPr>
+              <w:t xml:space="preserve"> </w:t>
+            </w:r>
+            <w:r>
+              <w:rPr>
+                <w:rFonts w:eastAsia="Calibri" w:cs=""/>
+                <w:lang w:val="en-US" w:eastAsia="en-US" w:bidi="ar-SA"/>
+              </w:rPr>
+              <w:t>Atribut</w:t>
+            </w:r>
+            <w:r>
+              <w:rPr>
+                <w:rFonts w:eastAsia="Calibri" w:cs=""/>
+                <w:lang w:val="en-US" w:eastAsia="en-US" w:bidi="ar-SA"/>
+              </w:rPr>
+              <w:t xml:space="preserve"> je </w:t>
+            </w:r>
+            <w:r>
+              <w:rPr>
+                <w:rFonts w:eastAsia="Calibri" w:cs=""/>
+                <w:i w:val="1"/>
+                <w:iCs w:val="1"/>
+                <w:lang w:val="en-US" w:eastAsia="en-US" w:bidi="ar-SA"/>
+              </w:rPr>
+              <w:t>enumeration</w:t>
+            </w:r>
+          </w:p>
+        </w:tc>
+      </w:tr>
+      <w:tr>
+        <w:trPr>
+          <w:trHeight w:val="620"/>
+        </w:trPr>
+        <w:tc>
+          <w:tcPr>
+            <w:tcW w:w="2784" w:type="dxa"/>
+            <w:tcMar/>
+            <w:vAlign w:val="center"/>
+          </w:tcPr>
+          <w:p>
+            <w:pPr>
+              <w:pStyle w:val="Normal"/>
+              <w:widowControl w:val="1"/>
+              <w:spacing w:before="0" w:after="0"/>
+              <w:rPr>
+                <w:color w:val="808080" w:themeColor="background1" w:themeTint="FF" w:themeShade="80"/>
+              </w:rPr>
+            </w:pPr>
+            <w:sdt>
+              <w:sdtPr>
+                <w:id w:val="1926739385"/>
+                <w:text/>
+                <w:showingPlcHdr/>
+                <w:placeholder>
+                  <w:docPart w:val="D33A6C64E7C149A9BC6AA887CE9C3939"/>
+                </w:placeholder>
+              </w:sdtPr>
+              <w:sdtContent>
+                <w:r>
+                  <w:rPr>
+                    <w:rStyle w:val="PlaceholderText"/>
+                    <w:rFonts w:eastAsia="Calibri" w:cs=""/>
+                    <w:lang w:eastAsia="en-US" w:bidi="ar-SA"/>
+                  </w:rPr>
+                  <w:t>Click or tap here to enter text.</w:t>
+                </w:r>
+              </w:sdtContent>
+            </w:sdt>
+          </w:p>
+        </w:tc>
+        <w:tc>
+          <w:tcPr>
+            <w:tcW w:w="2881" w:type="dxa"/>
+            <w:tcMar/>
+            <w:vAlign w:val="center"/>
+          </w:tcPr>
+          <w:p>
+            <w:pPr>
+              <w:pStyle w:val="Normal"/>
+              <w:widowControl w:val="1"/>
+              <w:spacing w:before="0" w:after="0"/>
+              <w:rPr>
+                <w:rFonts w:eastAsia="Calibri" w:cs=""/>
+                <w:lang w:eastAsia="en-US" w:bidi="ar-SA"/>
+              </w:rPr>
+            </w:pPr>
+            <w:sdt>
+              <w:sdtPr>
+                <w:id w:val="257319210"/>
+                <w:text/>
+                <w:showingPlcHdr/>
+                <w:placeholder>
+                  <w:docPart w:val="46EA34C2CA924890B58AFA4B05A3CA82"/>
+                </w:placeholder>
+              </w:sdtPr>
+              <w:sdtContent>
+                <w:r>
+                  <w:rPr>
+                    <w:rStyle w:val="PlaceholderText"/>
+                    <w:rFonts w:eastAsia="Calibri" w:cs=""/>
+                    <w:lang w:eastAsia="en-US" w:bidi="ar-SA"/>
+                  </w:rPr>
+                  <w:t>Click or tap here to enter text.</w:t>
+                </w:r>
+              </w:sdtContent>
+            </w:sdt>
+          </w:p>
+        </w:tc>
+        <w:tc>
+          <w:tcPr>
+            <w:tcW w:w="3690" w:type="dxa"/>
+            <w:tcMar/>
+            <w:vAlign w:val="center"/>
+          </w:tcPr>
+          <w:p>
+            <w:pPr>
+              <w:pStyle w:val="Normal"/>
+              <w:widowControl w:val="1"/>
+              <w:spacing w:before="0" w:after="0"/>
+              <w:rPr>
+                <w:rFonts w:eastAsia="Calibri" w:cs=""/>
+                <w:lang w:val="en-US" w:eastAsia="en-US" w:bidi="ar-SA"/>
+              </w:rPr>
+            </w:pPr>
+            <w:sdt>
+              <w:sdtPr>
+                <w:id w:val="1917496627"/>
+                <w14:checkbox>
+                  <w14:checked w14:val="0"/>
+                  <w14:checkedState w14:val="2612" w14:font="MS Gothic"/>
+                  <w14:uncheckedState w14:val="2610" w14:font="MS Gothic"/>
+                </w14:checkbox>
+              </w:sdtPr>
+              <w:sdtContent>
+                <w:r>
+                  <w:rPr>
+                    <w:rFonts w:ascii="MS Gothic" w:hAnsi="MS Gothic" w:eastAsia="MS Gothic" w:cs=""/>
+                    <w:lang w:val="en-US" w:eastAsia="en-US" w:bidi="ar-SA"/>
+                  </w:rPr>
+                  <w:t>☐</w:t>
+                </w:r>
+              </w:sdtContent>
+            </w:sdt>
+            <w:r>
+              <w:rPr>
+                <w:rFonts w:eastAsia="Calibri" w:cs=""/>
+                <w:lang w:val="en-US" w:eastAsia="en-US" w:bidi="ar-SA"/>
+              </w:rPr>
+              <w:t xml:space="preserve"> </w:t>
+            </w:r>
+            <w:r>
+              <w:rPr>
+                <w:rFonts w:eastAsia="Calibri" w:cs=""/>
+                <w:lang w:val="en-US" w:eastAsia="en-US" w:bidi="ar-SA"/>
+              </w:rPr>
+              <w:t>Atribut</w:t>
+            </w:r>
+            <w:r>
+              <w:rPr>
+                <w:rFonts w:eastAsia="Calibri" w:cs=""/>
+                <w:lang w:val="en-US" w:eastAsia="en-US" w:bidi="ar-SA"/>
+              </w:rPr>
+              <w:t xml:space="preserve"> je </w:t>
+            </w:r>
+            <w:r>
+              <w:rPr>
+                <w:rFonts w:eastAsia="Calibri" w:cs=""/>
+                <w:lang w:val="en-US" w:eastAsia="en-US" w:bidi="ar-SA"/>
+              </w:rPr>
+              <w:t>statički</w:t>
+            </w:r>
+          </w:p>
+          <w:p>
+            <w:pPr>
+              <w:pStyle w:val="Normal"/>
+              <w:widowControl w:val="1"/>
+              <w:spacing w:before="0" w:after="0"/>
+              <w:rPr>
+                <w:rFonts w:eastAsia="Calibri" w:cs=""/>
+                <w:lang w:val="en-US" w:eastAsia="en-US" w:bidi="ar-SA"/>
+              </w:rPr>
+            </w:pPr>
+            <w:sdt>
+              <w:sdtPr>
+                <w:id w:val="577325733"/>
+                <w14:checkbox>
+                  <w14:checked w14:val="0"/>
+                  <w14:checkedState w14:val="2612" w14:font="MS Gothic"/>
+                  <w14:uncheckedState w14:val="2610" w14:font="MS Gothic"/>
+                </w14:checkbox>
+              </w:sdtPr>
+              <w:sdtContent>
+                <w:r>
+                  <w:rPr>
+                    <w:rFonts w:ascii="MS Gothic" w:hAnsi="MS Gothic" w:eastAsia="MS Gothic" w:cs=""/>
+                    <w:lang w:val="en-US" w:eastAsia="en-US" w:bidi="ar-SA"/>
+                  </w:rPr>
+                  <w:t>☐</w:t>
+                </w:r>
+              </w:sdtContent>
+            </w:sdt>
+            <w:r>
+              <w:rPr>
+                <w:rFonts w:eastAsia="Calibri" w:cs=""/>
+                <w:lang w:val="en-US" w:eastAsia="en-US" w:bidi="ar-SA"/>
+              </w:rPr>
+              <w:t xml:space="preserve"> </w:t>
+            </w:r>
+            <w:r>
+              <w:rPr>
+                <w:rFonts w:eastAsia="Calibri" w:cs=""/>
+                <w:lang w:val="en-US" w:eastAsia="en-US" w:bidi="ar-SA"/>
+              </w:rPr>
+              <w:t>Atribut</w:t>
+            </w:r>
+            <w:r>
+              <w:rPr>
+                <w:rFonts w:eastAsia="Calibri" w:cs=""/>
+                <w:lang w:val="en-US" w:eastAsia="en-US" w:bidi="ar-SA"/>
+              </w:rPr>
+              <w:t xml:space="preserve"> je </w:t>
+            </w:r>
+            <w:r>
+              <w:rPr>
+                <w:rFonts w:eastAsia="Calibri" w:cs=""/>
+                <w:i w:val="1"/>
+                <w:iCs w:val="1"/>
+                <w:lang w:val="en-US" w:eastAsia="en-US" w:bidi="ar-SA"/>
               </w:rPr>
               <w:t>enumeration</w:t>
             </w:r>
@@ -1180,46 +3911,94 @@
     <w:p>
       <w:pPr>
         <w:pStyle w:val="Normal"/>
-        <w:ind w:start="360"/>
-        <w:rPr>
-          <w:color w:themeColor="background1" w:themeShade="80" w:val="808080"/>
-        </w:rPr>
       </w:pPr>
-      <w:r>
-        <w:rPr>
-          <w:color w:themeColor="background1" w:themeShade="80" w:val="808080"/>
-        </w:rPr>
-      </w:r>
-    </w:p>
-    <w:p>
-      <w:pPr>
-        <w:pStyle w:val="Normal"/>
-        <w:ind w:start="360"/>
-        <w:rPr/>
-      </w:pPr>
-      <w:r>
-        <w:rPr/>
-      </w:r>
     </w:p>
     <w:sectPr>
       <w:headerReference w:type="even" r:id="rId2"/>
       <w:headerReference w:type="default" r:id="rId3"/>
       <w:headerReference w:type="first" r:id="rId4"/>
       <w:type w:val="nextPage"/>
-      <w:pgSz w:w="12240" w:h="15840"/>
-      <w:pgMar w:left="1440" w:right="1440" w:gutter="0" w:header="720" w:top="1440" w:footer="0" w:bottom="1440"/>
+      <w:pgSz w:w="12240" w:h="15840" w:orient="portrait"/>
+      <w:pgMar w:top="1440" w:right="1440" w:bottom="1440" w:left="1440" w:header="720" w:footer="0" w:gutter="0"/>
       <w:pgNumType w:fmt="decimal"/>
       <w:formProt w:val="false"/>
       <w:textDirection w:val="lrTb"/>
       <w:docGrid w:type="default" w:linePitch="360" w:charSpace="0"/>
+      <w:cols w:num="1"/>
+      <w:footerReference w:type="default" r:id="Redbc39530b944443"/>
     </w:sectPr>
   </w:body>
 </w:document>
 </file>
 
+<file path=word/footer.xml><?xml version="1.0" encoding="utf-8"?>
+<w:ftr xmlns:w14="http://schemas.microsoft.com/office/word/2010/wordml" xmlns:w="http://schemas.openxmlformats.org/wordprocessingml/2006/main">
+  <w:tbl>
+    <w:tblPr>
+      <w:tblStyle w:val="TableNormal"/>
+      <w:bidiVisual w:val="0"/>
+      <w:tblW w:w="0" w:type="auto"/>
+      <w:tblLook w:val="06A0" w:firstRow="1" w:lastRow="0" w:firstColumn="1" w:lastColumn="0" w:noHBand="1" w:noVBand="1"/>
+    </w:tblPr>
+    <w:tblGrid>
+      <w:gridCol w:w="3120"/>
+      <w:gridCol w:w="3120"/>
+      <w:gridCol w:w="3120"/>
+    </w:tblGrid>
+    <w:tr>
+      <w:trPr>
+        <w:trHeight w:val="300"/>
+      </w:trPr>
+      <w:tc>
+        <w:tcPr>
+          <w:tcW w:w="3120" w:type="dxa"/>
+          <w:tcMar/>
+        </w:tcPr>
+        <w:p>
+          <w:pPr>
+            <w:pStyle w:val="Header"/>
+            <w:bidi w:val="0"/>
+            <w:ind w:left="-115"/>
+            <w:jc w:val="left"/>
+          </w:pPr>
+        </w:p>
+      </w:tc>
+      <w:tc>
+        <w:tcPr>
+          <w:tcW w:w="3120" w:type="dxa"/>
+          <w:tcMar/>
+        </w:tcPr>
+        <w:p>
+          <w:pPr>
+            <w:pStyle w:val="Header"/>
+            <w:bidi w:val="0"/>
+            <w:jc w:val="center"/>
+          </w:pPr>
+        </w:p>
+      </w:tc>
+      <w:tc>
+        <w:tcPr>
+          <w:tcW w:w="3120" w:type="dxa"/>
+          <w:tcMar/>
+        </w:tcPr>
+        <w:p>
+          <w:pPr>
+            <w:pStyle w:val="Header"/>
+            <w:bidi w:val="0"/>
+            <w:ind w:right="-115"/>
+            <w:jc w:val="right"/>
+          </w:pPr>
+        </w:p>
+      </w:tc>
+    </w:tr>
+  </w:tbl>
+  <w:p/>
+</w:ftr>
+</file>
+
 <file path=word/header1.xml><?xml version="1.0" encoding="utf-8"?>
 <w:hdr xmlns:o="urn:schemas-microsoft-com:office:office" xmlns:r="http://schemas.openxmlformats.org/officeDocument/2006/relationships" xmlns:v="urn:schemas-microsoft-com:vml" xmlns:w="http://schemas.openxmlformats.org/wordprocessingml/2006/main" xmlns:w10="urn:schemas-microsoft-com:office:word" xmlns:wp="http://schemas.openxmlformats.org/drawingml/2006/wordprocessingDrawing" xmlns:pic="http://schemas.openxmlformats.org/drawingml/2006/picture" xmlns:wps="http://schemas.microsoft.com/office/word/2010/wordprocessingShape" xmlns:wpg="http://schemas.microsoft.com/office/word/2010/wordprocessingGroup" xmlns:mc="http://schemas.openxmlformats.org/markup-compatibility/2006" xmlns:wp14="http://schemas.microsoft.com/office/word/2010/wordprocessingDrawing" xmlns:w14="http://schemas.microsoft.com/office/word/2010/wordml" xmlns:w15="http://schemas.microsoft.com/office/word/2012/wordml" mc:Ignorable="w14 wp14 w15">
-  <w:p>
+  <w:p xmlns:wp14="http://schemas.microsoft.com/office/word/2010/wordml" wp14:textId="77777777">
     <w:pPr>
       <w:pStyle w:val="Header"/>
       <w:rPr/>
@@ -1232,13 +4011,13 @@
 </file>
 
 <file path=word/header2.xml><?xml version="1.0" encoding="utf-8"?>
-<w:hdr xmlns:o="urn:schemas-microsoft-com:office:office" xmlns:r="http://schemas.openxmlformats.org/officeDocument/2006/relationships" xmlns:v="urn:schemas-microsoft-com:vml" xmlns:w="http://schemas.openxmlformats.org/wordprocessingml/2006/main" xmlns:w10="urn:schemas-microsoft-com:office:word" xmlns:wp="http://schemas.openxmlformats.org/drawingml/2006/wordprocessingDrawing" xmlns:pic="http://schemas.openxmlformats.org/drawingml/2006/picture" xmlns:wps="http://schemas.microsoft.com/office/word/2010/wordprocessingShape" xmlns:wpg="http://schemas.microsoft.com/office/word/2010/wordprocessingGroup" xmlns:mc="http://schemas.openxmlformats.org/markup-compatibility/2006" xmlns:wp14="http://schemas.microsoft.com/office/word/2010/wordprocessingDrawing" xmlns:w14="http://schemas.microsoft.com/office/word/2010/wordml" xmlns:w15="http://schemas.microsoft.com/office/word/2012/wordml" mc:Ignorable="w14 wp14 w15">
-  <w:p>
+<w:hdr xmlns:o="urn:schemas-microsoft-com:office:office" xmlns:r="http://schemas.openxmlformats.org/officeDocument/2006/relationships" xmlns:v="urn:schemas-microsoft-com:vml" xmlns:w="http://schemas.openxmlformats.org/wordprocessingml/2006/main" xmlns:w10="urn:schemas-microsoft-com:office:word" xmlns:wp="http://schemas.openxmlformats.org/drawingml/2006/wordprocessingDrawing" xmlns:pic="http://schemas.openxmlformats.org/drawingml/2006/picture" xmlns:wps="http://schemas.microsoft.com/office/word/2010/wordprocessingShape" xmlns:wpg="http://schemas.microsoft.com/office/word/2010/wordprocessingGroup" xmlns:mc="http://schemas.openxmlformats.org/markup-compatibility/2006" xmlns:wp14="http://schemas.microsoft.com/office/word/2010/wordprocessingDrawing" xmlns:w14="http://schemas.microsoft.com/office/word/2010/wordml" xmlns:w15="http://schemas.microsoft.com/office/word/2012/wordml" xmlns:a="http://schemas.openxmlformats.org/drawingml/2006/main" mc:Ignorable="w14 wp14 w15">
+  <w:p xmlns:wp14="http://schemas.microsoft.com/office/word/2010/wordml" wp14:textId="77777777">
     <w:pPr>
       <w:pStyle w:val="Normal"/>
       <w:tabs>
         <w:tab w:val="clear" w:pos="720"/>
-        <w:tab w:val="left" w:pos="7340" w:leader="none"/>
+        <w:tab w:val="left" w:leader="none" w:pos="7340"/>
       </w:tabs>
       <w:rPr>
         <w:rFonts w:eastAsia="Calibri" w:cs="Times New Roman"/>
@@ -1249,7 +4028,7 @@
     </w:pPr>
     <w:r>
       <w:drawing>
-        <wp:anchor distT="0" distB="0" distL="0" distR="0" simplePos="0" relativeHeight="2" behindDoc="1" locked="0" layoutInCell="0" allowOverlap="1">
+        <wp:anchor xmlns:wp14="http://schemas.microsoft.com/office/word/2010/wordprocessingDrawing" distT="0" distB="0" distL="0" distR="0" simplePos="0" relativeHeight="2" behindDoc="1" locked="0" layoutInCell="0" allowOverlap="1" wp14:anchorId="01D3437D" wp14:editId="7777777">
           <wp:simplePos x="0" y="0"/>
           <wp:positionH relativeFrom="margin">
             <wp:posOffset>3576955</wp:posOffset>
@@ -1303,10 +4082,18 @@
         <w:szCs w:val="24"/>
       </w:rPr>
       <w:t>Univerzitet u Sarajevu</w:t>
+    </w:r>
+    <w:r>
+      <w:rPr>
+        <w:rFonts w:eastAsia="Calibri" w:cs="Times New Roman"/>
+        <w:i/>
+        <w:sz w:val="20"/>
+        <w:szCs w:val="24"/>
+      </w:rPr>
       <w:tab/>
     </w:r>
   </w:p>
-  <w:p>
+  <w:p xmlns:wp14="http://schemas.microsoft.com/office/word/2010/wordml" wp14:textId="77777777">
     <w:pPr>
       <w:pStyle w:val="Normal"/>
       <w:rPr>
@@ -1326,7 +4113,7 @@
       <w:t>Elektrotehnički Fakultet</w:t>
     </w:r>
   </w:p>
-  <w:p>
+  <w:p xmlns:wp14="http://schemas.microsoft.com/office/word/2010/wordml" wp14:textId="77777777">
     <w:pPr>
       <w:pStyle w:val="Normal"/>
       <w:rPr>
@@ -1344,15 +4131,63 @@
         <w:szCs w:val="24"/>
       </w:rPr>
       <w:t>Objektno Orijentisana Analiza i Dizajn</w:t>
+    </w:r>
+    <w:r>
+      <w:rPr>
+        <w:rFonts w:eastAsia="Calibri" w:cs="Times New Roman"/>
+        <w:i/>
+        <w:sz w:val="20"/>
+        <w:szCs w:val="24"/>
+      </w:rPr>
       <w:tab/>
+    </w:r>
+    <w:r>
+      <w:rPr>
+        <w:rFonts w:eastAsia="Calibri" w:cs="Times New Roman"/>
+        <w:i/>
+        <w:sz w:val="20"/>
+        <w:szCs w:val="24"/>
+      </w:rPr>
       <w:tab/>
+    </w:r>
+    <w:r>
+      <w:rPr>
+        <w:rFonts w:eastAsia="Calibri" w:cs="Times New Roman"/>
+        <w:i/>
+        <w:sz w:val="20"/>
+        <w:szCs w:val="24"/>
+      </w:rPr>
       <w:tab/>
+    </w:r>
+    <w:r>
+      <w:rPr>
+        <w:rFonts w:eastAsia="Calibri" w:cs="Times New Roman"/>
+        <w:i/>
+        <w:sz w:val="20"/>
+        <w:szCs w:val="24"/>
+      </w:rPr>
       <w:tab/>
+    </w:r>
+    <w:r>
+      <w:rPr>
+        <w:rFonts w:eastAsia="Calibri" w:cs="Times New Roman"/>
+        <w:i/>
+        <w:sz w:val="20"/>
+        <w:szCs w:val="24"/>
+      </w:rPr>
       <w:tab/>
+    </w:r>
+    <w:r>
+      <w:rPr>
+        <w:rFonts w:eastAsia="Calibri" w:cs="Times New Roman"/>
+        <w:i/>
+        <w:sz w:val="20"/>
+        <w:szCs w:val="24"/>
+      </w:rPr>
       <w:tab/>
     </w:r>
   </w:p>
-  <w:p>
+  <w:p xmlns:wp14="http://schemas.microsoft.com/office/word/2010/wordml" wp14:textId="77777777">
     <w:pPr>
       <w:pStyle w:val="Normal"/>
       <w:rPr>
@@ -1375,13 +4210,13 @@
 </file>
 
 <file path=word/header3.xml><?xml version="1.0" encoding="utf-8"?>
-<w:hdr xmlns:o="urn:schemas-microsoft-com:office:office" xmlns:r="http://schemas.openxmlformats.org/officeDocument/2006/relationships" xmlns:v="urn:schemas-microsoft-com:vml" xmlns:w="http://schemas.openxmlformats.org/wordprocessingml/2006/main" xmlns:w10="urn:schemas-microsoft-com:office:word" xmlns:wp="http://schemas.openxmlformats.org/drawingml/2006/wordprocessingDrawing" xmlns:pic="http://schemas.openxmlformats.org/drawingml/2006/picture" xmlns:wps="http://schemas.microsoft.com/office/word/2010/wordprocessingShape" xmlns:wpg="http://schemas.microsoft.com/office/word/2010/wordprocessingGroup" xmlns:mc="http://schemas.openxmlformats.org/markup-compatibility/2006" xmlns:wp14="http://schemas.microsoft.com/office/word/2010/wordprocessingDrawing" xmlns:w14="http://schemas.microsoft.com/office/word/2010/wordml" xmlns:w15="http://schemas.microsoft.com/office/word/2012/wordml" mc:Ignorable="w14 wp14 w15">
-  <w:p>
+<w:hdr xmlns:o="urn:schemas-microsoft-com:office:office" xmlns:r="http://schemas.openxmlformats.org/officeDocument/2006/relationships" xmlns:v="urn:schemas-microsoft-com:vml" xmlns:w="http://schemas.openxmlformats.org/wordprocessingml/2006/main" xmlns:w10="urn:schemas-microsoft-com:office:word" xmlns:wp="http://schemas.openxmlformats.org/drawingml/2006/wordprocessingDrawing" xmlns:pic="http://schemas.openxmlformats.org/drawingml/2006/picture" xmlns:wps="http://schemas.microsoft.com/office/word/2010/wordprocessingShape" xmlns:wpg="http://schemas.microsoft.com/office/word/2010/wordprocessingGroup" xmlns:mc="http://schemas.openxmlformats.org/markup-compatibility/2006" xmlns:wp14="http://schemas.microsoft.com/office/word/2010/wordprocessingDrawing" xmlns:w14="http://schemas.microsoft.com/office/word/2010/wordml" xmlns:w15="http://schemas.microsoft.com/office/word/2012/wordml" xmlns:a="http://schemas.openxmlformats.org/drawingml/2006/main" mc:Ignorable="w14 wp14 w15">
+  <w:p xmlns:wp14="http://schemas.microsoft.com/office/word/2010/wordml" wp14:textId="77777777">
     <w:pPr>
       <w:pStyle w:val="Normal"/>
       <w:tabs>
         <w:tab w:val="clear" w:pos="720"/>
-        <w:tab w:val="left" w:pos="7340" w:leader="none"/>
+        <w:tab w:val="left" w:leader="none" w:pos="7340"/>
       </w:tabs>
       <w:rPr>
         <w:rFonts w:eastAsia="Calibri" w:cs="Times New Roman"/>
@@ -1392,7 +4227,7 @@
     </w:pPr>
     <w:r>
       <w:drawing>
-        <wp:anchor distT="0" distB="0" distL="0" distR="0" simplePos="0" relativeHeight="2" behindDoc="1" locked="0" layoutInCell="0" allowOverlap="1">
+        <wp:anchor xmlns:wp14="http://schemas.microsoft.com/office/word/2010/wordprocessingDrawing" distT="0" distB="0" distL="0" distR="0" simplePos="0" relativeHeight="2" behindDoc="1" locked="0" layoutInCell="0" allowOverlap="1" wp14:anchorId="492887E6" wp14:editId="7777777">
           <wp:simplePos x="0" y="0"/>
           <wp:positionH relativeFrom="margin">
             <wp:posOffset>3576955</wp:posOffset>
@@ -1446,10 +4281,18 @@
         <w:szCs w:val="24"/>
       </w:rPr>
       <w:t>Univerzitet u Sarajevu</w:t>
+    </w:r>
+    <w:r>
+      <w:rPr>
+        <w:rFonts w:eastAsia="Calibri" w:cs="Times New Roman"/>
+        <w:i/>
+        <w:sz w:val="20"/>
+        <w:szCs w:val="24"/>
+      </w:rPr>
       <w:tab/>
     </w:r>
   </w:p>
-  <w:p>
+  <w:p xmlns:wp14="http://schemas.microsoft.com/office/word/2010/wordml" wp14:textId="77777777">
     <w:pPr>
       <w:pStyle w:val="Normal"/>
       <w:rPr>
@@ -1469,7 +4312,7 @@
       <w:t>Elektrotehnički Fakultet</w:t>
     </w:r>
   </w:p>
-  <w:p>
+  <w:p xmlns:wp14="http://schemas.microsoft.com/office/word/2010/wordml" wp14:textId="77777777">
     <w:pPr>
       <w:pStyle w:val="Normal"/>
       <w:rPr>
@@ -1487,15 +4330,63 @@
         <w:szCs w:val="24"/>
       </w:rPr>
       <w:t>Objektno Orijentisana Analiza i Dizajn</w:t>
+    </w:r>
+    <w:r>
+      <w:rPr>
+        <w:rFonts w:eastAsia="Calibri" w:cs="Times New Roman"/>
+        <w:i/>
+        <w:sz w:val="20"/>
+        <w:szCs w:val="24"/>
+      </w:rPr>
       <w:tab/>
+    </w:r>
+    <w:r>
+      <w:rPr>
+        <w:rFonts w:eastAsia="Calibri" w:cs="Times New Roman"/>
+        <w:i/>
+        <w:sz w:val="20"/>
+        <w:szCs w:val="24"/>
+      </w:rPr>
       <w:tab/>
+    </w:r>
+    <w:r>
+      <w:rPr>
+        <w:rFonts w:eastAsia="Calibri" w:cs="Times New Roman"/>
+        <w:i/>
+        <w:sz w:val="20"/>
+        <w:szCs w:val="24"/>
+      </w:rPr>
       <w:tab/>
+    </w:r>
+    <w:r>
+      <w:rPr>
+        <w:rFonts w:eastAsia="Calibri" w:cs="Times New Roman"/>
+        <w:i/>
+        <w:sz w:val="20"/>
+        <w:szCs w:val="24"/>
+      </w:rPr>
       <w:tab/>
+    </w:r>
+    <w:r>
+      <w:rPr>
+        <w:rFonts w:eastAsia="Calibri" w:cs="Times New Roman"/>
+        <w:i/>
+        <w:sz w:val="20"/>
+        <w:szCs w:val="24"/>
+      </w:rPr>
       <w:tab/>
+    </w:r>
+    <w:r>
+      <w:rPr>
+        <w:rFonts w:eastAsia="Calibri" w:cs="Times New Roman"/>
+        <w:i/>
+        <w:sz w:val="20"/>
+        <w:szCs w:val="24"/>
+      </w:rPr>
       <w:tab/>
     </w:r>
   </w:p>
-  <w:p>
+  <w:p xmlns:wp14="http://schemas.microsoft.com/office/word/2010/wordml" wp14:textId="77777777">
     <w:pPr>
       <w:pStyle w:val="Normal"/>
       <w:rPr>
@@ -1637,6 +4528,7 @@
       </w:pPr>
       <w:rPr/>
     </w:lvl>
+    <w:nsid w:val="5dd8b72"/>
   </w:abstractNum>
   <w:abstractNum w:abstractNumId="2">
     <w:lvl w:ilvl="0">
@@ -1756,6 +4648,7 @@
         <w:ind w:start="0" w:hanging="0"/>
       </w:pPr>
     </w:lvl>
+    <w:nsid w:val="8ce9830"/>
   </w:abstractNum>
   <w:num w:numId="1">
     <w:abstractNumId w:val="1"/>
@@ -1767,11 +4660,11 @@
 </file>
 
 <file path=word/styles.xml><?xml version="1.0" encoding="utf-8"?>
-<w:styles xmlns:w="http://schemas.openxmlformats.org/wordprocessingml/2006/main" xmlns:w14="http://schemas.microsoft.com/office/word/2010/wordml" xmlns:mc="http://schemas.openxmlformats.org/markup-compatibility/2006" mc:Ignorable="w14">
+<w:styles xmlns:wp14="http://schemas.microsoft.com/office/word/2010/wordprocessingDrawing" xmlns:w="http://schemas.openxmlformats.org/wordprocessingml/2006/main" xmlns:w14="http://schemas.microsoft.com/office/word/2010/wordml" xmlns:mc="http://schemas.openxmlformats.org/markup-compatibility/2006" mc:Ignorable="w14 wp14">
   <w:docDefaults>
     <w:rPrDefault>
       <w:rPr>
-        <w:rFonts w:ascii="Calibri" w:hAnsi="Calibri" w:eastAsia="Calibri" w:cs="" w:asciiTheme="minorHAnsi" w:cstheme="minorBidi" w:eastAsiaTheme="minorHAnsi" w:hAnsiTheme="minorHAnsi"/>
+        <w:rFonts w:ascii="Calibri" w:hAnsi="Calibri" w:eastAsia="Calibri" w:cs="" w:asciiTheme="minorHAnsi" w:hAnsiTheme="minorHAnsi" w:eastAsiaTheme="minorHAnsi" w:cstheme="minorBidi"/>
         <w:sz w:val="22"/>
         <w:szCs w:val="22"/>
         <w:lang w:val="en-US" w:eastAsia="en-US" w:bidi="ar-SA"/>
@@ -2168,11 +5061,11 @@
     <w:pPr>
       <w:widowControl/>
       <w:bidi w:val="0"/>
-      <w:spacing w:lineRule="auto" w:line="240" w:before="0" w:after="0"/>
+      <w:spacing w:before="0" w:after="0" w:line="240" w:lineRule="auto"/>
       <w:jc w:val="both"/>
     </w:pPr>
     <w:rPr>
-      <w:rFonts w:ascii="Times New Roman" w:hAnsi="Times New Roman" w:eastAsia="Calibri" w:cs="" w:cstheme="minorBidi" w:eastAsiaTheme="minorHAnsi"/>
+      <w:rFonts w:ascii="Times New Roman" w:hAnsi="Times New Roman" w:eastAsia="Calibri" w:cs="" w:eastAsiaTheme="minorHAnsi" w:cstheme="minorBidi"/>
       <w:color w:val="auto"/>
       <w:kern w:val="0"/>
       <w:sz w:val="24"/>
@@ -2195,7 +5088,7 @@
       <w:outlineLvl w:val="0"/>
     </w:pPr>
     <w:rPr>
-      <w:rFonts w:eastAsia="" w:cs="" w:cstheme="majorBidi" w:eastAsiaTheme="majorEastAsia"/>
+      <w:rFonts w:eastAsia="" w:cs="" w:eastAsiaTheme="majorEastAsia" w:cstheme="majorBidi"/>
       <w:b/>
       <w:sz w:val="32"/>
       <w:szCs w:val="32"/>
@@ -2220,9 +5113,9 @@
       <w:outlineLvl w:val="1"/>
     </w:pPr>
     <w:rPr>
-      <w:rFonts w:eastAsia="" w:cs="" w:cstheme="majorBidi" w:eastAsiaTheme="majorEastAsia"/>
+      <w:rFonts w:eastAsia="" w:cs="" w:eastAsiaTheme="majorEastAsia" w:cstheme="majorBidi"/>
       <w:b/>
-      <w:color w:themeColor="accent1" w:themeShade="bf" w:val="2F5496"/>
+      <w:color w:val="2F5496" w:themeColor="accent1" w:themeShade="bf"/>
       <w:sz w:val="26"/>
       <w:szCs w:val="26"/>
     </w:rPr>
@@ -2262,7 +5155,7 @@
     <w:qFormat/>
     <w:rsid w:val="003937c7"/>
     <w:rPr>
-      <w:rFonts w:ascii="Times New Roman" w:hAnsi="Times New Roman" w:eastAsia="" w:cs="" w:cstheme="majorBidi" w:eastAsiaTheme="majorEastAsia"/>
+      <w:rFonts w:ascii="Times New Roman" w:hAnsi="Times New Roman" w:eastAsia="" w:cs="" w:eastAsiaTheme="majorEastAsia" w:cstheme="majorBidi"/>
       <w:b/>
       <w:sz w:val="32"/>
       <w:szCs w:val="32"/>
@@ -2276,9 +5169,9 @@
     <w:qFormat/>
     <w:rsid w:val="003937c7"/>
     <w:rPr>
-      <w:rFonts w:ascii="Times New Roman" w:hAnsi="Times New Roman" w:eastAsia="" w:cs="" w:cstheme="majorBidi" w:eastAsiaTheme="majorEastAsia"/>
+      <w:rFonts w:ascii="Times New Roman" w:hAnsi="Times New Roman" w:eastAsia="" w:cs="" w:eastAsiaTheme="majorEastAsia" w:cstheme="majorBidi"/>
       <w:b/>
-      <w:color w:themeColor="accent1" w:themeShade="bf" w:val="2F5496"/>
+      <w:color w:val="2F5496" w:themeColor="accent1" w:themeShade="bf"/>
       <w:sz w:val="26"/>
       <w:szCs w:val="26"/>
       <w:lang w:val="bs-BA"/>
@@ -2296,7 +5189,7 @@
     </w:rPr>
   </w:style>
   <w:style w:type="character" w:styleId="CommentReference">
-    <w:name w:val="annotation reference"/>
+    <w:name w:val="Comment Reference"/>
     <w:basedOn w:val="DefaultParagraphFont"/>
     <w:uiPriority w:val="99"/>
     <w:semiHidden/>
@@ -2373,7 +5266,7 @@
     <w:name w:val="Body Text"/>
     <w:basedOn w:val="Normal"/>
     <w:pPr>
-      <w:spacing w:lineRule="auto" w:line="276" w:before="0" w:after="140"/>
+      <w:spacing w:before="0" w:after="140" w:line="276" w:lineRule="auto"/>
     </w:pPr>
     <w:rPr/>
   </w:style>
@@ -2429,8 +5322,8 @@
     <w:pPr>
       <w:tabs>
         <w:tab w:val="clear" w:pos="720"/>
-        <w:tab w:val="center" w:pos="4680" w:leader="none"/>
-        <w:tab w:val="right" w:pos="9360" w:leader="none"/>
+        <w:tab w:val="center" w:leader="none" w:pos="4680"/>
+        <w:tab w:val="right" w:leader="none" w:pos="9360"/>
       </w:tabs>
     </w:pPr>
     <w:rPr/>
@@ -2445,8 +5338,8 @@
     <w:pPr>
       <w:tabs>
         <w:tab w:val="clear" w:pos="720"/>
-        <w:tab w:val="center" w:pos="4680" w:leader="none"/>
-        <w:tab w:val="right" w:pos="9360" w:leader="none"/>
+        <w:tab w:val="center" w:leader="none" w:pos="4680"/>
+        <w:tab w:val="right" w:leader="none" w:pos="9360"/>
       </w:tabs>
     </w:pPr>
     <w:rPr/>
@@ -2465,7 +5358,7 @@
     <w:rPr/>
   </w:style>
   <w:style w:type="paragraph" w:styleId="CommentText">
-    <w:name w:val="annotation text"/>
+    <w:name w:val="Comment Text"/>
     <w:basedOn w:val="Normal"/>
     <w:link w:val="CommentTextChar"/>
     <w:uiPriority w:val="99"/>
@@ -2517,7 +5410,7 @@
     <w:unhideWhenUsed/>
     <w:qFormat/>
   </w:style>
-  <w:style w:type="table" w:default="1" w:styleId="TableNormal">
+  <w:style w:type="table" w:styleId="TableNormal" w:default="1">
     <w:name w:val="Normal Table"/>
     <w:uiPriority w:val="99"/>
     <w:semiHidden/>
@@ -2572,7 +5465,7 @@
         <w:guid w:val="{DFA8E756-5DFC-455C-B35D-F9FB0AC37C77}"/>
       </w:docPartPr>
       <w:docPartBody>
-        <w:p>
+        <w:p xmlns:wp14="http://schemas.microsoft.com/office/word/2010/wordml" wp14:textId="77777777">
           <w:r>
             <w:rPr>
               <w:rStyle w:val="PlaceholderText"/>
@@ -2598,7 +5491,7 @@
         <w:guid w:val="{D38425FA-F199-4437-9C8C-A90CB76EBC2C}"/>
       </w:docPartPr>
       <w:docPartBody>
-        <w:p>
+        <w:p xmlns:wp14="http://schemas.microsoft.com/office/word/2010/wordml" wp14:textId="77777777">
           <w:r>
             <w:rPr>
               <w:rStyle w:val="PlaceholderText"/>
@@ -2624,7 +5517,7 @@
         <w:guid w:val="{30CFB602-DE09-483F-9574-CB60D6745F73}"/>
       </w:docPartPr>
       <w:docPartBody>
-        <w:p>
+        <w:p xmlns:wp14="http://schemas.microsoft.com/office/word/2010/wordml" wp14:textId="77777777">
           <w:pPr>
             <w:pStyle w:val="021821D5AEF74DE3972B43FA6194F472"/>
           </w:pPr>
@@ -2653,7 +5546,7 @@
         <w:guid w:val="{200013BF-8EE5-45B2-9E57-784DA8671562}"/>
       </w:docPartPr>
       <w:docPartBody>
-        <w:p>
+        <w:p xmlns:wp14="http://schemas.microsoft.com/office/word/2010/wordml" wp14:textId="77777777">
           <w:pPr>
             <w:pStyle w:val="440469B8E10A4A618A0A27CA6EF19BDA"/>
           </w:pPr>
@@ -2682,7 +5575,7 @@
         <w:guid w:val="{4DA852A6-C21E-4DB5-8EB0-1285FD869201}"/>
       </w:docPartPr>
       <w:docPartBody>
-        <w:p>
+        <w:p xmlns:wp14="http://schemas.microsoft.com/office/word/2010/wordml" wp14:textId="77777777">
           <w:pPr>
             <w:pStyle w:val="B6B2609B320B40ADB82043B3C2C67C34"/>
           </w:pPr>
@@ -2711,7 +5604,7 @@
         <w:guid w:val="{DD8258C8-0A29-44B1-A5BC-CC277C152595}"/>
       </w:docPartPr>
       <w:docPartBody>
-        <w:p>
+        <w:p xmlns:wp14="http://schemas.microsoft.com/office/word/2010/wordml" wp14:textId="77777777">
           <w:pPr>
             <w:pStyle w:val="421C392839F44DAFABE6804C8631FABF"/>
           </w:pPr>
@@ -2740,7 +5633,7 @@
         <w:guid w:val="{2080C184-6AD3-45D5-AF3F-25BB69DF86CD}"/>
       </w:docPartPr>
       <w:docPartBody>
-        <w:p>
+        <w:p xmlns:wp14="http://schemas.microsoft.com/office/word/2010/wordml" wp14:textId="77777777">
           <w:pPr>
             <w:pStyle w:val="40ACC63148EF487894D614C289209618"/>
           </w:pPr>
@@ -2769,67 +5662,9 @@
         <w:guid w:val="{62E532D6-E4F0-45DB-BEBE-E2EE134912AA}"/>
       </w:docPartPr>
       <w:docPartBody>
-        <w:p>
+        <w:p xmlns:wp14="http://schemas.microsoft.com/office/word/2010/wordml" wp14:textId="77777777">
           <w:pPr>
             <w:pStyle w:val="1A40F1017E144D75B08851CD2C9852BC"/>
-          </w:pPr>
-          <w:r>
-            <w:rPr>
-              <w:rStyle w:val="PlaceholderText"/>
-            </w:rPr>
-            <w:t>Click or tap here to enter text.</w:t>
-          </w:r>
-        </w:p>
-      </w:docPartBody>
-    </w:docPart>
-    <w:docPart>
-      <w:docPartPr>
-        <w:name w:val="A96875FC97F74B8FAD11C312455D2F67"/>
-        <w:category>
-          <w:name w:val="General"/>
-          <w:gallery w:val="placeholder"/>
-        </w:category>
-        <w:types>
-          <w:type w:val="bbPlcHdr"/>
-        </w:types>
-        <w:behaviors>
-          <w:behavior w:val="content"/>
-        </w:behaviors>
-        <w:guid w:val="{649DD356-69E2-44C2-86A5-3A183B9C906D}"/>
-      </w:docPartPr>
-      <w:docPartBody>
-        <w:p>
-          <w:pPr>
-            <w:pStyle w:val="A96875FC97F74B8FAD11C312455D2F67"/>
-          </w:pPr>
-          <w:r>
-            <w:rPr>
-              <w:rStyle w:val="PlaceholderText"/>
-            </w:rPr>
-            <w:t>Click or tap here to enter text.</w:t>
-          </w:r>
-        </w:p>
-      </w:docPartBody>
-    </w:docPart>
-    <w:docPart>
-      <w:docPartPr>
-        <w:name w:val="17BB0B458448487BAF86FF4D71D77155"/>
-        <w:category>
-          <w:name w:val="General"/>
-          <w:gallery w:val="placeholder"/>
-        </w:category>
-        <w:types>
-          <w:type w:val="bbPlcHdr"/>
-        </w:types>
-        <w:behaviors>
-          <w:behavior w:val="content"/>
-        </w:behaviors>
-        <w:guid w:val="{47BF9863-E15B-4753-970C-93AE04CFE34B}"/>
-      </w:docPartPr>
-      <w:docPartBody>
-        <w:p>
-          <w:pPr>
-            <w:pStyle w:val="17BB0B458448487BAF86FF4D71D77155"/>
           </w:pPr>
           <w:r>
             <w:rPr>
@@ -2856,7 +5691,7 @@
         <w:guid w:val="{1ABEFE55-9F16-49A0-9DB6-8724F12BB0C9}"/>
       </w:docPartPr>
       <w:docPartBody>
-        <w:p>
+        <w:p xmlns:wp14="http://schemas.microsoft.com/office/word/2010/wordml" wp14:textId="77777777">
           <w:pPr>
             <w:pStyle w:val="1DBD399E82384932B9FDB3EA2E42BF7D"/>
           </w:pPr>
@@ -2885,7 +5720,7 @@
         <w:guid w:val="{59C10CD3-ADC7-46DE-8EB2-61980345A7E1}"/>
       </w:docPartPr>
       <w:docPartBody>
-        <w:p>
+        <w:p xmlns:wp14="http://schemas.microsoft.com/office/word/2010/wordml" wp14:textId="77777777">
           <w:pPr>
             <w:pStyle w:val="2EDC99A93FEE47B49DCF088F164479C6"/>
           </w:pPr>
@@ -2914,7 +5749,7 @@
         <w:guid w:val="{0A2FAF33-E622-4115-9410-60D17D5CD658}"/>
       </w:docPartPr>
       <w:docPartBody>
-        <w:p>
+        <w:p xmlns:wp14="http://schemas.microsoft.com/office/word/2010/wordml" wp14:textId="77777777">
           <w:pPr>
             <w:pStyle w:val="87EED9B8214649D4B941FF036A363880"/>
           </w:pPr>
@@ -2943,10 +5778,192 @@
         <w:guid w:val="{873916AA-34B3-4070-9F8E-A44C4F52B387}"/>
       </w:docPartPr>
       <w:docPartBody>
-        <w:p>
+        <w:p xmlns:wp14="http://schemas.microsoft.com/office/word/2010/wordml" wp14:textId="77777777">
           <w:pPr>
             <w:pStyle w:val="90DE4D15E6DF44C6848B08242714CB36"/>
           </w:pPr>
+          <w:r>
+            <w:rPr>
+              <w:rStyle w:val="PlaceholderText"/>
+            </w:rPr>
+            <w:t>Click or tap here to enter text.</w:t>
+          </w:r>
+        </w:p>
+      </w:docPartBody>
+    </w:docPart>
+    <w:docPart>
+      <w:docPartPr>
+        <w:name w:val="D6645E316524405BBC5F921691E54EE6"/>
+        <w:category>
+          <w:name w:val="General"/>
+          <w:gallery w:val="placeholder"/>
+        </w:category>
+        <w:types>
+          <w:type w:val="bbPlcHdr"/>
+        </w:types>
+        <w:behaviors>
+          <w:behavior w:val="content"/>
+        </w:behaviors>
+        <w:guid w:val="{97C0C4FC-54F5-4D98-816E-3F1AC3B84DCC}"/>
+      </w:docPartPr>
+      <w:docPartBody>
+        <w:p>
+          <w:r>
+            <w:rPr>
+              <w:rStyle w:val="PlaceholderText"/>
+            </w:rPr>
+            <w:t>Click or tap here to enter text.</w:t>
+          </w:r>
+        </w:p>
+      </w:docPartBody>
+    </w:docPart>
+    <w:docPart>
+      <w:docPartPr>
+        <w:name w:val="F12481E4454B4928A625C1BF727C7FC8"/>
+        <w:category>
+          <w:name w:val="General"/>
+          <w:gallery w:val="placeholder"/>
+        </w:category>
+        <w:types>
+          <w:type w:val="bbPlcHdr"/>
+        </w:types>
+        <w:behaviors>
+          <w:behavior w:val="content"/>
+        </w:behaviors>
+        <w:guid w:val="{BA3561A7-54D6-47B5-81A2-7F501F494891}"/>
+      </w:docPartPr>
+      <w:docPartBody>
+        <w:p>
+          <w:r>
+            <w:rPr>
+              <w:rStyle w:val="PlaceholderText"/>
+            </w:rPr>
+            <w:t>Click or tap here to enter text.</w:t>
+          </w:r>
+        </w:p>
+      </w:docPartBody>
+    </w:docPart>
+    <w:docPart>
+      <w:docPartPr>
+        <w:name w:val="94E3CD527B264B638F4B50B9CB974833"/>
+        <w:category>
+          <w:name w:val="General"/>
+          <w:gallery w:val="placeholder"/>
+        </w:category>
+        <w:types>
+          <w:type w:val="bbPlcHdr"/>
+        </w:types>
+        <w:behaviors>
+          <w:behavior w:val="content"/>
+        </w:behaviors>
+        <w:guid w:val="{3740CA6A-1EA7-432B-9AE4-9F2DAD06D74F}"/>
+      </w:docPartPr>
+      <w:docPartBody>
+        <w:p>
+          <w:r>
+            <w:rPr>
+              <w:rStyle w:val="PlaceholderText"/>
+            </w:rPr>
+            <w:t>Click or tap here to enter text.</w:t>
+          </w:r>
+        </w:p>
+      </w:docPartBody>
+    </w:docPart>
+    <w:docPart>
+      <w:docPartPr>
+        <w:name w:val="F2D1D1F553E2427484AB313511E4103D"/>
+        <w:category>
+          <w:name w:val="General"/>
+          <w:gallery w:val="placeholder"/>
+        </w:category>
+        <w:types>
+          <w:type w:val="bbPlcHdr"/>
+        </w:types>
+        <w:behaviors>
+          <w:behavior w:val="content"/>
+        </w:behaviors>
+        <w:guid w:val="{D697877B-1A15-4285-8252-72C42DEF5EBD}"/>
+      </w:docPartPr>
+      <w:docPartBody>
+        <w:p>
+          <w:r>
+            <w:rPr>
+              <w:rStyle w:val="PlaceholderText"/>
+            </w:rPr>
+            <w:t>Click or tap here to enter text.</w:t>
+          </w:r>
+        </w:p>
+      </w:docPartBody>
+    </w:docPart>
+    <w:docPart>
+      <w:docPartPr>
+        <w:name w:val="859CA775230649159E429C021678BB95"/>
+        <w:category>
+          <w:name w:val="General"/>
+          <w:gallery w:val="placeholder"/>
+        </w:category>
+        <w:types>
+          <w:type w:val="bbPlcHdr"/>
+        </w:types>
+        <w:behaviors>
+          <w:behavior w:val="content"/>
+        </w:behaviors>
+        <w:guid w:val="{8913C60D-9293-4F37-819B-7F2E000E8BE0}"/>
+      </w:docPartPr>
+      <w:docPartBody>
+        <w:p>
+          <w:r>
+            <w:rPr>
+              <w:rStyle w:val="PlaceholderText"/>
+            </w:rPr>
+            <w:t>Click or tap here to enter text.</w:t>
+          </w:r>
+        </w:p>
+      </w:docPartBody>
+    </w:docPart>
+    <w:docPart>
+      <w:docPartPr>
+        <w:name w:val="D33A6C64E7C149A9BC6AA887CE9C3939"/>
+        <w:category>
+          <w:name w:val="General"/>
+          <w:gallery w:val="placeholder"/>
+        </w:category>
+        <w:types>
+          <w:type w:val="bbPlcHdr"/>
+        </w:types>
+        <w:behaviors>
+          <w:behavior w:val="content"/>
+        </w:behaviors>
+        <w:guid w:val="{43C2BAD5-FAB6-46D0-A07B-5DC34BA97082}"/>
+      </w:docPartPr>
+      <w:docPartBody>
+        <w:p>
+          <w:r>
+            <w:rPr>
+              <w:rStyle w:val="PlaceholderText"/>
+            </w:rPr>
+            <w:t>Click or tap here to enter text.</w:t>
+          </w:r>
+        </w:p>
+      </w:docPartBody>
+    </w:docPart>
+    <w:docPart>
+      <w:docPartPr>
+        <w:name w:val="46EA34C2CA924890B58AFA4B05A3CA82"/>
+        <w:category>
+          <w:name w:val="General"/>
+          <w:gallery w:val="placeholder"/>
+        </w:category>
+        <w:types>
+          <w:type w:val="bbPlcHdr"/>
+        </w:types>
+        <w:behaviors>
+          <w:behavior w:val="content"/>
+        </w:behaviors>
+        <w:guid w:val="{C55400D4-51F6-4974-B7BC-5B6D9440A448}"/>
+      </w:docPartPr>
+      <w:docPartBody>
+        <w:p>
           <w:r>
             <w:rPr>
               <w:rStyle w:val="PlaceholderText"/>

</xml_diff>